<commit_message>
Update to new template with {{picture}}, {{LRN}}, continuous name, image insertion
</commit_message>
<xml_diff>
--- a/templates/id-template.docx
+++ b/templates/id-template.docx
@@ -3,6 +3,262 @@
 <w:document xmlns:wpc="http://schemas.microsoft.com/office/word/2010/wordprocessingCanvas" xmlns:cx="http://schemas.microsoft.com/office/drawing/2014/chartex" xmlns:cx1="http://schemas.microsoft.com/office/drawing/2015/9/8/chartex" xmlns:cx2="http://schemas.microsoft.com/office/drawing/2015/10/21/chartex" xmlns:cx3="http://schemas.microsoft.com/office/drawing/2016/5/9/chartex" xmlns:cx4="http://schemas.microsoft.com/office/drawing/2016/5/10/chartex" xmlns:cx5="http://schemas.microsoft.com/office/drawing/2016/5/11/chartex" xmlns:cx6="http://schemas.microsoft.com/office/drawing/2016/5/12/chartex" xmlns:cx7="http://schemas.microsoft.com/office/drawing/2016/5/13/chartex" xmlns:cx8="http://schemas.microsoft.com/office/drawing/2016/5/14/chartex" xmlns:mc="http://schemas.openxmlformats.org/markup-compatibility/2006" xmlns:aink="http://schemas.microsoft.com/office/drawing/2016/ink" xmlns:am3d="http://schemas.microsoft.com/office/drawing/2017/model3d" xmlns:o="urn:schemas-microsoft-com:office:office" xmlns:r="http://schemas.openxmlformats.org/officeDocument/2006/relationships" xmlns:m="http://schemas.openxmlformats.org/officeDocument/2006/math" xmlns:v="urn:schemas-microsoft-com:vml" xmlns:wp14="http://schemas.microsoft.com/office/word/2010/wordprocessingDrawing" xmlns:wp="http://schemas.openxmlformats.org/drawingml/2006/wordprocessingDrawing" xmlns:w10="urn:schemas-microsoft-com:office:word" xmlns:w="http://schemas.openxmlformats.org/wordprocessingml/2006/main" xmlns:w14="http://schemas.microsoft.com/office/word/2010/wordml" xmlns:w15="http://schemas.microsoft.com/office/word/2012/wordml" xmlns:w16cex="http://schemas.microsoft.com/office/word/2018/wordml/cex" xmlns:w16cid="http://schemas.microsoft.com/office/word/2016/wordml/cid" xmlns:w16="http://schemas.microsoft.com/office/word/2018/wordml" xmlns:w16sdtdh="http://schemas.microsoft.com/office/word/2020/wordml/sdtdatahash" xmlns:w16se="http://schemas.microsoft.com/office/word/2015/wordml/symex" xmlns:wpg="http://schemas.microsoft.com/office/word/2010/wordprocessingGroup" xmlns:wpi="http://schemas.microsoft.com/office/word/2010/wordprocessingInk" xmlns:wne="http://schemas.microsoft.com/office/word/2006/wordml" xmlns:wps="http://schemas.microsoft.com/office/word/2010/wordprocessingShape" mc:Ignorable="w14 w15 w16se w16cid w16 w16cex w16sdtdh wp14">
   <w:body>
     <w:p>
+      <w:r>
+        <w:rPr>
+          <w:noProof/>
+        </w:rPr>
+        <mc:AlternateContent>
+          <mc:Choice Requires="wps">
+            <w:drawing>
+              <wp:anchor distT="45720" distB="45720" distL="114300" distR="114300" simplePos="0" relativeHeight="251681792" behindDoc="0" locked="0" layoutInCell="1" allowOverlap="1" wp14:anchorId="65801304" wp14:editId="2A100601">
+                <wp:simplePos x="0" y="0"/>
+                <wp:positionH relativeFrom="column">
+                  <wp:posOffset>-139700</wp:posOffset>
+                </wp:positionH>
+                <wp:positionV relativeFrom="paragraph">
+                  <wp:posOffset>986155</wp:posOffset>
+                </wp:positionV>
+                <wp:extent cx="1193800" cy="295275"/>
+                <wp:effectExtent l="0" t="0" r="0" b="0"/>
+                <wp:wrapSquare wrapText="bothSides"/>
+                <wp:docPr id="12" name="Text Box 2"/>
+                <wp:cNvGraphicFramePr>
+                  <a:graphicFrameLocks xmlns:a="http://schemas.openxmlformats.org/drawingml/2006/main"/>
+                </wp:cNvGraphicFramePr>
+                <a:graphic xmlns:a="http://schemas.openxmlformats.org/drawingml/2006/main">
+                  <a:graphicData uri="http://schemas.microsoft.com/office/word/2010/wordprocessingShape">
+                    <wps:wsp>
+                      <wps:cNvSpPr txBox="1">
+                        <a:spLocks noChangeArrowheads="1"/>
+                      </wps:cNvSpPr>
+                      <wps:spPr bwMode="auto">
+                        <a:xfrm>
+                          <a:off x="0" y="0"/>
+                          <a:ext cx="1193800" cy="295275"/>
+                        </a:xfrm>
+                        <a:prstGeom prst="rect">
+                          <a:avLst/>
+                        </a:prstGeom>
+                        <a:noFill/>
+                        <a:ln w="9525">
+                          <a:noFill/>
+                          <a:miter lim="800000"/>
+                          <a:headEnd/>
+                          <a:tailEnd/>
+                        </a:ln>
+                      </wps:spPr>
+                      <wps:txbx>
+                        <w:txbxContent>
+                          <w:p>
+                            <w:pPr>
+                              <w:rPr>
+                                <w:rFonts w:ascii="Copperplate Gothic Bold" w:hAnsi="Copperplate Gothic Bold"/>
+                                <w:spacing w:val="-4"/>
+                                <w:sz w:val="28"/>
+                                <w:szCs w:val="28"/>
+                              </w:rPr>
+                            </w:pPr>
+                            <w:r>
+                              <w:rPr>
+                                <w:rFonts w:ascii="Copperplate Gothic Bold" w:hAnsi="Copperplate Gothic Bold"/>
+                                <w:spacing w:val="-4"/>
+                                <w:sz w:val="28"/>
+                                <w:szCs w:val="28"/>
+                              </w:rPr>
+                              <w:t>{{</w:t>
+                            </w:r>
+                            <w:r>
+                              <w:rPr>
+                                <w:rFonts w:ascii="Copperplate Gothic Bold" w:hAnsi="Copperplate Gothic Bold"/>
+                                <w:spacing w:val="-4"/>
+                                <w:sz w:val="28"/>
+                                <w:szCs w:val="28"/>
+                              </w:rPr>
+                              <w:t>picture}}</w:t>
+                            </w:r>
+                          </w:p>
+                        </w:txbxContent>
+                      </wps:txbx>
+                      <wps:bodyPr rot="0" vert="horz" wrap="square" lIns="91440" tIns="45720" rIns="91440" bIns="45720" anchor="t" anchorCtr="0">
+                        <a:noAutofit/>
+                      </wps:bodyPr>
+                    </wps:wsp>
+                  </a:graphicData>
+                </a:graphic>
+                <wp14:sizeRelH relativeFrom="margin">
+                  <wp14:pctWidth>0</wp14:pctWidth>
+                </wp14:sizeRelH>
+                <wp14:sizeRelV relativeFrom="margin">
+                  <wp14:pctHeight>0</wp14:pctHeight>
+                </wp14:sizeRelV>
+              </wp:anchor>
+            </w:drawing>
+          </mc:Choice>
+          <mc:Fallback>
+            <w:pict>
+              <v:shapetype w14:anchorId="65801304" id="_x0000_t202" coordsize="21600,21600" o:spt="202" path="m,l,21600r21600,l21600,xe">
+                <v:stroke joinstyle="miter"/>
+                <v:path gradientshapeok="t" o:connecttype="rect"/>
+              </v:shapetype>
+              <v:shape id="Text Box 2" o:spid="_x0000_s1026" type="#_x0000_t202" style="position:absolute;margin-left:-11pt;margin-top:77.65pt;width:94pt;height:23.25pt;z-index:251681792;visibility:visible;mso-wrap-style:square;mso-width-percent:0;mso-height-percent:0;mso-wrap-distance-left:9pt;mso-wrap-distance-top:3.6pt;mso-wrap-distance-right:9pt;mso-wrap-distance-bottom:3.6pt;mso-position-horizontal:absolute;mso-position-horizontal-relative:text;mso-position-vertical:absolute;mso-position-vertical-relative:text;mso-width-percent:0;mso-height-percent:0;mso-width-relative:margin;mso-height-relative:margin;v-text-anchor:top" o:gfxdata="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" filled="f" stroked="f">
+                <v:textbox>
+                  <w:txbxContent>
+                    <w:p>
+                      <w:pPr>
+                        <w:rPr>
+                          <w:rFonts w:ascii="Copperplate Gothic Bold" w:hAnsi="Copperplate Gothic Bold"/>
+                          <w:spacing w:val="-4"/>
+                          <w:sz w:val="28"/>
+                          <w:szCs w:val="28"/>
+                        </w:rPr>
+                      </w:pPr>
+                      <w:r>
+                        <w:rPr>
+                          <w:rFonts w:ascii="Copperplate Gothic Bold" w:hAnsi="Copperplate Gothic Bold"/>
+                          <w:spacing w:val="-4"/>
+                          <w:sz w:val="28"/>
+                          <w:szCs w:val="28"/>
+                        </w:rPr>
+                        <w:t>{{</w:t>
+                      </w:r>
+                      <w:r>
+                        <w:rPr>
+                          <w:rFonts w:ascii="Copperplate Gothic Bold" w:hAnsi="Copperplate Gothic Bold"/>
+                          <w:spacing w:val="-4"/>
+                          <w:sz w:val="28"/>
+                          <w:szCs w:val="28"/>
+                        </w:rPr>
+                        <w:t>picture}}</w:t>
+                      </w:r>
+                    </w:p>
+                  </w:txbxContent>
+                </v:textbox>
+                <w10:wrap type="square"/>
+              </v:shape>
+            </w:pict>
+          </mc:Fallback>
+        </mc:AlternateContent>
+      </w:r>
+      <w:r>
+        <w:rPr>
+          <w:noProof/>
+        </w:rPr>
+        <mc:AlternateContent>
+          <mc:Choice Requires="wps">
+            <w:drawing>
+              <wp:anchor distT="45720" distB="45720" distL="114300" distR="114300" simplePos="0" relativeHeight="251665408" behindDoc="0" locked="0" layoutInCell="1" allowOverlap="1" wp14:anchorId="110DF417" wp14:editId="5EFAF4C3">
+                <wp:simplePos x="0" y="0"/>
+                <wp:positionH relativeFrom="column">
+                  <wp:posOffset>5086350</wp:posOffset>
+                </wp:positionH>
+                <wp:positionV relativeFrom="paragraph">
+                  <wp:posOffset>294005</wp:posOffset>
+                </wp:positionV>
+                <wp:extent cx="4068445" cy="228600"/>
+                <wp:effectExtent l="0" t="0" r="0" b="0"/>
+                <wp:wrapSquare wrapText="bothSides"/>
+                <wp:docPr id="6" name="Text Box 2"/>
+                <wp:cNvGraphicFramePr>
+                  <a:graphicFrameLocks xmlns:a="http://schemas.openxmlformats.org/drawingml/2006/main"/>
+                </wp:cNvGraphicFramePr>
+                <a:graphic xmlns:a="http://schemas.openxmlformats.org/drawingml/2006/main">
+                  <a:graphicData uri="http://schemas.microsoft.com/office/word/2010/wordprocessingShape">
+                    <wps:wsp>
+                      <wps:cNvSpPr txBox="1">
+                        <a:spLocks noChangeArrowheads="1"/>
+                      </wps:cNvSpPr>
+                      <wps:spPr bwMode="auto">
+                        <a:xfrm>
+                          <a:off x="0" y="0"/>
+                          <a:ext cx="4068445" cy="228600"/>
+                        </a:xfrm>
+                        <a:prstGeom prst="rect">
+                          <a:avLst/>
+                        </a:prstGeom>
+                        <a:noFill/>
+                        <a:ln w="9525">
+                          <a:noFill/>
+                          <a:miter lim="800000"/>
+                          <a:headEnd/>
+                          <a:tailEnd/>
+                        </a:ln>
+                      </wps:spPr>
+                      <wps:txbx>
+                        <w:txbxContent>
+                          <w:p>
+                            <w:pPr>
+                              <w:jc w:val="center"/>
+                              <w:rPr>
+                                <w:b/>
+                                <w:bCs/>
+                                <w:spacing w:val="20"/>
+                                <w:sz w:val="18"/>
+                                <w:szCs w:val="18"/>
+                              </w:rPr>
+                            </w:pPr>
+                            <w:r>
+                              <w:rPr>
+                                <w:b/>
+                                <w:bCs/>
+                                <w:spacing w:val="20"/>
+                                <w:sz w:val="18"/>
+                                <w:szCs w:val="18"/>
+                              </w:rPr>
+                              <w:t>{{FIRSTNAME}}  {{MIDDLENAME}}  {{LASTNAME}}</w:t>
+                            </w:r>
+                          </w:p>
+                        </w:txbxContent>
+                      </wps:txbx>
+                      <wps:bodyPr rot="0" vert="horz" wrap="square" lIns="91440" tIns="45720" rIns="91440" bIns="45720" anchor="t" anchorCtr="0">
+                        <a:noAutofit/>
+                      </wps:bodyPr>
+                    </wps:wsp>
+                  </a:graphicData>
+                </a:graphic>
+                <wp14:sizeRelH relativeFrom="margin">
+                  <wp14:pctWidth>0</wp14:pctWidth>
+                </wp14:sizeRelH>
+                <wp14:sizeRelV relativeFrom="margin">
+                  <wp14:pctHeight>0</wp14:pctHeight>
+                </wp14:sizeRelV>
+              </wp:anchor>
+            </w:drawing>
+          </mc:Choice>
+          <mc:Fallback>
+            <w:pict>
+              <v:shape w14:anchorId="110DF417" id="_x0000_s1027" type="#_x0000_t202" style="position:absolute;margin-left:400.5pt;margin-top:23.15pt;width:320.35pt;height:18pt;z-index:251665408;visibility:visible;mso-wrap-style:square;mso-width-percent:0;mso-height-percent:0;mso-wrap-distance-left:9pt;mso-wrap-distance-top:3.6pt;mso-wrap-distance-right:9pt;mso-wrap-distance-bottom:3.6pt;mso-position-horizontal:absolute;mso-position-horizontal-relative:text;mso-position-vertical:absolute;mso-position-vertical-relative:text;mso-width-percent:0;mso-height-percent:0;mso-width-relative:margin;mso-height-relative:margin;v-text-anchor:top" o:gfxdata="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" filled="f" stroked="f">
+                <v:textbox>
+                  <w:txbxContent>
+                    <w:p>
+                      <w:pPr>
+                        <w:jc w:val="center"/>
+                        <w:rPr>
+                          <w:b/>
+                          <w:bCs/>
+                          <w:spacing w:val="20"/>
+                          <w:sz w:val="18"/>
+                          <w:szCs w:val="18"/>
+                        </w:rPr>
+                      </w:pPr>
+                      <w:r>
+                        <w:rPr>
+                          <w:b/>
+                          <w:bCs/>
+                          <w:spacing w:val="20"/>
+                          <w:sz w:val="18"/>
+                          <w:szCs w:val="18"/>
+                        </w:rPr>
+                        <w:t>{{FIRSTNAME}}  {{MIDDLENAME}}  {{LASTNAME}}</w:t>
+                      </w:r>
+                    </w:p>
+                  </w:txbxContent>
+                </v:textbox>
+                <w10:wrap type="square"/>
+              </v:shape>
+            </w:pict>
+          </mc:Fallback>
+        </mc:AlternateContent>
+      </w:r>
       <w:r>
         <w:rPr>
           <w:noProof/>
@@ -64,33 +320,7 @@
                                 <w:sz w:val="18"/>
                                 <w:szCs w:val="18"/>
                               </w:rPr>
-                              <w:t xml:space="preserve">Contact </w:t>
-                            </w:r>
-                            <w:proofErr w:type="gramStart"/>
-                            <w:r>
-                              <w:rPr>
-                                <w:spacing w:val="-4"/>
-                                <w:sz w:val="18"/>
-                                <w:szCs w:val="18"/>
-                              </w:rPr>
-                              <w:t>No. :</w:t>
-                            </w:r>
-                            <w:proofErr w:type="gramEnd"/>
-                            <w:r>
-                              <w:rPr>
-                                <w:spacing w:val="-4"/>
-                                <w:sz w:val="18"/>
-                                <w:szCs w:val="18"/>
-                              </w:rPr>
-                              <w:t xml:space="preserve"> </w:t>
-                            </w:r>
-                            <w:r>
-                              <w:rPr>
-                                <w:spacing w:val="-4"/>
-                                <w:sz w:val="18"/>
-                                <w:szCs w:val="18"/>
-                              </w:rPr>
-                              <w:t>{{CONTACT}}</w:t>
+                              <w:t>Contact No. : {{CONTACT}}</w:t>
                             </w:r>
                           </w:p>
                         </w:txbxContent>
@@ -112,11 +342,7 @@
           </mc:Choice>
           <mc:Fallback>
             <w:pict>
-              <v:shapetype w14:anchorId="5DDDD3EE" id="_x0000_t202" coordsize="21600,21600" o:spt="202" path="m,l,21600r21600,l21600,xe">
-                <v:stroke joinstyle="miter"/>
-                <v:path gradientshapeok="t" o:connecttype="rect"/>
-              </v:shapetype>
-              <v:shape id="Text Box 2" o:spid="_x0000_s1026" type="#_x0000_t202" style="position:absolute;margin-left:398.5pt;margin-top:133.65pt;width:320.35pt;height:12pt;z-index:251675648;visibility:visible;mso-wrap-style:square;mso-width-percent:0;mso-height-percent:0;mso-wrap-distance-left:9pt;mso-wrap-distance-top:3.6pt;mso-wrap-distance-right:9pt;mso-wrap-distance-bottom:3.6pt;mso-position-horizontal:absolute;mso-position-horizontal-relative:text;mso-position-vertical:absolute;mso-position-vertical-relative:text;mso-width-percent:0;mso-height-percent:0;mso-width-relative:margin;mso-height-relative:margin;v-text-anchor:top" o:gfxdata="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" filled="f" stroked="f">
+              <v:shape w14:anchorId="5DDDD3EE" id="_x0000_s1028" type="#_x0000_t202" style="position:absolute;margin-left:398.5pt;margin-top:133.65pt;width:320.35pt;height:12pt;z-index:251675648;visibility:visible;mso-wrap-style:square;mso-width-percent:0;mso-height-percent:0;mso-wrap-distance-left:9pt;mso-wrap-distance-top:3.6pt;mso-wrap-distance-right:9pt;mso-wrap-distance-bottom:3.6pt;mso-position-horizontal:absolute;mso-position-horizontal-relative:text;mso-position-vertical:absolute;mso-position-vertical-relative:text;mso-width-percent:0;mso-height-percent:0;mso-width-relative:margin;mso-height-relative:margin;v-text-anchor:top" o:gfxdata="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" filled="f" stroked="f">
                 <v:textbox inset="0,0,0,0">
                   <w:txbxContent>
                     <w:p>
@@ -134,33 +360,7 @@
                           <w:sz w:val="18"/>
                           <w:szCs w:val="18"/>
                         </w:rPr>
-                        <w:t xml:space="preserve">Contact </w:t>
-                      </w:r>
-                      <w:proofErr w:type="gramStart"/>
-                      <w:r>
-                        <w:rPr>
-                          <w:spacing w:val="-4"/>
-                          <w:sz w:val="18"/>
-                          <w:szCs w:val="18"/>
-                        </w:rPr>
-                        <w:t>No. :</w:t>
-                      </w:r>
-                      <w:proofErr w:type="gramEnd"/>
-                      <w:r>
-                        <w:rPr>
-                          <w:spacing w:val="-4"/>
-                          <w:sz w:val="18"/>
-                          <w:szCs w:val="18"/>
-                        </w:rPr>
-                        <w:t xml:space="preserve"> </w:t>
-                      </w:r>
-                      <w:r>
-                        <w:rPr>
-                          <w:spacing w:val="-4"/>
-                          <w:sz w:val="18"/>
-                          <w:szCs w:val="18"/>
-                        </w:rPr>
-                        <w:t>{{CONTACT}}</w:t>
+                        <w:t>Contact No. : {{CONTACT}}</w:t>
                       </w:r>
                     </w:p>
                   </w:txbxContent>
@@ -261,7 +461,7 @@
                                 <wp:inline distT="0" distB="0" distL="0" distR="0" wp14:anchorId="3EEF1DD2" wp14:editId="0616ACFE">
                                   <wp:extent cx="3648710" cy="86360"/>
                                   <wp:effectExtent l="0" t="0" r="0" b="8890"/>
-                                  <wp:docPr id="10" name="Picture 10"/>
+                                  <wp:docPr id="3" name="Picture 3"/>
                                   <wp:cNvGraphicFramePr>
                                     <a:graphicFrameLocks xmlns:a="http://schemas.openxmlformats.org/drawingml/2006/main" noChangeAspect="1"/>
                                   </wp:cNvGraphicFramePr>
@@ -334,7 +534,7 @@
           </mc:Choice>
           <mc:Fallback>
             <w:pict>
-              <v:shape w14:anchorId="0C6C78B9" id="_x0000_s1027" type="#_x0000_t202" style="position:absolute;margin-left:401.3pt;margin-top:54.75pt;width:320.35pt;height:7.5pt;z-index:251671552;visibility:visible;mso-wrap-style:square;mso-width-percent:0;mso-height-percent:0;mso-wrap-distance-left:9pt;mso-wrap-distance-top:3.6pt;mso-wrap-distance-right:9pt;mso-wrap-distance-bottom:3.6pt;mso-position-horizontal:absolute;mso-position-horizontal-relative:text;mso-position-vertical:absolute;mso-position-vertical-relative:text;mso-width-percent:0;mso-height-percent:0;mso-width-relative:margin;mso-height-relative:margin;v-text-anchor:top" o:gfxdata="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" filled="f" stroked="f">
+              <v:shape w14:anchorId="0C6C78B9" id="_x0000_s1029" type="#_x0000_t202" style="position:absolute;margin-left:401.3pt;margin-top:54.75pt;width:320.35pt;height:7.5pt;z-index:251671552;visibility:visible;mso-wrap-style:square;mso-width-percent:0;mso-height-percent:0;mso-wrap-distance-left:9pt;mso-wrap-distance-top:3.6pt;mso-wrap-distance-right:9pt;mso-wrap-distance-bottom:3.6pt;mso-position-horizontal:absolute;mso-position-horizontal-relative:text;mso-position-vertical:absolute;mso-position-vertical-relative:text;mso-width-percent:0;mso-height-percent:0;mso-width-relative:margin;mso-height-relative:margin;v-text-anchor:top" o:gfxdata="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" filled="f" stroked="f">
                 <v:textbox inset="0,0,0,0">
                   <w:txbxContent>
                     <w:p>
@@ -381,7 +581,7 @@
                           <wp:inline distT="0" distB="0" distL="0" distR="0" wp14:anchorId="3EEF1DD2" wp14:editId="0616ACFE">
                             <wp:extent cx="3648710" cy="86360"/>
                             <wp:effectExtent l="0" t="0" r="0" b="8890"/>
-                            <wp:docPr id="10" name="Picture 10"/>
+                            <wp:docPr id="3" name="Picture 3"/>
                             <wp:cNvGraphicFramePr>
                               <a:graphicFrameLocks xmlns:a="http://schemas.openxmlformats.org/drawingml/2006/main" noChangeAspect="1"/>
                             </wp:cNvGraphicFramePr>
@@ -550,7 +750,7 @@
           </mc:Choice>
           <mc:Fallback>
             <w:pict>
-              <v:shape w14:anchorId="2647D407" id="_x0000_s1028" type="#_x0000_t202" style="position:absolute;margin-left:400.75pt;margin-top:46.5pt;width:320.35pt;height:7.5pt;z-index:251669504;visibility:visible;mso-wrap-style:square;mso-width-percent:0;mso-height-percent:0;mso-wrap-distance-left:9pt;mso-wrap-distance-top:3.6pt;mso-wrap-distance-right:9pt;mso-wrap-distance-bottom:3.6pt;mso-position-horizontal:absolute;mso-position-horizontal-relative:text;mso-position-vertical:absolute;mso-position-vertical-relative:text;mso-width-percent:0;mso-height-percent:0;mso-width-relative:margin;mso-height-relative:margin;v-text-anchor:top" o:gfxdata="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" filled="f" stroked="f">
+              <v:shape w14:anchorId="2647D407" id="_x0000_s1030" type="#_x0000_t202" style="position:absolute;margin-left:400.75pt;margin-top:46.5pt;width:320.35pt;height:7.5pt;z-index:251669504;visibility:visible;mso-wrap-style:square;mso-width-percent:0;mso-height-percent:0;mso-wrap-distance-left:9pt;mso-wrap-distance-top:3.6pt;mso-wrap-distance-right:9pt;mso-wrap-distance-bottom:3.6pt;mso-position-horizontal:absolute;mso-position-horizontal-relative:text;mso-position-vertical:absolute;mso-position-vertical-relative:text;mso-width-percent:0;mso-height-percent:0;mso-width-relative:margin;mso-height-relative:margin;v-text-anchor:top" o:gfxdata="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" filled="f" stroked="f">
                 <v:textbox inset="0,0,0,0">
                   <w:txbxContent>
                     <w:p>
@@ -694,7 +894,7 @@
           </mc:Choice>
           <mc:Fallback>
             <w:pict>
-              <v:shape w14:anchorId="52D9BCB2" id="_x0000_s1029" type="#_x0000_t202" style="position:absolute;margin-left:400.35pt;margin-top:39.3pt;width:320.35pt;height:7.5pt;z-index:251667456;visibility:visible;mso-wrap-style:square;mso-width-percent:0;mso-height-percent:0;mso-wrap-distance-left:9pt;mso-wrap-distance-top:3.6pt;mso-wrap-distance-right:9pt;mso-wrap-distance-bottom:3.6pt;mso-position-horizontal:absolute;mso-position-horizontal-relative:text;mso-position-vertical:absolute;mso-position-vertical-relative:text;mso-width-percent:0;mso-height-percent:0;mso-width-relative:margin;mso-height-relative:margin;v-text-anchor:top" o:gfxdata="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" filled="f" stroked="f">
+              <v:shape w14:anchorId="52D9BCB2" id="_x0000_s1031" type="#_x0000_t202" style="position:absolute;margin-left:400.35pt;margin-top:39.3pt;width:320.35pt;height:7.5pt;z-index:251667456;visibility:visible;mso-wrap-style:square;mso-width-percent:0;mso-height-percent:0;mso-wrap-distance-left:9pt;mso-wrap-distance-top:3.6pt;mso-wrap-distance-right:9pt;mso-wrap-distance-bottom:3.6pt;mso-position-horizontal:absolute;mso-position-horizontal-relative:text;mso-position-vertical:absolute;mso-position-vertical-relative:text;mso-width-percent:0;mso-height-percent:0;mso-width-relative:margin;mso-height-relative:margin;v-text-anchor:top" o:gfxdata="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" filled="f" stroked="f">
                 <v:textbox inset="0,0,0,0">
                   <w:txbxContent>
                     <w:p>
@@ -738,7 +938,7 @@
         <mc:AlternateContent>
           <mc:Choice Requires="wps">
             <w:drawing>
-              <wp:anchor distT="45720" distB="45720" distL="114300" distR="114300" simplePos="0" relativeHeight="251673600" behindDoc="0" locked="0" layoutInCell="1" allowOverlap="1" wp14:anchorId="5203266C" wp14:editId="7BD11129">
+              <wp:anchor distT="45720" distB="45720" distL="114300" distR="114300" simplePos="0" relativeHeight="251673600" behindDoc="0" locked="0" layoutInCell="1" allowOverlap="1" wp14:anchorId="5203266C" wp14:editId="082C486B">
                 <wp:simplePos x="0" y="0"/>
                 <wp:positionH relativeFrom="column">
                   <wp:posOffset>5059045</wp:posOffset>
@@ -783,7 +983,7 @@
                               <w:rPr>
                                 <w:b/>
                                 <w:bCs/>
-                                <w:spacing w:val="-4"/>
+                                <w:spacing w:val="20"/>
                                 <w:sz w:val="22"/>
                                 <w:szCs w:val="22"/>
                               </w:rPr>
@@ -792,7 +992,7 @@
                               <w:rPr>
                                 <w:b/>
                                 <w:bCs/>
-                                <w:spacing w:val="-4"/>
+                                <w:spacing w:val="20"/>
                                 <w:sz w:val="22"/>
                                 <w:szCs w:val="22"/>
                               </w:rPr>
@@ -818,7 +1018,7 @@
           </mc:Choice>
           <mc:Fallback>
             <w:pict>
-              <v:shape w14:anchorId="5203266C" id="_x0000_s1030" type="#_x0000_t202" style="position:absolute;margin-left:398.35pt;margin-top:119.15pt;width:320.35pt;height:14.7pt;z-index:251673600;visibility:visible;mso-wrap-style:square;mso-width-percent:0;mso-height-percent:0;mso-wrap-distance-left:9pt;mso-wrap-distance-top:3.6pt;mso-wrap-distance-right:9pt;mso-wrap-distance-bottom:3.6pt;mso-position-horizontal:absolute;mso-position-horizontal-relative:text;mso-position-vertical:absolute;mso-position-vertical-relative:text;mso-width-percent:0;mso-height-percent:0;mso-width-relative:margin;mso-height-relative:margin;v-text-anchor:top" o:gfxdata="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" filled="f" stroked="f">
+              <v:shape w14:anchorId="5203266C" id="_x0000_s1032" type="#_x0000_t202" style="position:absolute;margin-left:398.35pt;margin-top:119.15pt;width:320.35pt;height:14.7pt;z-index:251673600;visibility:visible;mso-wrap-style:square;mso-width-percent:0;mso-height-percent:0;mso-wrap-distance-left:9pt;mso-wrap-distance-top:3.6pt;mso-wrap-distance-right:9pt;mso-wrap-distance-bottom:3.6pt;mso-position-horizontal:absolute;mso-position-horizontal-relative:text;mso-position-vertical:absolute;mso-position-vertical-relative:text;mso-width-percent:0;mso-height-percent:0;mso-width-relative:margin;mso-height-relative:margin;v-text-anchor:top" o:gfxdata="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" filled="f" stroked="f">
                 <v:textbox inset="0,0,0,0">
                   <w:txbxContent>
                     <w:p>
@@ -827,7 +1027,7 @@
                         <w:rPr>
                           <w:b/>
                           <w:bCs/>
-                          <w:spacing w:val="-4"/>
+                          <w:spacing w:val="20"/>
                           <w:sz w:val="22"/>
                           <w:szCs w:val="22"/>
                         </w:rPr>
@@ -836,195 +1036,11 @@
                         <w:rPr>
                           <w:b/>
                           <w:bCs/>
-                          <w:spacing w:val="-4"/>
+                          <w:spacing w:val="20"/>
                           <w:sz w:val="22"/>
                           <w:szCs w:val="22"/>
                         </w:rPr>
                         <w:t>{{GUARDIAN}}</w:t>
-                      </w:r>
-                    </w:p>
-                  </w:txbxContent>
-                </v:textbox>
-                <w10:wrap type="square"/>
-              </v:shape>
-            </w:pict>
-          </mc:Fallback>
-        </mc:AlternateContent>
-      </w:r>
-      <w:r>
-        <w:rPr>
-          <w:noProof/>
-        </w:rPr>
-        <mc:AlternateContent>
-          <mc:Choice Requires="wps">
-            <w:drawing>
-              <wp:anchor distT="45720" distB="45720" distL="114300" distR="114300" simplePos="0" relativeHeight="251665408" behindDoc="0" locked="0" layoutInCell="1" allowOverlap="1" wp14:anchorId="110DF417" wp14:editId="4F6F312F">
-                <wp:simplePos x="0" y="0"/>
-                <wp:positionH relativeFrom="column">
-                  <wp:posOffset>5086350</wp:posOffset>
-                </wp:positionH>
-                <wp:positionV relativeFrom="paragraph">
-                  <wp:posOffset>294005</wp:posOffset>
-                </wp:positionV>
-                <wp:extent cx="4068445" cy="215900"/>
-                <wp:effectExtent l="0" t="0" r="0" b="0"/>
-                <wp:wrapSquare wrapText="bothSides"/>
-                <wp:docPr id="6" name="Text Box 2"/>
-                <wp:cNvGraphicFramePr>
-                  <a:graphicFrameLocks xmlns:a="http://schemas.openxmlformats.org/drawingml/2006/main"/>
-                </wp:cNvGraphicFramePr>
-                <a:graphic xmlns:a="http://schemas.openxmlformats.org/drawingml/2006/main">
-                  <a:graphicData uri="http://schemas.microsoft.com/office/word/2010/wordprocessingShape">
-                    <wps:wsp>
-                      <wps:cNvSpPr txBox="1">
-                        <a:spLocks noChangeArrowheads="1"/>
-                      </wps:cNvSpPr>
-                      <wps:spPr bwMode="auto">
-                        <a:xfrm>
-                          <a:off x="0" y="0"/>
-                          <a:ext cx="4068445" cy="215900"/>
-                        </a:xfrm>
-                        <a:prstGeom prst="rect">
-                          <a:avLst/>
-                        </a:prstGeom>
-                        <a:noFill/>
-                        <a:ln w="9525">
-                          <a:noFill/>
-                          <a:miter lim="800000"/>
-                          <a:headEnd/>
-                          <a:tailEnd/>
-                        </a:ln>
-                      </wps:spPr>
-                      <wps:txbx>
-                        <w:txbxContent>
-                          <w:p>
-                            <w:pPr>
-                              <w:jc w:val="center"/>
-                              <w:rPr>
-                                <w:b/>
-                                <w:bCs/>
-                                <w:spacing w:val="-4"/>
-                                <w:sz w:val="18"/>
-                                <w:szCs w:val="18"/>
-                              </w:rPr>
-                            </w:pPr>
-                            <w:r>
-                              <w:rPr>
-                                <w:b/>
-                                <w:bCs/>
-                                <w:spacing w:val="-4"/>
-                                <w:sz w:val="18"/>
-                                <w:szCs w:val="18"/>
-                              </w:rPr>
-                              <w:t>{{FIRSTNAME</w:t>
-                            </w:r>
-                            <w:proofErr w:type="gramStart"/>
-                            <w:r>
-                              <w:rPr>
-                                <w:b/>
-                                <w:bCs/>
-                                <w:spacing w:val="-4"/>
-                                <w:sz w:val="18"/>
-                                <w:szCs w:val="18"/>
-                              </w:rPr>
-                              <w:t>}}  {</w:t>
-                            </w:r>
-                            <w:proofErr w:type="gramEnd"/>
-                            <w:r>
-                              <w:rPr>
-                                <w:b/>
-                                <w:bCs/>
-                                <w:spacing w:val="-4"/>
-                                <w:sz w:val="18"/>
-                                <w:szCs w:val="18"/>
-                              </w:rPr>
-                              <w:t xml:space="preserve">{MIDDLENAME}}  </w:t>
-                            </w:r>
-                            <w:r>
-                              <w:rPr>
-                                <w:b/>
-                                <w:bCs/>
-                                <w:spacing w:val="-4"/>
-                                <w:sz w:val="18"/>
-                                <w:szCs w:val="18"/>
-                              </w:rPr>
-                              <w:t>{{LASTNAME}}</w:t>
-                            </w:r>
-                          </w:p>
-                        </w:txbxContent>
-                      </wps:txbx>
-                      <wps:bodyPr rot="0" vert="horz" wrap="square" lIns="91440" tIns="45720" rIns="91440" bIns="45720" anchor="t" anchorCtr="0">
-                        <a:noAutofit/>
-                      </wps:bodyPr>
-                    </wps:wsp>
-                  </a:graphicData>
-                </a:graphic>
-                <wp14:sizeRelH relativeFrom="margin">
-                  <wp14:pctWidth>0</wp14:pctWidth>
-                </wp14:sizeRelH>
-                <wp14:sizeRelV relativeFrom="margin">
-                  <wp14:pctHeight>0</wp14:pctHeight>
-                </wp14:sizeRelV>
-              </wp:anchor>
-            </w:drawing>
-          </mc:Choice>
-          <mc:Fallback>
-            <w:pict>
-              <v:shape w14:anchorId="110DF417" id="_x0000_s1031" type="#_x0000_t202" style="position:absolute;margin-left:400.5pt;margin-top:23.15pt;width:320.35pt;height:17pt;z-index:251665408;visibility:visible;mso-wrap-style:square;mso-width-percent:0;mso-height-percent:0;mso-wrap-distance-left:9pt;mso-wrap-distance-top:3.6pt;mso-wrap-distance-right:9pt;mso-wrap-distance-bottom:3.6pt;mso-position-horizontal:absolute;mso-position-horizontal-relative:text;mso-position-vertical:absolute;mso-position-vertical-relative:text;mso-width-percent:0;mso-height-percent:0;mso-width-relative:margin;mso-height-relative:margin;v-text-anchor:top" o:gfxdata="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" filled="f" stroked="f">
-                <v:textbox>
-                  <w:txbxContent>
-                    <w:p>
-                      <w:pPr>
-                        <w:jc w:val="center"/>
-                        <w:rPr>
-                          <w:b/>
-                          <w:bCs/>
-                          <w:spacing w:val="-4"/>
-                          <w:sz w:val="18"/>
-                          <w:szCs w:val="18"/>
-                        </w:rPr>
-                      </w:pPr>
-                      <w:r>
-                        <w:rPr>
-                          <w:b/>
-                          <w:bCs/>
-                          <w:spacing w:val="-4"/>
-                          <w:sz w:val="18"/>
-                          <w:szCs w:val="18"/>
-                        </w:rPr>
-                        <w:t>{{FIRSTNAME</w:t>
-                      </w:r>
-                      <w:proofErr w:type="gramStart"/>
-                      <w:r>
-                        <w:rPr>
-                          <w:b/>
-                          <w:bCs/>
-                          <w:spacing w:val="-4"/>
-                          <w:sz w:val="18"/>
-                          <w:szCs w:val="18"/>
-                        </w:rPr>
-                        <w:t>}}  {</w:t>
-                      </w:r>
-                      <w:proofErr w:type="gramEnd"/>
-                      <w:r>
-                        <w:rPr>
-                          <w:b/>
-                          <w:bCs/>
-                          <w:spacing w:val="-4"/>
-                          <w:sz w:val="18"/>
-                          <w:szCs w:val="18"/>
-                        </w:rPr>
-                        <w:t xml:space="preserve">{MIDDLENAME}}  </w:t>
-                      </w:r>
-                      <w:r>
-                        <w:rPr>
-                          <w:b/>
-                          <w:bCs/>
-                          <w:spacing w:val="-4"/>
-                          <w:sz w:val="18"/>
-                          <w:szCs w:val="18"/>
-                        </w:rPr>
-                        <w:t>{{LASTNAME}}</w:t>
                       </w:r>
                     </w:p>
                   </w:txbxContent>
@@ -1097,7 +1113,7 @@
                                 <w:sz w:val="28"/>
                                 <w:szCs w:val="28"/>
                               </w:rPr>
-                              <w:t>LRN</w:t>
+                              <w:t>LRN:</w:t>
                             </w:r>
                             <w:r>
                               <w:rPr>
@@ -1106,16 +1122,7 @@
                                 <w:sz w:val="28"/>
                                 <w:szCs w:val="28"/>
                               </w:rPr>
-                              <w:t>:</w:t>
-                            </w:r>
-                            <w:r>
-                              <w:rPr>
-                                <w:rFonts w:ascii="Consolas" w:hAnsi="Consolas"/>
-                                <w:spacing w:val="56"/>
-                                <w:sz w:val="28"/>
-                                <w:szCs w:val="28"/>
-                              </w:rPr>
-                              <w:t>123456789012</w:t>
+                              <w:t>{{LRN}}</w:t>
                             </w:r>
                           </w:p>
                         </w:txbxContent>
@@ -1137,7 +1144,7 @@
           </mc:Choice>
           <mc:Fallback>
             <w:pict>
-              <v:shape w14:anchorId="0F622183" id="_x0000_s1032" type="#_x0000_t202" style="position:absolute;margin-left:225.4pt;margin-top:92pt;width:175.55pt;height:13.65pt;rotation:-90;z-index:251677696;visibility:visible;mso-wrap-style:square;mso-width-percent:0;mso-height-percent:0;mso-wrap-distance-left:9pt;mso-wrap-distance-top:3.6pt;mso-wrap-distance-right:9pt;mso-wrap-distance-bottom:3.6pt;mso-position-horizontal:absolute;mso-position-horizontal-relative:text;mso-position-vertical:absolute;mso-position-vertical-relative:text;mso-width-percent:0;mso-height-percent:0;mso-width-relative:margin;mso-height-relative:margin;v-text-anchor:top" o:gfxdata="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" filled="f" stroked="f">
+              <v:shape w14:anchorId="0F622183" id="_x0000_s1033" type="#_x0000_t202" style="position:absolute;margin-left:225.4pt;margin-top:92pt;width:175.55pt;height:13.65pt;rotation:-90;z-index:251677696;visibility:visible;mso-wrap-style:square;mso-width-percent:0;mso-height-percent:0;mso-wrap-distance-left:9pt;mso-wrap-distance-top:3.6pt;mso-wrap-distance-right:9pt;mso-wrap-distance-bottom:3.6pt;mso-position-horizontal:absolute;mso-position-horizontal-relative:text;mso-position-vertical:absolute;mso-position-vertical-relative:text;mso-width-percent:0;mso-height-percent:0;mso-width-relative:margin;mso-height-relative:margin;v-text-anchor:top" o:gfxdata="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" filled="f" stroked="f">
                 <v:textbox inset="0,0,0,0">
                   <w:txbxContent>
                     <w:p>
@@ -1156,7 +1163,7 @@
                           <w:sz w:val="28"/>
                           <w:szCs w:val="28"/>
                         </w:rPr>
-                        <w:t>LRN</w:t>
+                        <w:t>LRN:</w:t>
                       </w:r>
                       <w:r>
                         <w:rPr>
@@ -1165,16 +1172,7 @@
                           <w:sz w:val="28"/>
                           <w:szCs w:val="28"/>
                         </w:rPr>
-                        <w:t>:</w:t>
-                      </w:r>
-                      <w:r>
-                        <w:rPr>
-                          <w:rFonts w:ascii="Consolas" w:hAnsi="Consolas"/>
-                          <w:spacing w:val="56"/>
-                          <w:sz w:val="28"/>
-                          <w:szCs w:val="28"/>
-                        </w:rPr>
-                        <w:t>123456789012</w:t>
+                        <w:t>{{LRN}}</w:t>
                       </w:r>
                     </w:p>
                   </w:txbxContent>
@@ -1248,7 +1246,7 @@
                                 <w:sz w:val="28"/>
                                 <w:szCs w:val="28"/>
                               </w:rPr>
-                              <w:t>123456789012</w:t>
+                              <w:t>{{LRN}}</w:t>
                             </w:r>
                           </w:p>
                         </w:txbxContent>
@@ -1270,7 +1268,7 @@
           </mc:Choice>
           <mc:Fallback>
             <w:pict>
-              <v:shape w14:anchorId="298364A9" id="_x0000_s1033" type="#_x0000_t202" style="position:absolute;margin-left:632.1pt;margin-top:116.25pt;width:213.05pt;height:15.35pt;rotation:-90;z-index:251679744;visibility:visible;mso-wrap-style:square;mso-width-percent:0;mso-height-percent:0;mso-wrap-distance-left:9pt;mso-wrap-distance-top:3.6pt;mso-wrap-distance-right:9pt;mso-wrap-distance-bottom:3.6pt;mso-position-horizontal:absolute;mso-position-horizontal-relative:text;mso-position-vertical:absolute;mso-position-vertical-relative:text;mso-width-percent:0;mso-height-percent:0;mso-width-relative:margin;mso-height-relative:margin;v-text-anchor:top" o:gfxdata="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" filled="f" stroked="f">
+              <v:shape w14:anchorId="298364A9" id="_x0000_s1034" type="#_x0000_t202" style="position:absolute;margin-left:632.1pt;margin-top:116.25pt;width:213.05pt;height:15.35pt;rotation:-90;z-index:251679744;visibility:visible;mso-wrap-style:square;mso-width-percent:0;mso-height-percent:0;mso-wrap-distance-left:9pt;mso-wrap-distance-top:3.6pt;mso-wrap-distance-right:9pt;mso-wrap-distance-bottom:3.6pt;mso-position-horizontal:absolute;mso-position-horizontal-relative:text;mso-position-vertical:absolute;mso-position-vertical-relative:text;mso-width-percent:0;mso-height-percent:0;mso-width-relative:margin;mso-height-relative:margin;v-text-anchor:top" o:gfxdata="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" filled="f" stroked="f">
                 <v:textbox inset="0,0,0,0">
                   <w:txbxContent>
                     <w:p>
@@ -1290,7 +1288,7 @@
                           <w:sz w:val="28"/>
                           <w:szCs w:val="28"/>
                         </w:rPr>
-                        <w:t>123456789012</w:t>
+                        <w:t>{{LRN}}</w:t>
                       </w:r>
                     </w:p>
                   </w:txbxContent>
@@ -1363,17 +1361,7 @@
                                 <w:sz w:val="28"/>
                                 <w:szCs w:val="28"/>
                               </w:rPr>
-                              <w:t>{{FIRSTNAME</w:t>
-                            </w:r>
-                            <w:proofErr w:type="gramStart"/>
-                            <w:r>
-                              <w:rPr>
-                                <w:rFonts w:ascii="Copperplate Gothic Bold" w:hAnsi="Copperplate Gothic Bold"/>
-                                <w:spacing w:val="-4"/>
-                                <w:sz w:val="28"/>
-                                <w:szCs w:val="28"/>
-                              </w:rPr>
-                              <w:t>}}</w:t>
+                              <w:t>{{FIRSTNAME}}</w:t>
                             </w:r>
                             <w:r>
                               <w:rPr>
@@ -1391,17 +1379,7 @@
                                 <w:sz w:val="28"/>
                                 <w:szCs w:val="28"/>
                               </w:rPr>
-                              <w:t>{</w:t>
-                            </w:r>
-                            <w:proofErr w:type="gramEnd"/>
-                            <w:r>
-                              <w:rPr>
-                                <w:rFonts w:ascii="Copperplate Gothic Bold" w:hAnsi="Copperplate Gothic Bold"/>
-                                <w:spacing w:val="-4"/>
-                                <w:sz w:val="28"/>
-                                <w:szCs w:val="28"/>
-                              </w:rPr>
-                              <w:t>{</w:t>
+                              <w:t>{{</w:t>
                             </w:r>
                             <w:r>
                               <w:rPr>
@@ -1441,7 +1419,7 @@
           </mc:Choice>
           <mc:Fallback>
             <w:pict>
-              <v:shape w14:anchorId="3A561120" id="_x0000_s1034" type="#_x0000_t202" style="position:absolute;margin-left:-36pt;margin-top:187.25pt;width:204.35pt;height:23.25pt;z-index:251663360;visibility:visible;mso-wrap-style:square;mso-width-percent:0;mso-height-percent:0;mso-wrap-distance-left:9pt;mso-wrap-distance-top:3.6pt;mso-wrap-distance-right:9pt;mso-wrap-distance-bottom:3.6pt;mso-position-horizontal:absolute;mso-position-horizontal-relative:text;mso-position-vertical:absolute;mso-position-vertical-relative:text;mso-width-percent:0;mso-height-percent:0;mso-width-relative:margin;mso-height-relative:margin;v-text-anchor:top" o:gfxdata="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" filled="f" stroked="f">
+              <v:shape w14:anchorId="3A561120" id="_x0000_s1035" type="#_x0000_t202" style="position:absolute;margin-left:-36pt;margin-top:187.25pt;width:204.35pt;height:23.25pt;z-index:251663360;visibility:visible;mso-wrap-style:square;mso-width-percent:0;mso-height-percent:0;mso-wrap-distance-left:9pt;mso-wrap-distance-top:3.6pt;mso-wrap-distance-right:9pt;mso-wrap-distance-bottom:3.6pt;mso-position-horizontal:absolute;mso-position-horizontal-relative:text;mso-position-vertical:absolute;mso-position-vertical-relative:text;mso-width-percent:0;mso-height-percent:0;mso-width-relative:margin;mso-height-relative:margin;v-text-anchor:top" o:gfxdata="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" filled="f" stroked="f">
                 <v:textbox>
                   <w:txbxContent>
                     <w:p>
@@ -1460,17 +1438,7 @@
                           <w:sz w:val="28"/>
                           <w:szCs w:val="28"/>
                         </w:rPr>
-                        <w:t>{{FIRSTNAME</w:t>
-                      </w:r>
-                      <w:proofErr w:type="gramStart"/>
-                      <w:r>
-                        <w:rPr>
-                          <w:rFonts w:ascii="Copperplate Gothic Bold" w:hAnsi="Copperplate Gothic Bold"/>
-                          <w:spacing w:val="-4"/>
-                          <w:sz w:val="28"/>
-                          <w:szCs w:val="28"/>
-                        </w:rPr>
-                        <w:t>}}</w:t>
+                        <w:t>{{FIRSTNAME}}</w:t>
                       </w:r>
                       <w:r>
                         <w:rPr>
@@ -1488,17 +1456,7 @@
                           <w:sz w:val="28"/>
                           <w:szCs w:val="28"/>
                         </w:rPr>
-                        <w:t>{</w:t>
-                      </w:r>
-                      <w:proofErr w:type="gramEnd"/>
-                      <w:r>
-                        <w:rPr>
-                          <w:rFonts w:ascii="Copperplate Gothic Bold" w:hAnsi="Copperplate Gothic Bold"/>
-                          <w:spacing w:val="-4"/>
-                          <w:sz w:val="28"/>
-                          <w:szCs w:val="28"/>
-                        </w:rPr>
-                        <w:t>{</w:t>
+                        <w:t>{{</w:t>
                       </w:r>
                       <w:r>
                         <w:rPr>
@@ -1611,7 +1569,7 @@
           </mc:Choice>
           <mc:Fallback>
             <w:pict>
-              <v:shape w14:anchorId="32344B30" id="_x0000_s1035" type="#_x0000_t202" style="position:absolute;margin-left:-36.05pt;margin-top:162.15pt;width:199.7pt;height:25pt;z-index:251661312;visibility:visible;mso-wrap-style:square;mso-width-percent:0;mso-height-percent:0;mso-wrap-distance-left:9pt;mso-wrap-distance-top:3.6pt;mso-wrap-distance-right:9pt;mso-wrap-distance-bottom:3.6pt;mso-position-horizontal:absolute;mso-position-horizontal-relative:text;mso-position-vertical:absolute;mso-position-vertical-relative:text;mso-width-percent:0;mso-height-percent:0;mso-width-relative:margin;mso-height-relative:margin;v-text-anchor:top" o:gfxdata="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" filled="f" stroked="f">
+              <v:shape w14:anchorId="32344B30" id="_x0000_s1036" type="#_x0000_t202" style="position:absolute;margin-left:-36.05pt;margin-top:162.15pt;width:199.7pt;height:25pt;z-index:251661312;visibility:visible;mso-wrap-style:square;mso-width-percent:0;mso-height-percent:0;mso-wrap-distance-left:9pt;mso-wrap-distance-top:3.6pt;mso-wrap-distance-right:9pt;mso-wrap-distance-bottom:3.6pt;mso-position-horizontal:absolute;mso-position-horizontal-relative:text;mso-position-vertical:absolute;mso-position-vertical-relative:text;mso-width-percent:0;mso-height-percent:0;mso-width-relative:margin;mso-height-relative:margin;v-text-anchor:top" o:gfxdata="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" filled="f" stroked="f">
                 <v:textbox>
                   <w:txbxContent>
                     <w:p>
@@ -1773,7 +1731,7 @@
           </mc:Choice>
           <mc:Fallback>
             <w:pict>
-              <v:rect w14:anchorId="76B86367" id="Rectangle 2" o:spid="_x0000_s1026" style="position:absolute;margin-left:787.75pt;margin-top:-68.5pt;width:838.95pt;height:345.6pt;z-index:-251658241;visibility:visible;mso-wrap-style:square;mso-width-percent:0;mso-height-percent:0;mso-wrap-distance-left:9pt;mso-wrap-distance-top:0;mso-wrap-distance-right:9pt;mso-wrap-distance-bottom:0;mso-position-horizontal:right;mso-position-horizontal-relative:page;mso-position-vertical:absolute;mso-position-vertical-relative:text;mso-width-percent:0;mso-height-percent:0;mso-width-relative:margin;mso-height-relative:margin;v-text-anchor:middle" o:gfxdata="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" fillcolor="#2c441c" strokecolor="#1f3763 [1604]" strokeweight="1pt">
+              <v:rect w14:anchorId="05A3442C" id="Rectangle 2" o:spid="_x0000_s1026" style="position:absolute;margin-left:787.75pt;margin-top:-68.5pt;width:838.95pt;height:345.6pt;z-index:-251658241;visibility:visible;mso-wrap-style:square;mso-width-percent:0;mso-height-percent:0;mso-wrap-distance-left:9pt;mso-wrap-distance-top:0;mso-wrap-distance-right:9pt;mso-wrap-distance-bottom:0;mso-position-horizontal:right;mso-position-horizontal-relative:page;mso-position-vertical:absolute;mso-position-vertical-relative:text;mso-width-percent:0;mso-height-percent:0;mso-width-relative:margin;mso-height-relative:margin;v-text-anchor:middle" o:gfxdata="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" fillcolor="#2c441c" strokecolor="#1f3763 [1604]" strokeweight="1pt">
                 <w10:wrap anchorx="page"/>
               </v:rect>
             </w:pict>
@@ -2191,7 +2149,7 @@
   <w:style w:type="paragraph" w:default="1" w:styleId="Normal">
     <w:name w:val="Normal"/>
     <w:qFormat/>
-    <w:rsid w:val="002A3EFF"/>
+    <w:rsid w:val="00261635"/>
   </w:style>
   <w:style w:type="character" w:default="1" w:styleId="DefaultParagraphFont">
     <w:name w:val="Default Paragraph Font"/>

</xml_diff>

<commit_message>
Update to new template idtemp.docx with {{picture}} support, continuous name, LRN placeholder, and image insertion
</commit_message>
<xml_diff>
--- a/templates/id-template.docx
+++ b/templates/id-template.docx
@@ -10,18 +10,18 @@
         <mc:AlternateContent>
           <mc:Choice Requires="wps">
             <w:drawing>
-              <wp:anchor distT="45720" distB="45720" distL="114300" distR="114300" simplePos="0" relativeHeight="251681792" behindDoc="0" locked="0" layoutInCell="1" allowOverlap="1" wp14:anchorId="65801304" wp14:editId="2A100601">
+              <wp:anchor distT="45720" distB="45720" distL="114300" distR="114300" simplePos="0" relativeHeight="251661312" behindDoc="0" locked="0" layoutInCell="1" allowOverlap="1" wp14:anchorId="32344B30" wp14:editId="21272F19">
                 <wp:simplePos x="0" y="0"/>
                 <wp:positionH relativeFrom="column">
-                  <wp:posOffset>-139700</wp:posOffset>
+                  <wp:posOffset>-476250</wp:posOffset>
                 </wp:positionH>
                 <wp:positionV relativeFrom="paragraph">
-                  <wp:posOffset>986155</wp:posOffset>
+                  <wp:posOffset>2013585</wp:posOffset>
                 </wp:positionV>
-                <wp:extent cx="1193800" cy="295275"/>
+                <wp:extent cx="2536190" cy="370205"/>
                 <wp:effectExtent l="0" t="0" r="0" b="0"/>
                 <wp:wrapSquare wrapText="bothSides"/>
-                <wp:docPr id="12" name="Text Box 2"/>
+                <wp:docPr id="217" name="Text Box 2"/>
                 <wp:cNvGraphicFramePr>
                   <a:graphicFrameLocks xmlns:a="http://schemas.openxmlformats.org/drawingml/2006/main"/>
                 </wp:cNvGraphicFramePr>
@@ -34,7 +34,7 @@
                       <wps:spPr bwMode="auto">
                         <a:xfrm>
                           <a:off x="0" y="0"/>
-                          <a:ext cx="1193800" cy="295275"/>
+                          <a:ext cx="2536190" cy="370205"/>
                         </a:xfrm>
                         <a:prstGeom prst="rect">
                           <a:avLst/>
@@ -53,28 +53,19 @@
                             <w:pPr>
                               <w:rPr>
                                 <w:rFonts w:ascii="Copperplate Gothic Bold" w:hAnsi="Copperplate Gothic Bold"/>
-                                <w:spacing w:val="-4"/>
-                                <w:sz w:val="28"/>
-                                <w:szCs w:val="28"/>
+                                <w:spacing w:val="4"/>
+                                <w:sz w:val="40"/>
+                                <w:szCs w:val="40"/>
                               </w:rPr>
                             </w:pPr>
                             <w:r>
                               <w:rPr>
                                 <w:rFonts w:ascii="Copperplate Gothic Bold" w:hAnsi="Copperplate Gothic Bold"/>
-                                <w:spacing w:val="-4"/>
-                                <w:sz w:val="28"/>
-                                <w:szCs w:val="28"/>
-                              </w:rPr>
-                              <w:t>{{</w:t>
-                            </w:r>
-                            <w:r>
-                              <w:rPr>
-                                <w:rFonts w:ascii="Copperplate Gothic Bold" w:hAnsi="Copperplate Gothic Bold"/>
-                                <w:spacing w:val="-4"/>
-                                <w:sz w:val="28"/>
-                                <w:szCs w:val="28"/>
-                              </w:rPr>
-                              <w:t>picture}}</w:t>
+                                <w:spacing w:val="4"/>
+                                <w:sz w:val="40"/>
+                                <w:szCs w:val="40"/>
+                              </w:rPr>
+                              <w:t>{{LASTNAME}}</w:t>
                             </w:r>
                           </w:p>
                         </w:txbxContent>
@@ -96,39 +87,30 @@
           </mc:Choice>
           <mc:Fallback>
             <w:pict>
-              <v:shapetype w14:anchorId="65801304" id="_x0000_t202" coordsize="21600,21600" o:spt="202" path="m,l,21600r21600,l21600,xe">
+              <v:shapetype w14:anchorId="32344B30" id="_x0000_t202" coordsize="21600,21600" o:spt="202" path="m,l,21600r21600,l21600,xe">
                 <v:stroke joinstyle="miter"/>
                 <v:path gradientshapeok="t" o:connecttype="rect"/>
               </v:shapetype>
-              <v:shape id="Text Box 2" o:spid="_x0000_s1026" type="#_x0000_t202" style="position:absolute;margin-left:-11pt;margin-top:77.65pt;width:94pt;height:23.25pt;z-index:251681792;visibility:visible;mso-wrap-style:square;mso-width-percent:0;mso-height-percent:0;mso-wrap-distance-left:9pt;mso-wrap-distance-top:3.6pt;mso-wrap-distance-right:9pt;mso-wrap-distance-bottom:3.6pt;mso-position-horizontal:absolute;mso-position-horizontal-relative:text;mso-position-vertical:absolute;mso-position-vertical-relative:text;mso-width-percent:0;mso-height-percent:0;mso-width-relative:margin;mso-height-relative:margin;v-text-anchor:top" o:gfxdata="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" filled="f" stroked="f">
+              <v:shape id="Text Box 2" o:spid="_x0000_s1026" type="#_x0000_t202" style="position:absolute;margin-left:-37.5pt;margin-top:158.55pt;width:199.7pt;height:29.15pt;z-index:251661312;visibility:visible;mso-wrap-style:square;mso-width-percent:0;mso-height-percent:0;mso-wrap-distance-left:9pt;mso-wrap-distance-top:3.6pt;mso-wrap-distance-right:9pt;mso-wrap-distance-bottom:3.6pt;mso-position-horizontal:absolute;mso-position-horizontal-relative:text;mso-position-vertical:absolute;mso-position-vertical-relative:text;mso-width-percent:0;mso-height-percent:0;mso-width-relative:margin;mso-height-relative:margin;v-text-anchor:top" o:gfxdata="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" filled="f" stroked="f">
                 <v:textbox>
                   <w:txbxContent>
                     <w:p>
                       <w:pPr>
                         <w:rPr>
                           <w:rFonts w:ascii="Copperplate Gothic Bold" w:hAnsi="Copperplate Gothic Bold"/>
-                          <w:spacing w:val="-4"/>
-                          <w:sz w:val="28"/>
-                          <w:szCs w:val="28"/>
+                          <w:spacing w:val="4"/>
+                          <w:sz w:val="40"/>
+                          <w:szCs w:val="40"/>
                         </w:rPr>
                       </w:pPr>
                       <w:r>
                         <w:rPr>
                           <w:rFonts w:ascii="Copperplate Gothic Bold" w:hAnsi="Copperplate Gothic Bold"/>
-                          <w:spacing w:val="-4"/>
-                          <w:sz w:val="28"/>
-                          <w:szCs w:val="28"/>
-                        </w:rPr>
-                        <w:t>{{</w:t>
-                      </w:r>
-                      <w:r>
-                        <w:rPr>
-                          <w:rFonts w:ascii="Copperplate Gothic Bold" w:hAnsi="Copperplate Gothic Bold"/>
-                          <w:spacing w:val="-4"/>
-                          <w:sz w:val="28"/>
-                          <w:szCs w:val="28"/>
-                        </w:rPr>
-                        <w:t>picture}}</w:t>
+                          <w:spacing w:val="4"/>
+                          <w:sz w:val="40"/>
+                          <w:szCs w:val="40"/>
+                        </w:rPr>
+                        <w:t>{{LASTNAME}}</w:t>
                       </w:r>
                     </w:p>
                   </w:txbxContent>
@@ -146,133 +128,13 @@
         <mc:AlternateContent>
           <mc:Choice Requires="wps">
             <w:drawing>
-              <wp:anchor distT="45720" distB="45720" distL="114300" distR="114300" simplePos="0" relativeHeight="251665408" behindDoc="0" locked="0" layoutInCell="1" allowOverlap="1" wp14:anchorId="110DF417" wp14:editId="5EFAF4C3">
-                <wp:simplePos x="0" y="0"/>
-                <wp:positionH relativeFrom="column">
-                  <wp:posOffset>5086350</wp:posOffset>
-                </wp:positionH>
-                <wp:positionV relativeFrom="paragraph">
-                  <wp:posOffset>294005</wp:posOffset>
-                </wp:positionV>
-                <wp:extent cx="4068445" cy="228600"/>
-                <wp:effectExtent l="0" t="0" r="0" b="0"/>
-                <wp:wrapSquare wrapText="bothSides"/>
-                <wp:docPr id="6" name="Text Box 2"/>
-                <wp:cNvGraphicFramePr>
-                  <a:graphicFrameLocks xmlns:a="http://schemas.openxmlformats.org/drawingml/2006/main"/>
-                </wp:cNvGraphicFramePr>
-                <a:graphic xmlns:a="http://schemas.openxmlformats.org/drawingml/2006/main">
-                  <a:graphicData uri="http://schemas.microsoft.com/office/word/2010/wordprocessingShape">
-                    <wps:wsp>
-                      <wps:cNvSpPr txBox="1">
-                        <a:spLocks noChangeArrowheads="1"/>
-                      </wps:cNvSpPr>
-                      <wps:spPr bwMode="auto">
-                        <a:xfrm>
-                          <a:off x="0" y="0"/>
-                          <a:ext cx="4068445" cy="228600"/>
-                        </a:xfrm>
-                        <a:prstGeom prst="rect">
-                          <a:avLst/>
-                        </a:prstGeom>
-                        <a:noFill/>
-                        <a:ln w="9525">
-                          <a:noFill/>
-                          <a:miter lim="800000"/>
-                          <a:headEnd/>
-                          <a:tailEnd/>
-                        </a:ln>
-                      </wps:spPr>
-                      <wps:txbx>
-                        <w:txbxContent>
-                          <w:p>
-                            <w:pPr>
-                              <w:jc w:val="center"/>
-                              <w:rPr>
-                                <w:b/>
-                                <w:bCs/>
-                                <w:spacing w:val="20"/>
-                                <w:sz w:val="18"/>
-                                <w:szCs w:val="18"/>
-                              </w:rPr>
-                            </w:pPr>
-                            <w:r>
-                              <w:rPr>
-                                <w:b/>
-                                <w:bCs/>
-                                <w:spacing w:val="20"/>
-                                <w:sz w:val="18"/>
-                                <w:szCs w:val="18"/>
-                              </w:rPr>
-                              <w:t>{{FIRSTNAME}}  {{MIDDLENAME}}  {{LASTNAME}}</w:t>
-                            </w:r>
-                          </w:p>
-                        </w:txbxContent>
-                      </wps:txbx>
-                      <wps:bodyPr rot="0" vert="horz" wrap="square" lIns="91440" tIns="45720" rIns="91440" bIns="45720" anchor="t" anchorCtr="0">
-                        <a:noAutofit/>
-                      </wps:bodyPr>
-                    </wps:wsp>
-                  </a:graphicData>
-                </a:graphic>
-                <wp14:sizeRelH relativeFrom="margin">
-                  <wp14:pctWidth>0</wp14:pctWidth>
-                </wp14:sizeRelH>
-                <wp14:sizeRelV relativeFrom="margin">
-                  <wp14:pctHeight>0</wp14:pctHeight>
-                </wp14:sizeRelV>
-              </wp:anchor>
-            </w:drawing>
-          </mc:Choice>
-          <mc:Fallback>
-            <w:pict>
-              <v:shape w14:anchorId="110DF417" id="_x0000_s1027" type="#_x0000_t202" style="position:absolute;margin-left:400.5pt;margin-top:23.15pt;width:320.35pt;height:18pt;z-index:251665408;visibility:visible;mso-wrap-style:square;mso-width-percent:0;mso-height-percent:0;mso-wrap-distance-left:9pt;mso-wrap-distance-top:3.6pt;mso-wrap-distance-right:9pt;mso-wrap-distance-bottom:3.6pt;mso-position-horizontal:absolute;mso-position-horizontal-relative:text;mso-position-vertical:absolute;mso-position-vertical-relative:text;mso-width-percent:0;mso-height-percent:0;mso-width-relative:margin;mso-height-relative:margin;v-text-anchor:top" o:gfxdata="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" filled="f" stroked="f">
-                <v:textbox>
-                  <w:txbxContent>
-                    <w:p>
-                      <w:pPr>
-                        <w:jc w:val="center"/>
-                        <w:rPr>
-                          <w:b/>
-                          <w:bCs/>
-                          <w:spacing w:val="20"/>
-                          <w:sz w:val="18"/>
-                          <w:szCs w:val="18"/>
-                        </w:rPr>
-                      </w:pPr>
-                      <w:r>
-                        <w:rPr>
-                          <w:b/>
-                          <w:bCs/>
-                          <w:spacing w:val="20"/>
-                          <w:sz w:val="18"/>
-                          <w:szCs w:val="18"/>
-                        </w:rPr>
-                        <w:t>{{FIRSTNAME}}  {{MIDDLENAME}}  {{LASTNAME}}</w:t>
-                      </w:r>
-                    </w:p>
-                  </w:txbxContent>
-                </v:textbox>
-                <w10:wrap type="square"/>
-              </v:shape>
-            </w:pict>
-          </mc:Fallback>
-        </mc:AlternateContent>
-      </w:r>
-      <w:r>
-        <w:rPr>
-          <w:noProof/>
-        </w:rPr>
-        <mc:AlternateContent>
-          <mc:Choice Requires="wps">
-            <w:drawing>
-              <wp:anchor distT="45720" distB="45720" distL="114300" distR="114300" simplePos="0" relativeHeight="251675648" behindDoc="0" locked="0" layoutInCell="1" allowOverlap="1" wp14:anchorId="5DDDD3EE" wp14:editId="3E41018F">
+              <wp:anchor distT="45720" distB="45720" distL="114300" distR="114300" simplePos="0" relativeHeight="251675648" behindDoc="0" locked="0" layoutInCell="1" allowOverlap="1" wp14:anchorId="5DDDD3EE" wp14:editId="5ABB40AE">
                 <wp:simplePos x="0" y="0"/>
                 <wp:positionH relativeFrom="column">
                   <wp:posOffset>5060950</wp:posOffset>
                 </wp:positionH>
                 <wp:positionV relativeFrom="paragraph">
-                  <wp:posOffset>1697355</wp:posOffset>
+                  <wp:posOffset>1722755</wp:posOffset>
                 </wp:positionV>
                 <wp:extent cx="4068445" cy="152400"/>
                 <wp:effectExtent l="0" t="0" r="8255" b="0"/>
@@ -320,7 +182,25 @@
                                 <w:sz w:val="18"/>
                                 <w:szCs w:val="18"/>
                               </w:rPr>
-                              <w:t>Contact No. : {{CONTACT}}</w:t>
+                              <w:t xml:space="preserve">Contact </w:t>
+                            </w:r>
+                            <w:proofErr w:type="gramStart"/>
+                            <w:r>
+                              <w:rPr>
+                                <w:spacing w:val="-4"/>
+                                <w:sz w:val="18"/>
+                                <w:szCs w:val="18"/>
+                              </w:rPr>
+                              <w:t>No. :</w:t>
+                            </w:r>
+                            <w:proofErr w:type="gramEnd"/>
+                            <w:r>
+                              <w:rPr>
+                                <w:spacing w:val="-4"/>
+                                <w:sz w:val="18"/>
+                                <w:szCs w:val="18"/>
+                              </w:rPr>
+                              <w:t xml:space="preserve"> {{CONTACT}}</w:t>
                             </w:r>
                           </w:p>
                         </w:txbxContent>
@@ -342,7 +222,7 @@
           </mc:Choice>
           <mc:Fallback>
             <w:pict>
-              <v:shape w14:anchorId="5DDDD3EE" id="_x0000_s1028" type="#_x0000_t202" style="position:absolute;margin-left:398.5pt;margin-top:133.65pt;width:320.35pt;height:12pt;z-index:251675648;visibility:visible;mso-wrap-style:square;mso-width-percent:0;mso-height-percent:0;mso-wrap-distance-left:9pt;mso-wrap-distance-top:3.6pt;mso-wrap-distance-right:9pt;mso-wrap-distance-bottom:3.6pt;mso-position-horizontal:absolute;mso-position-horizontal-relative:text;mso-position-vertical:absolute;mso-position-vertical-relative:text;mso-width-percent:0;mso-height-percent:0;mso-width-relative:margin;mso-height-relative:margin;v-text-anchor:top" o:gfxdata="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" filled="f" stroked="f">
+              <v:shape w14:anchorId="5DDDD3EE" id="_x0000_s1027" type="#_x0000_t202" style="position:absolute;margin-left:398.5pt;margin-top:135.65pt;width:320.35pt;height:12pt;z-index:251675648;visibility:visible;mso-wrap-style:square;mso-width-percent:0;mso-height-percent:0;mso-wrap-distance-left:9pt;mso-wrap-distance-top:3.6pt;mso-wrap-distance-right:9pt;mso-wrap-distance-bottom:3.6pt;mso-position-horizontal:absolute;mso-position-horizontal-relative:text;mso-position-vertical:absolute;mso-position-vertical-relative:text;mso-width-percent:0;mso-height-percent:0;mso-width-relative:margin;mso-height-relative:margin;v-text-anchor:top" o:gfxdata="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" filled="f" stroked="f">
                 <v:textbox inset="0,0,0,0">
                   <w:txbxContent>
                     <w:p>
@@ -360,7 +240,25 @@
                           <w:sz w:val="18"/>
                           <w:szCs w:val="18"/>
                         </w:rPr>
-                        <w:t>Contact No. : {{CONTACT}}</w:t>
+                        <w:t xml:space="preserve">Contact </w:t>
+                      </w:r>
+                      <w:proofErr w:type="gramStart"/>
+                      <w:r>
+                        <w:rPr>
+                          <w:spacing w:val="-4"/>
+                          <w:sz w:val="18"/>
+                          <w:szCs w:val="18"/>
+                        </w:rPr>
+                        <w:t>No. :</w:t>
+                      </w:r>
+                      <w:proofErr w:type="gramEnd"/>
+                      <w:r>
+                        <w:rPr>
+                          <w:spacing w:val="-4"/>
+                          <w:sz w:val="18"/>
+                          <w:szCs w:val="18"/>
+                        </w:rPr>
+                        <w:t xml:space="preserve"> {{CONTACT}}</w:t>
                       </w:r>
                     </w:p>
                   </w:txbxContent>
@@ -378,18 +276,18 @@
         <mc:AlternateContent>
           <mc:Choice Requires="wps">
             <w:drawing>
-              <wp:anchor distT="45720" distB="45720" distL="114300" distR="114300" simplePos="0" relativeHeight="251671552" behindDoc="0" locked="0" layoutInCell="1" allowOverlap="1" wp14:anchorId="0C6C78B9" wp14:editId="3CE3B106">
+              <wp:anchor distT="45720" distB="45720" distL="114300" distR="114300" simplePos="0" relativeHeight="251669504" behindDoc="0" locked="0" layoutInCell="1" allowOverlap="1" wp14:anchorId="2647D407" wp14:editId="33790FF4">
                 <wp:simplePos x="0" y="0"/>
                 <wp:positionH relativeFrom="column">
-                  <wp:posOffset>5096510</wp:posOffset>
+                  <wp:posOffset>5088890</wp:posOffset>
                 </wp:positionH>
                 <wp:positionV relativeFrom="paragraph">
-                  <wp:posOffset>695325</wp:posOffset>
+                  <wp:posOffset>621665</wp:posOffset>
                 </wp:positionV>
-                <wp:extent cx="4068445" cy="95250"/>
+                <wp:extent cx="4068445" cy="116205"/>
                 <wp:effectExtent l="0" t="0" r="8255" b="0"/>
                 <wp:wrapSquare wrapText="bothSides"/>
-                <wp:docPr id="9" name="Text Box 2"/>
+                <wp:docPr id="8" name="Text Box 2"/>
                 <wp:cNvGraphicFramePr>
                   <a:graphicFrameLocks xmlns:a="http://schemas.openxmlformats.org/drawingml/2006/main"/>
                 </wp:cNvGraphicFramePr>
@@ -402,7 +300,7 @@
                       <wps:spPr bwMode="auto">
                         <a:xfrm>
                           <a:off x="0" y="0"/>
-                          <a:ext cx="4068445" cy="95250"/>
+                          <a:ext cx="4068445" cy="116205"/>
                         </a:xfrm>
                         <a:prstGeom prst="rect">
                           <a:avLst/>
@@ -421,41 +319,137 @@
                             <w:pPr>
                               <w:jc w:val="center"/>
                               <w:rPr>
-                                <w:spacing w:val="-4"/>
-                                <w:sz w:val="12"/>
-                                <w:szCs w:val="12"/>
+                                <w:spacing w:val="6"/>
+                                <w:sz w:val="14"/>
+                                <w:szCs w:val="14"/>
                               </w:rPr>
                             </w:pPr>
                             <w:r>
                               <w:rPr>
-                                <w:spacing w:val="-4"/>
-                                <w:sz w:val="12"/>
-                                <w:szCs w:val="12"/>
-                              </w:rPr>
-                              <w:t>Birthday</w:t>
+                                <w:spacing w:val="6"/>
+                                <w:sz w:val="14"/>
+                                <w:szCs w:val="14"/>
+                              </w:rPr>
+                              <w:t>Sex: {{SEX}}</w:t>
+                            </w:r>
+                          </w:p>
+                        </w:txbxContent>
+                      </wps:txbx>
+                      <wps:bodyPr rot="0" vert="horz" wrap="square" lIns="0" tIns="0" rIns="0" bIns="0" anchor="t" anchorCtr="0">
+                        <a:noAutofit/>
+                      </wps:bodyPr>
+                    </wps:wsp>
+                  </a:graphicData>
+                </a:graphic>
+                <wp14:sizeRelH relativeFrom="margin">
+                  <wp14:pctWidth>0</wp14:pctWidth>
+                </wp14:sizeRelH>
+                <wp14:sizeRelV relativeFrom="margin">
+                  <wp14:pctHeight>0</wp14:pctHeight>
+                </wp14:sizeRelV>
+              </wp:anchor>
+            </w:drawing>
+          </mc:Choice>
+          <mc:Fallback>
+            <w:pict>
+              <v:shape w14:anchorId="2647D407" id="_x0000_s1028" type="#_x0000_t202" style="position:absolute;margin-left:400.7pt;margin-top:48.95pt;width:320.35pt;height:9.15pt;z-index:251669504;visibility:visible;mso-wrap-style:square;mso-width-percent:0;mso-height-percent:0;mso-wrap-distance-left:9pt;mso-wrap-distance-top:3.6pt;mso-wrap-distance-right:9pt;mso-wrap-distance-bottom:3.6pt;mso-position-horizontal:absolute;mso-position-horizontal-relative:text;mso-position-vertical:absolute;mso-position-vertical-relative:text;mso-width-percent:0;mso-height-percent:0;mso-width-relative:margin;mso-height-relative:margin;v-text-anchor:top" o:gfxdata="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" filled="f" stroked="f">
+                <v:textbox inset="0,0,0,0">
+                  <w:txbxContent>
+                    <w:p>
+                      <w:pPr>
+                        <w:jc w:val="center"/>
+                        <w:rPr>
+                          <w:spacing w:val="6"/>
+                          <w:sz w:val="14"/>
+                          <w:szCs w:val="14"/>
+                        </w:rPr>
+                      </w:pPr>
+                      <w:r>
+                        <w:rPr>
+                          <w:spacing w:val="6"/>
+                          <w:sz w:val="14"/>
+                          <w:szCs w:val="14"/>
+                        </w:rPr>
+                        <w:t>Sex: {{SEX}}</w:t>
+                      </w:r>
+                    </w:p>
+                  </w:txbxContent>
+                </v:textbox>
+                <w10:wrap type="square"/>
+              </v:shape>
+            </w:pict>
+          </mc:Fallback>
+        </mc:AlternateContent>
+      </w:r>
+      <w:r>
+        <w:rPr>
+          <w:noProof/>
+        </w:rPr>
+        <mc:AlternateContent>
+          <mc:Choice Requires="wps">
+            <w:drawing>
+              <wp:anchor distT="45720" distB="45720" distL="114300" distR="114300" simplePos="0" relativeHeight="251671552" behindDoc="0" locked="0" layoutInCell="1" allowOverlap="1" wp14:anchorId="0C6C78B9" wp14:editId="7BA57900">
+                <wp:simplePos x="0" y="0"/>
+                <wp:positionH relativeFrom="column">
+                  <wp:posOffset>5095875</wp:posOffset>
+                </wp:positionH>
+                <wp:positionV relativeFrom="paragraph">
+                  <wp:posOffset>734695</wp:posOffset>
+                </wp:positionV>
+                <wp:extent cx="4068445" cy="116205"/>
+                <wp:effectExtent l="0" t="0" r="8255" b="0"/>
+                <wp:wrapSquare wrapText="bothSides"/>
+                <wp:docPr id="9" name="Text Box 2"/>
+                <wp:cNvGraphicFramePr>
+                  <a:graphicFrameLocks xmlns:a="http://schemas.openxmlformats.org/drawingml/2006/main"/>
+                </wp:cNvGraphicFramePr>
+                <a:graphic xmlns:a="http://schemas.openxmlformats.org/drawingml/2006/main">
+                  <a:graphicData uri="http://schemas.microsoft.com/office/word/2010/wordprocessingShape">
+                    <wps:wsp>
+                      <wps:cNvSpPr txBox="1">
+                        <a:spLocks noChangeArrowheads="1"/>
+                      </wps:cNvSpPr>
+                      <wps:spPr bwMode="auto">
+                        <a:xfrm>
+                          <a:off x="0" y="0"/>
+                          <a:ext cx="4068445" cy="116205"/>
+                        </a:xfrm>
+                        <a:prstGeom prst="rect">
+                          <a:avLst/>
+                        </a:prstGeom>
+                        <a:noFill/>
+                        <a:ln w="9525">
+                          <a:noFill/>
+                          <a:miter lim="800000"/>
+                          <a:headEnd/>
+                          <a:tailEnd/>
+                        </a:ln>
+                      </wps:spPr>
+                      <wps:txbx>
+                        <w:txbxContent>
+                          <w:p>
+                            <w:pPr>
+                              <w:jc w:val="center"/>
+                              <w:rPr>
+                                <w:spacing w:val="6"/>
+                                <w:sz w:val="14"/>
+                                <w:szCs w:val="14"/>
+                              </w:rPr>
+                            </w:pPr>
+                            <w:r>
+                              <w:rPr>
+                                <w:spacing w:val="6"/>
+                                <w:sz w:val="14"/>
+                                <w:szCs w:val="14"/>
+                              </w:rPr>
+                              <w:t>Birthday: {{BIRTHDAY}}</w:t>
                             </w:r>
                             <w:r>
                               <w:rPr>
-                                <w:spacing w:val="-4"/>
-                                <w:sz w:val="12"/>
-                                <w:szCs w:val="12"/>
-                              </w:rPr>
-                              <w:t>: {{</w:t>
-                            </w:r>
-                            <w:r>
-                              <w:rPr>
-                                <w:spacing w:val="-4"/>
-                                <w:sz w:val="12"/>
-                                <w:szCs w:val="12"/>
-                              </w:rPr>
-                              <w:t>BIRTHDAY}}</w:t>
-                            </w:r>
-                            <w:r>
-                              <w:rPr>
                                 <w:noProof/>
-                                <w:spacing w:val="-4"/>
-                                <w:sz w:val="12"/>
-                                <w:szCs w:val="12"/>
+                                <w:spacing w:val="6"/>
+                                <w:sz w:val="14"/>
+                                <w:szCs w:val="14"/>
                               </w:rPr>
                               <w:drawing>
                                 <wp:inline distT="0" distB="0" distL="0" distR="0" wp14:anchorId="3EEF1DD2" wp14:editId="0616ACFE">
@@ -508,9 +502,9 @@
                             </w:r>
                             <w:r>
                               <w:rPr>
-                                <w:spacing w:val="-4"/>
-                                <w:sz w:val="12"/>
-                                <w:szCs w:val="12"/>
+                                <w:spacing w:val="6"/>
+                                <w:sz w:val="14"/>
+                                <w:szCs w:val="14"/>
                               </w:rPr>
                               <w:t>}}</w:t>
                             </w:r>
@@ -534,48 +528,32 @@
           </mc:Choice>
           <mc:Fallback>
             <w:pict>
-              <v:shape w14:anchorId="0C6C78B9" id="_x0000_s1029" type="#_x0000_t202" style="position:absolute;margin-left:401.3pt;margin-top:54.75pt;width:320.35pt;height:7.5pt;z-index:251671552;visibility:visible;mso-wrap-style:square;mso-width-percent:0;mso-height-percent:0;mso-wrap-distance-left:9pt;mso-wrap-distance-top:3.6pt;mso-wrap-distance-right:9pt;mso-wrap-distance-bottom:3.6pt;mso-position-horizontal:absolute;mso-position-horizontal-relative:text;mso-position-vertical:absolute;mso-position-vertical-relative:text;mso-width-percent:0;mso-height-percent:0;mso-width-relative:margin;mso-height-relative:margin;v-text-anchor:top" o:gfxdata="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" filled="f" stroked="f">
+              <v:shape w14:anchorId="0C6C78B9" id="_x0000_s1029" type="#_x0000_t202" style="position:absolute;margin-left:401.25pt;margin-top:57.85pt;width:320.35pt;height:9.15pt;z-index:251671552;visibility:visible;mso-wrap-style:square;mso-width-percent:0;mso-height-percent:0;mso-wrap-distance-left:9pt;mso-wrap-distance-top:3.6pt;mso-wrap-distance-right:9pt;mso-wrap-distance-bottom:3.6pt;mso-position-horizontal:absolute;mso-position-horizontal-relative:text;mso-position-vertical:absolute;mso-position-vertical-relative:text;mso-width-percent:0;mso-height-percent:0;mso-width-relative:margin;mso-height-relative:margin;v-text-anchor:top" o:gfxdata="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" filled="f" stroked="f">
                 <v:textbox inset="0,0,0,0">
                   <w:txbxContent>
                     <w:p>
                       <w:pPr>
                         <w:jc w:val="center"/>
                         <w:rPr>
-                          <w:spacing w:val="-4"/>
-                          <w:sz w:val="12"/>
-                          <w:szCs w:val="12"/>
+                          <w:spacing w:val="6"/>
+                          <w:sz w:val="14"/>
+                          <w:szCs w:val="14"/>
                         </w:rPr>
                       </w:pPr>
                       <w:r>
                         <w:rPr>
-                          <w:spacing w:val="-4"/>
-                          <w:sz w:val="12"/>
-                          <w:szCs w:val="12"/>
-                        </w:rPr>
-                        <w:t>Birthday</w:t>
+                          <w:spacing w:val="6"/>
+                          <w:sz w:val="14"/>
+                          <w:szCs w:val="14"/>
+                        </w:rPr>
+                        <w:t>Birthday: {{BIRTHDAY}}</w:t>
                       </w:r>
                       <w:r>
                         <w:rPr>
-                          <w:spacing w:val="-4"/>
-                          <w:sz w:val="12"/>
-                          <w:szCs w:val="12"/>
-                        </w:rPr>
-                        <w:t>: {{</w:t>
-                      </w:r>
-                      <w:r>
-                        <w:rPr>
-                          <w:spacing w:val="-4"/>
-                          <w:sz w:val="12"/>
-                          <w:szCs w:val="12"/>
-                        </w:rPr>
-                        <w:t>BIRTHDAY}}</w:t>
-                      </w:r>
-                      <w:r>
-                        <w:rPr>
                           <w:noProof/>
-                          <w:spacing w:val="-4"/>
-                          <w:sz w:val="12"/>
-                          <w:szCs w:val="12"/>
+                          <w:spacing w:val="6"/>
+                          <w:sz w:val="14"/>
+                          <w:szCs w:val="14"/>
                         </w:rPr>
                         <w:drawing>
                           <wp:inline distT="0" distB="0" distL="0" distR="0" wp14:anchorId="3EEF1DD2" wp14:editId="0616ACFE">
@@ -628,9 +606,9 @@
                       </w:r>
                       <w:r>
                         <w:rPr>
-                          <w:spacing w:val="-4"/>
-                          <w:sz w:val="12"/>
-                          <w:szCs w:val="12"/>
+                          <w:spacing w:val="6"/>
+                          <w:sz w:val="14"/>
+                          <w:szCs w:val="14"/>
                         </w:rPr>
                         <w:t>}}</w:t>
                       </w:r>
@@ -650,18 +628,18 @@
         <mc:AlternateContent>
           <mc:Choice Requires="wps">
             <w:drawing>
-              <wp:anchor distT="45720" distB="45720" distL="114300" distR="114300" simplePos="0" relativeHeight="251669504" behindDoc="0" locked="0" layoutInCell="1" allowOverlap="1" wp14:anchorId="2647D407" wp14:editId="4CC67D81">
+              <wp:anchor distT="45720" distB="45720" distL="114300" distR="114300" simplePos="0" relativeHeight="251667456" behindDoc="0" locked="0" layoutInCell="1" allowOverlap="1" wp14:anchorId="52D9BCB2" wp14:editId="5D7D67AA">
                 <wp:simplePos x="0" y="0"/>
                 <wp:positionH relativeFrom="column">
-                  <wp:posOffset>5089525</wp:posOffset>
+                  <wp:posOffset>5085715</wp:posOffset>
                 </wp:positionH>
                 <wp:positionV relativeFrom="paragraph">
-                  <wp:posOffset>590550</wp:posOffset>
+                  <wp:posOffset>511175</wp:posOffset>
                 </wp:positionV>
-                <wp:extent cx="4068445" cy="95250"/>
+                <wp:extent cx="4068445" cy="116205"/>
                 <wp:effectExtent l="0" t="0" r="8255" b="0"/>
                 <wp:wrapSquare wrapText="bothSides"/>
-                <wp:docPr id="8" name="Text Box 2"/>
+                <wp:docPr id="7" name="Text Box 2"/>
                 <wp:cNvGraphicFramePr>
                   <a:graphicFrameLocks xmlns:a="http://schemas.openxmlformats.org/drawingml/2006/main"/>
                 </wp:cNvGraphicFramePr>
@@ -674,7 +652,7 @@
                       <wps:spPr bwMode="auto">
                         <a:xfrm>
                           <a:off x="0" y="0"/>
-                          <a:ext cx="4068445" cy="95250"/>
+                          <a:ext cx="4068445" cy="116205"/>
                         </a:xfrm>
                         <a:prstGeom prst="rect">
                           <a:avLst/>
@@ -693,184 +671,24 @@
                             <w:pPr>
                               <w:jc w:val="center"/>
                               <w:rPr>
-                                <w:spacing w:val="-4"/>
-                                <w:sz w:val="12"/>
-                                <w:szCs w:val="12"/>
+                                <w:spacing w:val="6"/>
+                                <w:sz w:val="14"/>
+                                <w:szCs w:val="14"/>
                               </w:rPr>
                             </w:pPr>
                             <w:r>
                               <w:rPr>
-                                <w:spacing w:val="-4"/>
-                                <w:sz w:val="12"/>
-                                <w:szCs w:val="12"/>
-                              </w:rPr>
-                              <w:t>Sex</w:t>
-                            </w:r>
-                            <w:r>
-                              <w:rPr>
-                                <w:spacing w:val="-4"/>
-                                <w:sz w:val="12"/>
-                                <w:szCs w:val="12"/>
-                              </w:rPr>
-                              <w:t>: {{</w:t>
-                            </w:r>
-                            <w:r>
-                              <w:rPr>
-                                <w:spacing w:val="-4"/>
-                                <w:sz w:val="12"/>
-                                <w:szCs w:val="12"/>
-                              </w:rPr>
-                              <w:t>SEX</w:t>
-                            </w:r>
-                            <w:r>
-                              <w:rPr>
-                                <w:spacing w:val="-4"/>
-                                <w:sz w:val="12"/>
-                                <w:szCs w:val="12"/>
-                              </w:rPr>
-                              <w:t>}}</w:t>
-                            </w:r>
-                          </w:p>
-                        </w:txbxContent>
-                      </wps:txbx>
-                      <wps:bodyPr rot="0" vert="horz" wrap="square" lIns="0" tIns="0" rIns="0" bIns="0" anchor="t" anchorCtr="0">
-                        <a:noAutofit/>
-                      </wps:bodyPr>
-                    </wps:wsp>
-                  </a:graphicData>
-                </a:graphic>
-                <wp14:sizeRelH relativeFrom="margin">
-                  <wp14:pctWidth>0</wp14:pctWidth>
-                </wp14:sizeRelH>
-                <wp14:sizeRelV relativeFrom="margin">
-                  <wp14:pctHeight>0</wp14:pctHeight>
-                </wp14:sizeRelV>
-              </wp:anchor>
-            </w:drawing>
-          </mc:Choice>
-          <mc:Fallback>
-            <w:pict>
-              <v:shape w14:anchorId="2647D407" id="_x0000_s1030" type="#_x0000_t202" style="position:absolute;margin-left:400.75pt;margin-top:46.5pt;width:320.35pt;height:7.5pt;z-index:251669504;visibility:visible;mso-wrap-style:square;mso-width-percent:0;mso-height-percent:0;mso-wrap-distance-left:9pt;mso-wrap-distance-top:3.6pt;mso-wrap-distance-right:9pt;mso-wrap-distance-bottom:3.6pt;mso-position-horizontal:absolute;mso-position-horizontal-relative:text;mso-position-vertical:absolute;mso-position-vertical-relative:text;mso-width-percent:0;mso-height-percent:0;mso-width-relative:margin;mso-height-relative:margin;v-text-anchor:top" o:gfxdata="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" filled="f" stroked="f">
-                <v:textbox inset="0,0,0,0">
-                  <w:txbxContent>
-                    <w:p>
-                      <w:pPr>
-                        <w:jc w:val="center"/>
-                        <w:rPr>
-                          <w:spacing w:val="-4"/>
-                          <w:sz w:val="12"/>
-                          <w:szCs w:val="12"/>
-                        </w:rPr>
-                      </w:pPr>
-                      <w:r>
-                        <w:rPr>
-                          <w:spacing w:val="-4"/>
-                          <w:sz w:val="12"/>
-                          <w:szCs w:val="12"/>
-                        </w:rPr>
-                        <w:t>Sex</w:t>
-                      </w:r>
-                      <w:r>
-                        <w:rPr>
-                          <w:spacing w:val="-4"/>
-                          <w:sz w:val="12"/>
-                          <w:szCs w:val="12"/>
-                        </w:rPr>
-                        <w:t>: {{</w:t>
-                      </w:r>
-                      <w:r>
-                        <w:rPr>
-                          <w:spacing w:val="-4"/>
-                          <w:sz w:val="12"/>
-                          <w:szCs w:val="12"/>
-                        </w:rPr>
-                        <w:t>SEX</w:t>
-                      </w:r>
-                      <w:r>
-                        <w:rPr>
-                          <w:spacing w:val="-4"/>
-                          <w:sz w:val="12"/>
-                          <w:szCs w:val="12"/>
-                        </w:rPr>
-                        <w:t>}}</w:t>
-                      </w:r>
-                    </w:p>
-                  </w:txbxContent>
-                </v:textbox>
-                <w10:wrap type="square"/>
-              </v:shape>
-            </w:pict>
-          </mc:Fallback>
-        </mc:AlternateContent>
-      </w:r>
-      <w:r>
-        <w:rPr>
-          <w:noProof/>
-        </w:rPr>
-        <mc:AlternateContent>
-          <mc:Choice Requires="wps">
-            <w:drawing>
-              <wp:anchor distT="45720" distB="45720" distL="114300" distR="114300" simplePos="0" relativeHeight="251667456" behindDoc="0" locked="0" layoutInCell="1" allowOverlap="1" wp14:anchorId="52D9BCB2" wp14:editId="74F16908">
-                <wp:simplePos x="0" y="0"/>
-                <wp:positionH relativeFrom="column">
-                  <wp:posOffset>5084445</wp:posOffset>
-                </wp:positionH>
-                <wp:positionV relativeFrom="paragraph">
-                  <wp:posOffset>499110</wp:posOffset>
-                </wp:positionV>
-                <wp:extent cx="4068445" cy="95250"/>
-                <wp:effectExtent l="0" t="0" r="8255" b="0"/>
-                <wp:wrapSquare wrapText="bothSides"/>
-                <wp:docPr id="7" name="Text Box 2"/>
-                <wp:cNvGraphicFramePr>
-                  <a:graphicFrameLocks xmlns:a="http://schemas.openxmlformats.org/drawingml/2006/main"/>
-                </wp:cNvGraphicFramePr>
-                <a:graphic xmlns:a="http://schemas.openxmlformats.org/drawingml/2006/main">
-                  <a:graphicData uri="http://schemas.microsoft.com/office/word/2010/wordprocessingShape">
-                    <wps:wsp>
-                      <wps:cNvSpPr txBox="1">
-                        <a:spLocks noChangeArrowheads="1"/>
-                      </wps:cNvSpPr>
-                      <wps:spPr bwMode="auto">
-                        <a:xfrm>
-                          <a:off x="0" y="0"/>
-                          <a:ext cx="4068445" cy="95250"/>
-                        </a:xfrm>
-                        <a:prstGeom prst="rect">
-                          <a:avLst/>
-                        </a:prstGeom>
-                        <a:noFill/>
-                        <a:ln w="9525">
-                          <a:noFill/>
-                          <a:miter lim="800000"/>
-                          <a:headEnd/>
-                          <a:tailEnd/>
-                        </a:ln>
-                      </wps:spPr>
-                      <wps:txbx>
-                        <w:txbxContent>
-                          <w:p>
-                            <w:pPr>
-                              <w:jc w:val="center"/>
-                              <w:rPr>
-                                <w:spacing w:val="-4"/>
-                                <w:sz w:val="12"/>
-                                <w:szCs w:val="12"/>
-                              </w:rPr>
-                            </w:pPr>
-                            <w:r>
-                              <w:rPr>
-                                <w:spacing w:val="-4"/>
-                                <w:sz w:val="12"/>
-                                <w:szCs w:val="12"/>
+                                <w:spacing w:val="6"/>
+                                <w:sz w:val="14"/>
+                                <w:szCs w:val="14"/>
                               </w:rPr>
                               <w:t xml:space="preserve">Address: </w:t>
                             </w:r>
                             <w:r>
                               <w:rPr>
-                                <w:spacing w:val="-4"/>
-                                <w:sz w:val="12"/>
-                                <w:szCs w:val="12"/>
+                                <w:spacing w:val="6"/>
+                                <w:sz w:val="14"/>
+                                <w:szCs w:val="14"/>
                               </w:rPr>
                               <w:t>{{ADDRESS}}</w:t>
                             </w:r>
@@ -894,33 +712,365 @@
           </mc:Choice>
           <mc:Fallback>
             <w:pict>
-              <v:shape w14:anchorId="52D9BCB2" id="_x0000_s1031" type="#_x0000_t202" style="position:absolute;margin-left:400.35pt;margin-top:39.3pt;width:320.35pt;height:7.5pt;z-index:251667456;visibility:visible;mso-wrap-style:square;mso-width-percent:0;mso-height-percent:0;mso-wrap-distance-left:9pt;mso-wrap-distance-top:3.6pt;mso-wrap-distance-right:9pt;mso-wrap-distance-bottom:3.6pt;mso-position-horizontal:absolute;mso-position-horizontal-relative:text;mso-position-vertical:absolute;mso-position-vertical-relative:text;mso-width-percent:0;mso-height-percent:0;mso-width-relative:margin;mso-height-relative:margin;v-text-anchor:top" o:gfxdata="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" filled="f" stroked="f">
+              <v:shape w14:anchorId="52D9BCB2" id="_x0000_s1030" type="#_x0000_t202" style="position:absolute;margin-left:400.45pt;margin-top:40.25pt;width:320.35pt;height:9.15pt;z-index:251667456;visibility:visible;mso-wrap-style:square;mso-width-percent:0;mso-height-percent:0;mso-wrap-distance-left:9pt;mso-wrap-distance-top:3.6pt;mso-wrap-distance-right:9pt;mso-wrap-distance-bottom:3.6pt;mso-position-horizontal:absolute;mso-position-horizontal-relative:text;mso-position-vertical:absolute;mso-position-vertical-relative:text;mso-width-percent:0;mso-height-percent:0;mso-width-relative:margin;mso-height-relative:margin;v-text-anchor:top" o:gfxdata="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" filled="f" stroked="f">
                 <v:textbox inset="0,0,0,0">
                   <w:txbxContent>
                     <w:p>
                       <w:pPr>
                         <w:jc w:val="center"/>
                         <w:rPr>
-                          <w:spacing w:val="-4"/>
-                          <w:sz w:val="12"/>
-                          <w:szCs w:val="12"/>
+                          <w:spacing w:val="6"/>
+                          <w:sz w:val="14"/>
+                          <w:szCs w:val="14"/>
                         </w:rPr>
                       </w:pPr>
                       <w:r>
                         <w:rPr>
-                          <w:spacing w:val="-4"/>
-                          <w:sz w:val="12"/>
-                          <w:szCs w:val="12"/>
+                          <w:spacing w:val="6"/>
+                          <w:sz w:val="14"/>
+                          <w:szCs w:val="14"/>
                         </w:rPr>
                         <w:t xml:space="preserve">Address: </w:t>
                       </w:r>
                       <w:r>
                         <w:rPr>
+                          <w:spacing w:val="6"/>
+                          <w:sz w:val="14"/>
+                          <w:szCs w:val="14"/>
+                        </w:rPr>
+                        <w:t>{{ADDRESS}}</w:t>
+                      </w:r>
+                    </w:p>
+                  </w:txbxContent>
+                </v:textbox>
+                <w10:wrap type="square"/>
+              </v:shape>
+            </w:pict>
+          </mc:Fallback>
+        </mc:AlternateContent>
+      </w:r>
+      <w:r>
+        <w:rPr>
+          <w:noProof/>
+        </w:rPr>
+        <mc:AlternateContent>
+          <mc:Choice Requires="wps">
+            <w:drawing>
+              <wp:anchor distT="45720" distB="45720" distL="114300" distR="114300" simplePos="0" relativeHeight="251665408" behindDoc="0" locked="0" layoutInCell="1" allowOverlap="1" wp14:anchorId="110DF417" wp14:editId="567D3023">
+                <wp:simplePos x="0" y="0"/>
+                <wp:positionH relativeFrom="column">
+                  <wp:posOffset>4972050</wp:posOffset>
+                </wp:positionH>
+                <wp:positionV relativeFrom="paragraph">
+                  <wp:posOffset>294640</wp:posOffset>
+                </wp:positionV>
+                <wp:extent cx="4260850" cy="276860"/>
+                <wp:effectExtent l="0" t="0" r="0" b="0"/>
+                <wp:wrapSquare wrapText="bothSides"/>
+                <wp:docPr id="6" name="Text Box 2"/>
+                <wp:cNvGraphicFramePr>
+                  <a:graphicFrameLocks xmlns:a="http://schemas.openxmlformats.org/drawingml/2006/main"/>
+                </wp:cNvGraphicFramePr>
+                <a:graphic xmlns:a="http://schemas.openxmlformats.org/drawingml/2006/main">
+                  <a:graphicData uri="http://schemas.microsoft.com/office/word/2010/wordprocessingShape">
+                    <wps:wsp>
+                      <wps:cNvSpPr txBox="1">
+                        <a:spLocks noChangeArrowheads="1"/>
+                      </wps:cNvSpPr>
+                      <wps:spPr bwMode="auto">
+                        <a:xfrm>
+                          <a:off x="0" y="0"/>
+                          <a:ext cx="4260850" cy="276860"/>
+                        </a:xfrm>
+                        <a:prstGeom prst="rect">
+                          <a:avLst/>
+                        </a:prstGeom>
+                        <a:noFill/>
+                        <a:ln w="9525">
+                          <a:noFill/>
+                          <a:miter lim="800000"/>
+                          <a:headEnd/>
+                          <a:tailEnd/>
+                        </a:ln>
+                      </wps:spPr>
+                      <wps:txbx>
+                        <w:txbxContent>
+                          <w:p>
+                            <w:pPr>
+                              <w:jc w:val="center"/>
+                              <w:rPr>
+                                <w:b/>
+                                <w:bCs/>
+                                <w:spacing w:val="20"/>
+                                <w:sz w:val="22"/>
+                                <w:szCs w:val="22"/>
+                              </w:rPr>
+                            </w:pPr>
+                            <w:r>
+                              <w:rPr>
+                                <w:b/>
+                                <w:bCs/>
+                                <w:spacing w:val="20"/>
+                                <w:sz w:val="22"/>
+                                <w:szCs w:val="22"/>
+                              </w:rPr>
+                              <w:t>{{FIRSTNAME</w:t>
+                            </w:r>
+                            <w:proofErr w:type="gramStart"/>
+                            <w:r>
+                              <w:rPr>
+                                <w:b/>
+                                <w:bCs/>
+                                <w:spacing w:val="20"/>
+                                <w:sz w:val="22"/>
+                                <w:szCs w:val="22"/>
+                              </w:rPr>
+                              <w:t>}}  {</w:t>
+                            </w:r>
+                            <w:proofErr w:type="gramEnd"/>
+                            <w:r>
+                              <w:rPr>
+                                <w:b/>
+                                <w:bCs/>
+                                <w:spacing w:val="20"/>
+                                <w:sz w:val="22"/>
+                                <w:szCs w:val="22"/>
+                              </w:rPr>
+                              <w:t>{</w:t>
+                            </w:r>
+                            <w:r>
+                              <w:rPr>
+                                <w:b/>
+                                <w:bCs/>
+                                <w:spacing w:val="20"/>
+                              </w:rPr>
+                              <w:t>MIDDLENAME</w:t>
+                            </w:r>
+                            <w:r>
+                              <w:rPr>
+                                <w:b/>
+                                <w:bCs/>
+                                <w:spacing w:val="20"/>
+                                <w:sz w:val="22"/>
+                                <w:szCs w:val="22"/>
+                              </w:rPr>
+                              <w:t>}}  {{LASTNAME}}</w:t>
+                            </w:r>
+                          </w:p>
+                        </w:txbxContent>
+                      </wps:txbx>
+                      <wps:bodyPr rot="0" vert="horz" wrap="square" lIns="91440" tIns="45720" rIns="91440" bIns="45720" anchor="t" anchorCtr="0">
+                        <a:noAutofit/>
+                      </wps:bodyPr>
+                    </wps:wsp>
+                  </a:graphicData>
+                </a:graphic>
+                <wp14:sizeRelH relativeFrom="margin">
+                  <wp14:pctWidth>0</wp14:pctWidth>
+                </wp14:sizeRelH>
+                <wp14:sizeRelV relativeFrom="margin">
+                  <wp14:pctHeight>0</wp14:pctHeight>
+                </wp14:sizeRelV>
+              </wp:anchor>
+            </w:drawing>
+          </mc:Choice>
+          <mc:Fallback>
+            <w:pict>
+              <v:shape w14:anchorId="110DF417" id="_x0000_s1031" type="#_x0000_t202" style="position:absolute;margin-left:391.5pt;margin-top:23.2pt;width:335.5pt;height:21.8pt;z-index:251665408;visibility:visible;mso-wrap-style:square;mso-width-percent:0;mso-height-percent:0;mso-wrap-distance-left:9pt;mso-wrap-distance-top:3.6pt;mso-wrap-distance-right:9pt;mso-wrap-distance-bottom:3.6pt;mso-position-horizontal:absolute;mso-position-horizontal-relative:text;mso-position-vertical:absolute;mso-position-vertical-relative:text;mso-width-percent:0;mso-height-percent:0;mso-width-relative:margin;mso-height-relative:margin;v-text-anchor:top" o:gfxdata="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" filled="f" stroked="f">
+                <v:textbox>
+                  <w:txbxContent>
+                    <w:p>
+                      <w:pPr>
+                        <w:jc w:val="center"/>
+                        <w:rPr>
+                          <w:b/>
+                          <w:bCs/>
+                          <w:spacing w:val="20"/>
+                          <w:sz w:val="22"/>
+                          <w:szCs w:val="22"/>
+                        </w:rPr>
+                      </w:pPr>
+                      <w:r>
+                        <w:rPr>
+                          <w:b/>
+                          <w:bCs/>
+                          <w:spacing w:val="20"/>
+                          <w:sz w:val="22"/>
+                          <w:szCs w:val="22"/>
+                        </w:rPr>
+                        <w:t>{{FIRSTNAME</w:t>
+                      </w:r>
+                      <w:proofErr w:type="gramStart"/>
+                      <w:r>
+                        <w:rPr>
+                          <w:b/>
+                          <w:bCs/>
+                          <w:spacing w:val="20"/>
+                          <w:sz w:val="22"/>
+                          <w:szCs w:val="22"/>
+                        </w:rPr>
+                        <w:t>}}  {</w:t>
+                      </w:r>
+                      <w:proofErr w:type="gramEnd"/>
+                      <w:r>
+                        <w:rPr>
+                          <w:b/>
+                          <w:bCs/>
+                          <w:spacing w:val="20"/>
+                          <w:sz w:val="22"/>
+                          <w:szCs w:val="22"/>
+                        </w:rPr>
+                        <w:t>{</w:t>
+                      </w:r>
+                      <w:r>
+                        <w:rPr>
+                          <w:b/>
+                          <w:bCs/>
+                          <w:spacing w:val="20"/>
+                        </w:rPr>
+                        <w:t>MIDDLENAME</w:t>
+                      </w:r>
+                      <w:r>
+                        <w:rPr>
+                          <w:b/>
+                          <w:bCs/>
+                          <w:spacing w:val="20"/>
+                          <w:sz w:val="22"/>
+                          <w:szCs w:val="22"/>
+                        </w:rPr>
+                        <w:t>}}  {{LASTNAME}}</w:t>
+                      </w:r>
+                    </w:p>
+                  </w:txbxContent>
+                </v:textbox>
+                <w10:wrap type="square"/>
+              </v:shape>
+            </w:pict>
+          </mc:Fallback>
+        </mc:AlternateContent>
+      </w:r>
+      <w:r>
+        <w:rPr>
+          <w:noProof/>
+        </w:rPr>
+        <mc:AlternateContent>
+          <mc:Choice Requires="wps">
+            <w:drawing>
+              <wp:anchor distT="45720" distB="45720" distL="114300" distR="114300" simplePos="0" relativeHeight="251681792" behindDoc="0" locked="0" layoutInCell="1" allowOverlap="1" wp14:anchorId="65801304" wp14:editId="4E7ED35C">
+                <wp:simplePos x="0" y="0"/>
+                <wp:positionH relativeFrom="column">
+                  <wp:posOffset>-139700</wp:posOffset>
+                </wp:positionH>
+                <wp:positionV relativeFrom="paragraph">
+                  <wp:posOffset>986155</wp:posOffset>
+                </wp:positionV>
+                <wp:extent cx="1193800" cy="295275"/>
+                <wp:effectExtent l="0" t="0" r="0" b="0"/>
+                <wp:wrapSquare wrapText="bothSides"/>
+                <wp:docPr id="12" name="Text Box 2"/>
+                <wp:cNvGraphicFramePr>
+                  <a:graphicFrameLocks xmlns:a="http://schemas.openxmlformats.org/drawingml/2006/main"/>
+                </wp:cNvGraphicFramePr>
+                <a:graphic xmlns:a="http://schemas.openxmlformats.org/drawingml/2006/main">
+                  <a:graphicData uri="http://schemas.microsoft.com/office/word/2010/wordprocessingShape">
+                    <wps:wsp>
+                      <wps:cNvSpPr txBox="1">
+                        <a:spLocks noChangeArrowheads="1"/>
+                      </wps:cNvSpPr>
+                      <wps:spPr bwMode="auto">
+                        <a:xfrm>
+                          <a:off x="0" y="0"/>
+                          <a:ext cx="1193800" cy="295275"/>
+                        </a:xfrm>
+                        <a:prstGeom prst="rect">
+                          <a:avLst/>
+                        </a:prstGeom>
+                        <a:noFill/>
+                        <a:ln w="9525">
+                          <a:noFill/>
+                          <a:miter lim="800000"/>
+                          <a:headEnd/>
+                          <a:tailEnd/>
+                        </a:ln>
+                      </wps:spPr>
+                      <wps:txbx>
+                        <w:txbxContent>
+                          <w:p>
+                            <w:pPr>
+                              <w:rPr>
+                                <w:rFonts w:ascii="Copperplate Gothic Bold" w:hAnsi="Copperplate Gothic Bold"/>
+                                <w:spacing w:val="-4"/>
+                                <w:sz w:val="28"/>
+                                <w:szCs w:val="28"/>
+                              </w:rPr>
+                            </w:pPr>
+                            <w:r>
+                              <w:rPr>
+                                <w:rFonts w:ascii="Copperplate Gothic Bold" w:hAnsi="Copperplate Gothic Bold"/>
+                                <w:spacing w:val="-4"/>
+                                <w:sz w:val="28"/>
+                                <w:szCs w:val="28"/>
+                              </w:rPr>
+                              <w:t>{{</w:t>
+                            </w:r>
+                            <w:r>
+                              <w:rPr>
+                                <w:rFonts w:ascii="Copperplate Gothic Bold" w:hAnsi="Copperplate Gothic Bold"/>
+                                <w:spacing w:val="-4"/>
+                                <w:sz w:val="28"/>
+                                <w:szCs w:val="28"/>
+                              </w:rPr>
+                              <w:t>picture}}</w:t>
+                            </w:r>
+                          </w:p>
+                        </w:txbxContent>
+                      </wps:txbx>
+                      <wps:bodyPr rot="0" vert="horz" wrap="square" lIns="91440" tIns="45720" rIns="91440" bIns="45720" anchor="t" anchorCtr="0">
+                        <a:noAutofit/>
+                      </wps:bodyPr>
+                    </wps:wsp>
+                  </a:graphicData>
+                </a:graphic>
+                <wp14:sizeRelH relativeFrom="margin">
+                  <wp14:pctWidth>0</wp14:pctWidth>
+                </wp14:sizeRelH>
+                <wp14:sizeRelV relativeFrom="margin">
+                  <wp14:pctHeight>0</wp14:pctHeight>
+                </wp14:sizeRelV>
+              </wp:anchor>
+            </w:drawing>
+          </mc:Choice>
+          <mc:Fallback>
+            <w:pict>
+              <v:shape w14:anchorId="65801304" id="_x0000_s1032" type="#_x0000_t202" style="position:absolute;margin-left:-11pt;margin-top:77.65pt;width:94pt;height:23.25pt;z-index:251681792;visibility:visible;mso-wrap-style:square;mso-width-percent:0;mso-height-percent:0;mso-wrap-distance-left:9pt;mso-wrap-distance-top:3.6pt;mso-wrap-distance-right:9pt;mso-wrap-distance-bottom:3.6pt;mso-position-horizontal:absolute;mso-position-horizontal-relative:text;mso-position-vertical:absolute;mso-position-vertical-relative:text;mso-width-percent:0;mso-height-percent:0;mso-width-relative:margin;mso-height-relative:margin;v-text-anchor:top" o:gfxdata="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" filled="f" stroked="f">
+                <v:textbox>
+                  <w:txbxContent>
+                    <w:p>
+                      <w:pPr>
+                        <w:rPr>
+                          <w:rFonts w:ascii="Copperplate Gothic Bold" w:hAnsi="Copperplate Gothic Bold"/>
                           <w:spacing w:val="-4"/>
-                          <w:sz w:val="12"/>
-                          <w:szCs w:val="12"/>
-                        </w:rPr>
-                        <w:t>{{ADDRESS}}</w:t>
+                          <w:sz w:val="28"/>
+                          <w:szCs w:val="28"/>
+                        </w:rPr>
+                      </w:pPr>
+                      <w:r>
+                        <w:rPr>
+                          <w:rFonts w:ascii="Copperplate Gothic Bold" w:hAnsi="Copperplate Gothic Bold"/>
+                          <w:spacing w:val="-4"/>
+                          <w:sz w:val="28"/>
+                          <w:szCs w:val="28"/>
+                        </w:rPr>
+                        <w:t>{{</w:t>
+                      </w:r>
+                      <w:r>
+                        <w:rPr>
+                          <w:rFonts w:ascii="Copperplate Gothic Bold" w:hAnsi="Copperplate Gothic Bold"/>
+                          <w:spacing w:val="-4"/>
+                          <w:sz w:val="28"/>
+                          <w:szCs w:val="28"/>
+                        </w:rPr>
+                        <w:t>picture}}</w:t>
                       </w:r>
                     </w:p>
                   </w:txbxContent>
@@ -984,8 +1134,6 @@
                                 <w:b/>
                                 <w:bCs/>
                                 <w:spacing w:val="20"/>
-                                <w:sz w:val="22"/>
-                                <w:szCs w:val="22"/>
                               </w:rPr>
                             </w:pPr>
                             <w:r>
@@ -993,8 +1141,6 @@
                                 <w:b/>
                                 <w:bCs/>
                                 <w:spacing w:val="20"/>
-                                <w:sz w:val="22"/>
-                                <w:szCs w:val="22"/>
                               </w:rPr>
                               <w:t>{{GUARDIAN}}</w:t>
                             </w:r>
@@ -1018,7 +1164,7 @@
           </mc:Choice>
           <mc:Fallback>
             <w:pict>
-              <v:shape w14:anchorId="5203266C" id="_x0000_s1032" type="#_x0000_t202" style="position:absolute;margin-left:398.35pt;margin-top:119.15pt;width:320.35pt;height:14.7pt;z-index:251673600;visibility:visible;mso-wrap-style:square;mso-width-percent:0;mso-height-percent:0;mso-wrap-distance-left:9pt;mso-wrap-distance-top:3.6pt;mso-wrap-distance-right:9pt;mso-wrap-distance-bottom:3.6pt;mso-position-horizontal:absolute;mso-position-horizontal-relative:text;mso-position-vertical:absolute;mso-position-vertical-relative:text;mso-width-percent:0;mso-height-percent:0;mso-width-relative:margin;mso-height-relative:margin;v-text-anchor:top" o:gfxdata="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" filled="f" stroked="f">
+              <v:shape w14:anchorId="5203266C" id="_x0000_s1033" type="#_x0000_t202" style="position:absolute;margin-left:398.35pt;margin-top:119.15pt;width:320.35pt;height:14.7pt;z-index:251673600;visibility:visible;mso-wrap-style:square;mso-width-percent:0;mso-height-percent:0;mso-wrap-distance-left:9pt;mso-wrap-distance-top:3.6pt;mso-wrap-distance-right:9pt;mso-wrap-distance-bottom:3.6pt;mso-position-horizontal:absolute;mso-position-horizontal-relative:text;mso-position-vertical:absolute;mso-position-vertical-relative:text;mso-width-percent:0;mso-height-percent:0;mso-width-relative:margin;mso-height-relative:margin;v-text-anchor:top" o:gfxdata="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" filled="f" stroked="f">
                 <v:textbox inset="0,0,0,0">
                   <w:txbxContent>
                     <w:p>
@@ -1028,8 +1174,6 @@
                           <w:b/>
                           <w:bCs/>
                           <w:spacing w:val="20"/>
-                          <w:sz w:val="22"/>
-                          <w:szCs w:val="22"/>
                         </w:rPr>
                       </w:pPr>
                       <w:r>
@@ -1037,8 +1181,6 @@
                           <w:b/>
                           <w:bCs/>
                           <w:spacing w:val="20"/>
-                          <w:sz w:val="22"/>
-                          <w:szCs w:val="22"/>
                         </w:rPr>
                         <w:t>{{GUARDIAN}}</w:t>
                       </w:r>
@@ -1106,6 +1248,7 @@
                                 <w:szCs w:val="28"/>
                               </w:rPr>
                             </w:pPr>
+                            <w:proofErr w:type="gramStart"/>
                             <w:r>
                               <w:rPr>
                                 <w:rFonts w:ascii="Consolas" w:hAnsi="Consolas"/>
@@ -1122,7 +1265,17 @@
                                 <w:sz w:val="28"/>
                                 <w:szCs w:val="28"/>
                               </w:rPr>
-                              <w:t>{{LRN}}</w:t>
+                              <w:t>{</w:t>
+                            </w:r>
+                            <w:proofErr w:type="gramEnd"/>
+                            <w:r>
+                              <w:rPr>
+                                <w:rFonts w:ascii="Consolas" w:hAnsi="Consolas"/>
+                                <w:spacing w:val="56"/>
+                                <w:sz w:val="28"/>
+                                <w:szCs w:val="28"/>
+                              </w:rPr>
+                              <w:t>{LRN}}</w:t>
                             </w:r>
                           </w:p>
                         </w:txbxContent>
@@ -1306,7 +1459,7 @@
         <mc:AlternateContent>
           <mc:Choice Requires="wps">
             <w:drawing>
-              <wp:anchor distT="45720" distB="45720" distL="114300" distR="114300" simplePos="0" relativeHeight="251663360" behindDoc="0" locked="0" layoutInCell="1" allowOverlap="1" wp14:anchorId="3A561120" wp14:editId="1D1733D6">
+              <wp:anchor distT="45720" distB="45720" distL="114300" distR="114300" simplePos="0" relativeHeight="251663360" behindDoc="0" locked="0" layoutInCell="1" allowOverlap="1" wp14:anchorId="3A561120" wp14:editId="09B30A0F">
                 <wp:simplePos x="0" y="0"/>
                 <wp:positionH relativeFrom="column">
                   <wp:posOffset>-457200</wp:posOffset>
@@ -1349,7 +1502,7 @@
                             <w:pPr>
                               <w:rPr>
                                 <w:rFonts w:ascii="Copperplate Gothic Bold" w:hAnsi="Copperplate Gothic Bold"/>
-                                <w:spacing w:val="-4"/>
+                                <w:spacing w:val="4"/>
                                 <w:sz w:val="28"/>
                                 <w:szCs w:val="28"/>
                               </w:rPr>
@@ -1357,47 +1510,31 @@
                             <w:r>
                               <w:rPr>
                                 <w:rFonts w:ascii="Copperplate Gothic Bold" w:hAnsi="Copperplate Gothic Bold"/>
-                                <w:spacing w:val="-4"/>
+                                <w:spacing w:val="4"/>
                                 <w:sz w:val="28"/>
                                 <w:szCs w:val="28"/>
                               </w:rPr>
-                              <w:t>{{FIRSTNAME}}</w:t>
+                              <w:t>{{FIRSTNAME</w:t>
                             </w:r>
+                            <w:proofErr w:type="gramStart"/>
                             <w:r>
                               <w:rPr>
                                 <w:rFonts w:ascii="Copperplate Gothic Bold" w:hAnsi="Copperplate Gothic Bold"/>
-                                <w:spacing w:val="-4"/>
+                                <w:spacing w:val="4"/>
                                 <w:sz w:val="28"/>
                                 <w:szCs w:val="28"/>
                               </w:rPr>
-                              <w:t xml:space="preserve">  </w:t>
+                              <w:t>}}  {</w:t>
                             </w:r>
+                            <w:proofErr w:type="gramEnd"/>
                             <w:r>
                               <w:rPr>
                                 <w:rFonts w:ascii="Copperplate Gothic Bold" w:hAnsi="Copperplate Gothic Bold"/>
-                                <w:spacing w:val="-4"/>
+                                <w:spacing w:val="4"/>
                                 <w:sz w:val="28"/>
                                 <w:szCs w:val="28"/>
                               </w:rPr>
-                              <w:t>{{</w:t>
-                            </w:r>
-                            <w:r>
-                              <w:rPr>
-                                <w:rFonts w:ascii="Copperplate Gothic Bold" w:hAnsi="Copperplate Gothic Bold"/>
-                                <w:spacing w:val="-4"/>
-                                <w:sz w:val="28"/>
-                                <w:szCs w:val="28"/>
-                              </w:rPr>
-                              <w:t>M.I.</w:t>
-                            </w:r>
-                            <w:r>
-                              <w:rPr>
-                                <w:rFonts w:ascii="Copperplate Gothic Bold" w:hAnsi="Copperplate Gothic Bold"/>
-                                <w:spacing w:val="-4"/>
-                                <w:sz w:val="28"/>
-                                <w:szCs w:val="28"/>
-                              </w:rPr>
-                              <w:t>}}</w:t>
+                              <w:t>{M.I.}}</w:t>
                             </w:r>
                           </w:p>
                         </w:txbxContent>
@@ -1419,14 +1556,14 @@
           </mc:Choice>
           <mc:Fallback>
             <w:pict>
-              <v:shape w14:anchorId="3A561120" id="_x0000_s1035" type="#_x0000_t202" style="position:absolute;margin-left:-36pt;margin-top:187.25pt;width:204.35pt;height:23.25pt;z-index:251663360;visibility:visible;mso-wrap-style:square;mso-width-percent:0;mso-height-percent:0;mso-wrap-distance-left:9pt;mso-wrap-distance-top:3.6pt;mso-wrap-distance-right:9pt;mso-wrap-distance-bottom:3.6pt;mso-position-horizontal:absolute;mso-position-horizontal-relative:text;mso-position-vertical:absolute;mso-position-vertical-relative:text;mso-width-percent:0;mso-height-percent:0;mso-width-relative:margin;mso-height-relative:margin;v-text-anchor:top" o:gfxdata="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" filled="f" stroked="f">
+              <v:shape w14:anchorId="3A561120" id="_x0000_s1036" type="#_x0000_t202" style="position:absolute;margin-left:-36pt;margin-top:187.25pt;width:204.35pt;height:23.25pt;z-index:251663360;visibility:visible;mso-wrap-style:square;mso-width-percent:0;mso-height-percent:0;mso-wrap-distance-left:9pt;mso-wrap-distance-top:3.6pt;mso-wrap-distance-right:9pt;mso-wrap-distance-bottom:3.6pt;mso-position-horizontal:absolute;mso-position-horizontal-relative:text;mso-position-vertical:absolute;mso-position-vertical-relative:text;mso-width-percent:0;mso-height-percent:0;mso-width-relative:margin;mso-height-relative:margin;v-text-anchor:top" o:gfxdata="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" filled="f" stroked="f">
                 <v:textbox>
                   <w:txbxContent>
                     <w:p>
                       <w:pPr>
                         <w:rPr>
                           <w:rFonts w:ascii="Copperplate Gothic Bold" w:hAnsi="Copperplate Gothic Bold"/>
-                          <w:spacing w:val="-4"/>
+                          <w:spacing w:val="4"/>
                           <w:sz w:val="28"/>
                           <w:szCs w:val="28"/>
                         </w:rPr>
@@ -1434,161 +1571,31 @@
                       <w:r>
                         <w:rPr>
                           <w:rFonts w:ascii="Copperplate Gothic Bold" w:hAnsi="Copperplate Gothic Bold"/>
-                          <w:spacing w:val="-4"/>
+                          <w:spacing w:val="4"/>
                           <w:sz w:val="28"/>
                           <w:szCs w:val="28"/>
                         </w:rPr>
-                        <w:t>{{FIRSTNAME}}</w:t>
+                        <w:t>{{FIRSTNAME</w:t>
                       </w:r>
+                      <w:proofErr w:type="gramStart"/>
                       <w:r>
                         <w:rPr>
                           <w:rFonts w:ascii="Copperplate Gothic Bold" w:hAnsi="Copperplate Gothic Bold"/>
-                          <w:spacing w:val="-4"/>
+                          <w:spacing w:val="4"/>
                           <w:sz w:val="28"/>
                           <w:szCs w:val="28"/>
                         </w:rPr>
-                        <w:t xml:space="preserve">  </w:t>
+                        <w:t>}}  {</w:t>
                       </w:r>
+                      <w:proofErr w:type="gramEnd"/>
                       <w:r>
                         <w:rPr>
                           <w:rFonts w:ascii="Copperplate Gothic Bold" w:hAnsi="Copperplate Gothic Bold"/>
-                          <w:spacing w:val="-4"/>
+                          <w:spacing w:val="4"/>
                           <w:sz w:val="28"/>
                           <w:szCs w:val="28"/>
                         </w:rPr>
-                        <w:t>{{</w:t>
-                      </w:r>
-                      <w:r>
-                        <w:rPr>
-                          <w:rFonts w:ascii="Copperplate Gothic Bold" w:hAnsi="Copperplate Gothic Bold"/>
-                          <w:spacing w:val="-4"/>
-                          <w:sz w:val="28"/>
-                          <w:szCs w:val="28"/>
-                        </w:rPr>
-                        <w:t>M.I.</w:t>
-                      </w:r>
-                      <w:r>
-                        <w:rPr>
-                          <w:rFonts w:ascii="Copperplate Gothic Bold" w:hAnsi="Copperplate Gothic Bold"/>
-                          <w:spacing w:val="-4"/>
-                          <w:sz w:val="28"/>
-                          <w:szCs w:val="28"/>
-                        </w:rPr>
-                        <w:t>}}</w:t>
-                      </w:r>
-                    </w:p>
-                  </w:txbxContent>
-                </v:textbox>
-                <w10:wrap type="square"/>
-              </v:shape>
-            </w:pict>
-          </mc:Fallback>
-        </mc:AlternateContent>
-      </w:r>
-      <w:r>
-        <w:rPr>
-          <w:noProof/>
-        </w:rPr>
-        <mc:AlternateContent>
-          <mc:Choice Requires="wps">
-            <w:drawing>
-              <wp:anchor distT="45720" distB="45720" distL="114300" distR="114300" simplePos="0" relativeHeight="251661312" behindDoc="0" locked="0" layoutInCell="1" allowOverlap="1" wp14:anchorId="32344B30" wp14:editId="7C23F520">
-                <wp:simplePos x="0" y="0"/>
-                <wp:positionH relativeFrom="column">
-                  <wp:posOffset>-457884</wp:posOffset>
-                </wp:positionH>
-                <wp:positionV relativeFrom="paragraph">
-                  <wp:posOffset>2059305</wp:posOffset>
-                </wp:positionV>
-                <wp:extent cx="2536190" cy="317500"/>
-                <wp:effectExtent l="0" t="0" r="0" b="6350"/>
-                <wp:wrapSquare wrapText="bothSides"/>
-                <wp:docPr id="217" name="Text Box 2"/>
-                <wp:cNvGraphicFramePr>
-                  <a:graphicFrameLocks xmlns:a="http://schemas.openxmlformats.org/drawingml/2006/main"/>
-                </wp:cNvGraphicFramePr>
-                <a:graphic xmlns:a="http://schemas.openxmlformats.org/drawingml/2006/main">
-                  <a:graphicData uri="http://schemas.microsoft.com/office/word/2010/wordprocessingShape">
-                    <wps:wsp>
-                      <wps:cNvSpPr txBox="1">
-                        <a:spLocks noChangeArrowheads="1"/>
-                      </wps:cNvSpPr>
-                      <wps:spPr bwMode="auto">
-                        <a:xfrm>
-                          <a:off x="0" y="0"/>
-                          <a:ext cx="2536190" cy="317500"/>
-                        </a:xfrm>
-                        <a:prstGeom prst="rect">
-                          <a:avLst/>
-                        </a:prstGeom>
-                        <a:noFill/>
-                        <a:ln w="9525">
-                          <a:noFill/>
-                          <a:miter lim="800000"/>
-                          <a:headEnd/>
-                          <a:tailEnd/>
-                        </a:ln>
-                      </wps:spPr>
-                      <wps:txbx>
-                        <w:txbxContent>
-                          <w:p>
-                            <w:pPr>
-                              <w:rPr>
-                                <w:rFonts w:ascii="Copperplate Gothic Bold" w:hAnsi="Copperplate Gothic Bold"/>
-                                <w:spacing w:val="-4"/>
-                                <w:sz w:val="36"/>
-                                <w:szCs w:val="36"/>
-                              </w:rPr>
-                            </w:pPr>
-                            <w:r>
-                              <w:rPr>
-                                <w:rFonts w:ascii="Copperplate Gothic Bold" w:hAnsi="Copperplate Gothic Bold"/>
-                                <w:spacing w:val="-4"/>
-                                <w:sz w:val="36"/>
-                                <w:szCs w:val="36"/>
-                              </w:rPr>
-                              <w:t>{{LASTNAME}}</w:t>
-                            </w:r>
-                          </w:p>
-                        </w:txbxContent>
-                      </wps:txbx>
-                      <wps:bodyPr rot="0" vert="horz" wrap="square" lIns="91440" tIns="45720" rIns="91440" bIns="45720" anchor="t" anchorCtr="0">
-                        <a:noAutofit/>
-                      </wps:bodyPr>
-                    </wps:wsp>
-                  </a:graphicData>
-                </a:graphic>
-                <wp14:sizeRelH relativeFrom="margin">
-                  <wp14:pctWidth>0</wp14:pctWidth>
-                </wp14:sizeRelH>
-                <wp14:sizeRelV relativeFrom="margin">
-                  <wp14:pctHeight>0</wp14:pctHeight>
-                </wp14:sizeRelV>
-              </wp:anchor>
-            </w:drawing>
-          </mc:Choice>
-          <mc:Fallback>
-            <w:pict>
-              <v:shape w14:anchorId="32344B30" id="_x0000_s1036" type="#_x0000_t202" style="position:absolute;margin-left:-36.05pt;margin-top:162.15pt;width:199.7pt;height:25pt;z-index:251661312;visibility:visible;mso-wrap-style:square;mso-width-percent:0;mso-height-percent:0;mso-wrap-distance-left:9pt;mso-wrap-distance-top:3.6pt;mso-wrap-distance-right:9pt;mso-wrap-distance-bottom:3.6pt;mso-position-horizontal:absolute;mso-position-horizontal-relative:text;mso-position-vertical:absolute;mso-position-vertical-relative:text;mso-width-percent:0;mso-height-percent:0;mso-width-relative:margin;mso-height-relative:margin;v-text-anchor:top" o:gfxdata="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" filled="f" stroked="f">
-                <v:textbox>
-                  <w:txbxContent>
-                    <w:p>
-                      <w:pPr>
-                        <w:rPr>
-                          <w:rFonts w:ascii="Copperplate Gothic Bold" w:hAnsi="Copperplate Gothic Bold"/>
-                          <w:spacing w:val="-4"/>
-                          <w:sz w:val="36"/>
-                          <w:szCs w:val="36"/>
-                        </w:rPr>
-                      </w:pPr>
-                      <w:r>
-                        <w:rPr>
-                          <w:rFonts w:ascii="Copperplate Gothic Bold" w:hAnsi="Copperplate Gothic Bold"/>
-                          <w:spacing w:val="-4"/>
-                          <w:sz w:val="36"/>
-                          <w:szCs w:val="36"/>
-                        </w:rPr>
-                        <w:t>{{LASTNAME}}</w:t>
+                        <w:t>{M.I.}}</w:t>
                       </w:r>
                     </w:p>
                   </w:txbxContent>

</xml_diff>

<commit_message>
Major update: LRN rotation fix, SEX dropdown, auto full name, photo auto-crop, white bg validator, duplicate check, Excel generation, 3-file upload (PDF+DOCX+JPG)
</commit_message>
<xml_diff>
--- a/templates/id-template.docx
+++ b/templates/id-template.docx
@@ -3,6 +3,244 @@
 <w:document xmlns:wpc="http://schemas.microsoft.com/office/word/2010/wordprocessingCanvas" xmlns:cx="http://schemas.microsoft.com/office/drawing/2014/chartex" xmlns:cx1="http://schemas.microsoft.com/office/drawing/2015/9/8/chartex" xmlns:cx2="http://schemas.microsoft.com/office/drawing/2015/10/21/chartex" xmlns:cx3="http://schemas.microsoft.com/office/drawing/2016/5/9/chartex" xmlns:cx4="http://schemas.microsoft.com/office/drawing/2016/5/10/chartex" xmlns:cx5="http://schemas.microsoft.com/office/drawing/2016/5/11/chartex" xmlns:cx6="http://schemas.microsoft.com/office/drawing/2016/5/12/chartex" xmlns:cx7="http://schemas.microsoft.com/office/drawing/2016/5/13/chartex" xmlns:cx8="http://schemas.microsoft.com/office/drawing/2016/5/14/chartex" xmlns:mc="http://schemas.openxmlformats.org/markup-compatibility/2006" xmlns:aink="http://schemas.microsoft.com/office/drawing/2016/ink" xmlns:am3d="http://schemas.microsoft.com/office/drawing/2017/model3d" xmlns:o="urn:schemas-microsoft-com:office:office" xmlns:r="http://schemas.openxmlformats.org/officeDocument/2006/relationships" xmlns:m="http://schemas.openxmlformats.org/officeDocument/2006/math" xmlns:v="urn:schemas-microsoft-com:vml" xmlns:wp14="http://schemas.microsoft.com/office/word/2010/wordprocessingDrawing" xmlns:wp="http://schemas.openxmlformats.org/drawingml/2006/wordprocessingDrawing" xmlns:w10="urn:schemas-microsoft-com:office:word" xmlns:w="http://schemas.openxmlformats.org/wordprocessingml/2006/main" xmlns:w14="http://schemas.microsoft.com/office/word/2010/wordml" xmlns:w15="http://schemas.microsoft.com/office/word/2012/wordml" xmlns:w16cex="http://schemas.microsoft.com/office/word/2018/wordml/cex" xmlns:w16cid="http://schemas.microsoft.com/office/word/2016/wordml/cid" xmlns:w16="http://schemas.microsoft.com/office/word/2018/wordml" xmlns:w16sdtdh="http://schemas.microsoft.com/office/word/2020/wordml/sdtdatahash" xmlns:w16se="http://schemas.microsoft.com/office/word/2015/wordml/symex" xmlns:wpg="http://schemas.microsoft.com/office/word/2010/wordprocessingGroup" xmlns:wpi="http://schemas.microsoft.com/office/word/2010/wordprocessingInk" xmlns:wne="http://schemas.microsoft.com/office/word/2006/wordml" xmlns:wps="http://schemas.microsoft.com/office/word/2010/wordprocessingShape" mc:Ignorable="w14 w15 w16se w16cid w16 w16cex w16sdtdh wp14">
   <w:body>
     <w:p>
+      <w:r>
+        <w:rPr>
+          <w:noProof/>
+        </w:rPr>
+        <mc:AlternateContent>
+          <mc:Choice Requires="wps">
+            <w:drawing>
+              <wp:anchor distT="45720" distB="45720" distL="114300" distR="114300" simplePos="0" relativeHeight="251673600" behindDoc="0" locked="0" layoutInCell="1" allowOverlap="1" wp14:anchorId="5203266C" wp14:editId="21D0DFF7">
+                <wp:simplePos x="0" y="0"/>
+                <wp:positionH relativeFrom="column">
+                  <wp:posOffset>5059045</wp:posOffset>
+                </wp:positionH>
+                <wp:positionV relativeFrom="paragraph">
+                  <wp:posOffset>1568450</wp:posOffset>
+                </wp:positionV>
+                <wp:extent cx="4068445" cy="186690"/>
+                <wp:effectExtent l="0" t="0" r="8255" b="3810"/>
+                <wp:wrapSquare wrapText="bothSides"/>
+                <wp:docPr id="11" name="Text Box 2"/>
+                <wp:cNvGraphicFramePr>
+                  <a:graphicFrameLocks xmlns:a="http://schemas.openxmlformats.org/drawingml/2006/main"/>
+                </wp:cNvGraphicFramePr>
+                <a:graphic xmlns:a="http://schemas.openxmlformats.org/drawingml/2006/main">
+                  <a:graphicData uri="http://schemas.microsoft.com/office/word/2010/wordprocessingShape">
+                    <wps:wsp>
+                      <wps:cNvSpPr txBox="1">
+                        <a:spLocks noChangeArrowheads="1"/>
+                      </wps:cNvSpPr>
+                      <wps:spPr bwMode="auto">
+                        <a:xfrm>
+                          <a:off x="0" y="0"/>
+                          <a:ext cx="4068445" cy="186690"/>
+                        </a:xfrm>
+                        <a:prstGeom prst="rect">
+                          <a:avLst/>
+                        </a:prstGeom>
+                        <a:noFill/>
+                        <a:ln w="9525">
+                          <a:noFill/>
+                          <a:miter lim="800000"/>
+                          <a:headEnd/>
+                          <a:tailEnd/>
+                        </a:ln>
+                      </wps:spPr>
+                      <wps:txbx>
+                        <w:txbxContent>
+                          <w:p>
+                            <w:pPr>
+                              <w:jc w:val="center"/>
+                              <w:rPr>
+                                <w:b/>
+                                <w:bCs/>
+                                <w:spacing w:val="20"/>
+                                <w:sz w:val="20"/>
+                                <w:szCs w:val="20"/>
+                              </w:rPr>
+                            </w:pPr>
+                            <w:r>
+                              <w:rPr>
+                                <w:b/>
+                                <w:bCs/>
+                                <w:spacing w:val="20"/>
+                                <w:sz w:val="20"/>
+                                <w:szCs w:val="20"/>
+                                <w:highlight w:val="lightGray"/>
+                              </w:rPr>
+                              <w:t>{{GUARDIAN}}</w:t>
+                            </w:r>
+                          </w:p>
+                        </w:txbxContent>
+                      </wps:txbx>
+                      <wps:bodyPr rot="0" vert="horz" wrap="square" lIns="0" tIns="0" rIns="0" bIns="0" anchor="t" anchorCtr="0">
+                        <a:noAutofit/>
+                      </wps:bodyPr>
+                    </wps:wsp>
+                  </a:graphicData>
+                </a:graphic>
+                <wp14:sizeRelH relativeFrom="margin">
+                  <wp14:pctWidth>0</wp14:pctWidth>
+                </wp14:sizeRelH>
+                <wp14:sizeRelV relativeFrom="margin">
+                  <wp14:pctHeight>0</wp14:pctHeight>
+                </wp14:sizeRelV>
+              </wp:anchor>
+            </w:drawing>
+          </mc:Choice>
+          <mc:Fallback>
+            <w:pict>
+              <v:shapetype w14:anchorId="5203266C" id="_x0000_t202" coordsize="21600,21600" o:spt="202" path="m,l,21600r21600,l21600,xe">
+                <v:stroke joinstyle="miter"/>
+                <v:path gradientshapeok="t" o:connecttype="rect"/>
+              </v:shapetype>
+              <v:shape id="Text Box 2" o:spid="_x0000_s1026" type="#_x0000_t202" style="position:absolute;margin-left:398.35pt;margin-top:123.5pt;width:320.35pt;height:14.7pt;z-index:251673600;visibility:visible;mso-wrap-style:square;mso-width-percent:0;mso-height-percent:0;mso-wrap-distance-left:9pt;mso-wrap-distance-top:3.6pt;mso-wrap-distance-right:9pt;mso-wrap-distance-bottom:3.6pt;mso-position-horizontal:absolute;mso-position-horizontal-relative:text;mso-position-vertical:absolute;mso-position-vertical-relative:text;mso-width-percent:0;mso-height-percent:0;mso-width-relative:margin;mso-height-relative:margin;v-text-anchor:top" o:gfxdata="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" filled="f" stroked="f">
+                <v:textbox inset="0,0,0,0">
+                  <w:txbxContent>
+                    <w:p>
+                      <w:pPr>
+                        <w:jc w:val="center"/>
+                        <w:rPr>
+                          <w:b/>
+                          <w:bCs/>
+                          <w:spacing w:val="20"/>
+                          <w:sz w:val="20"/>
+                          <w:szCs w:val="20"/>
+                        </w:rPr>
+                      </w:pPr>
+                      <w:r>
+                        <w:rPr>
+                          <w:b/>
+                          <w:bCs/>
+                          <w:spacing w:val="20"/>
+                          <w:sz w:val="20"/>
+                          <w:szCs w:val="20"/>
+                          <w:highlight w:val="lightGray"/>
+                        </w:rPr>
+                        <w:t>{{GUARDIAN}}</w:t>
+                      </w:r>
+                    </w:p>
+                  </w:txbxContent>
+                </v:textbox>
+                <w10:wrap type="square"/>
+              </v:shape>
+            </w:pict>
+          </mc:Fallback>
+        </mc:AlternateContent>
+      </w:r>
+      <w:r>
+        <w:rPr>
+          <w:noProof/>
+        </w:rPr>
+        <mc:AlternateContent>
+          <mc:Choice Requires="wps">
+            <w:drawing>
+              <wp:anchor distT="45720" distB="45720" distL="114300" distR="114300" simplePos="0" relativeHeight="251683840" behindDoc="0" locked="0" layoutInCell="1" allowOverlap="1" wp14:anchorId="69B45CCF" wp14:editId="751F75F2">
+                <wp:simplePos x="0" y="0"/>
+                <wp:positionH relativeFrom="column">
+                  <wp:posOffset>6403340</wp:posOffset>
+                </wp:positionH>
+                <wp:positionV relativeFrom="paragraph">
+                  <wp:posOffset>1474470</wp:posOffset>
+                </wp:positionV>
+                <wp:extent cx="1363980" cy="102235"/>
+                <wp:effectExtent l="0" t="0" r="7620" b="12065"/>
+                <wp:wrapSquare wrapText="bothSides"/>
+                <wp:docPr id="1" name="Text Box 2"/>
+                <wp:cNvGraphicFramePr>
+                  <a:graphicFrameLocks xmlns:a="http://schemas.openxmlformats.org/drawingml/2006/main"/>
+                </wp:cNvGraphicFramePr>
+                <a:graphic xmlns:a="http://schemas.openxmlformats.org/drawingml/2006/main">
+                  <a:graphicData uri="http://schemas.microsoft.com/office/word/2010/wordprocessingShape">
+                    <wps:wsp>
+                      <wps:cNvSpPr txBox="1">
+                        <a:spLocks noChangeArrowheads="1"/>
+                      </wps:cNvSpPr>
+                      <wps:spPr bwMode="auto">
+                        <a:xfrm>
+                          <a:off x="0" y="0"/>
+                          <a:ext cx="1363980" cy="102235"/>
+                        </a:xfrm>
+                        <a:prstGeom prst="rect">
+                          <a:avLst/>
+                        </a:prstGeom>
+                        <a:noFill/>
+                        <a:ln w="9525">
+                          <a:noFill/>
+                          <a:miter lim="800000"/>
+                          <a:headEnd/>
+                          <a:tailEnd/>
+                        </a:ln>
+                      </wps:spPr>
+                      <wps:txbx>
+                        <w:txbxContent>
+                          <w:p>
+                            <w:pPr>
+                              <w:jc w:val="center"/>
+                              <w:rPr>
+                                <w:spacing w:val="-4"/>
+                                <w:sz w:val="10"/>
+                                <w:szCs w:val="10"/>
+                              </w:rPr>
+                            </w:pPr>
+                            <w:r>
+                              <w:rPr>
+                                <w:spacing w:val="-4"/>
+                                <w:sz w:val="10"/>
+                                <w:szCs w:val="10"/>
+                              </w:rPr>
+                              <w:t>PLEASE CONTACT</w:t>
+                            </w:r>
+                          </w:p>
+                        </w:txbxContent>
+                      </wps:txbx>
+                      <wps:bodyPr rot="0" vert="horz" wrap="square" lIns="0" tIns="0" rIns="0" bIns="0" anchor="t" anchorCtr="0">
+                        <a:noAutofit/>
+                      </wps:bodyPr>
+                    </wps:wsp>
+                  </a:graphicData>
+                </a:graphic>
+                <wp14:sizeRelH relativeFrom="margin">
+                  <wp14:pctWidth>0</wp14:pctWidth>
+                </wp14:sizeRelH>
+                <wp14:sizeRelV relativeFrom="margin">
+                  <wp14:pctHeight>0</wp14:pctHeight>
+                </wp14:sizeRelV>
+              </wp:anchor>
+            </w:drawing>
+          </mc:Choice>
+          <mc:Fallback>
+            <w:pict>
+              <v:shape w14:anchorId="69B45CCF" id="_x0000_s1027" type="#_x0000_t202" style="position:absolute;margin-left:504.2pt;margin-top:116.1pt;width:107.4pt;height:8.05pt;z-index:251683840;visibility:visible;mso-wrap-style:square;mso-width-percent:0;mso-height-percent:0;mso-wrap-distance-left:9pt;mso-wrap-distance-top:3.6pt;mso-wrap-distance-right:9pt;mso-wrap-distance-bottom:3.6pt;mso-position-horizontal:absolute;mso-position-horizontal-relative:text;mso-position-vertical:absolute;mso-position-vertical-relative:text;mso-width-percent:0;mso-height-percent:0;mso-width-relative:margin;mso-height-relative:margin;v-text-anchor:top" o:gfxdata="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" filled="f" stroked="f">
+                <v:textbox inset="0,0,0,0">
+                  <w:txbxContent>
+                    <w:p>
+                      <w:pPr>
+                        <w:jc w:val="center"/>
+                        <w:rPr>
+                          <w:spacing w:val="-4"/>
+                          <w:sz w:val="10"/>
+                          <w:szCs w:val="10"/>
+                        </w:rPr>
+                      </w:pPr>
+                      <w:r>
+                        <w:rPr>
+                          <w:spacing w:val="-4"/>
+                          <w:sz w:val="10"/>
+                          <w:szCs w:val="10"/>
+                        </w:rPr>
+                        <w:t>PLEASE CONTACT</w:t>
+                      </w:r>
+                    </w:p>
+                  </w:txbxContent>
+                </v:textbox>
+                <w10:wrap type="square"/>
+              </v:shape>
+            </w:pict>
+          </mc:Fallback>
+        </mc:AlternateContent>
+      </w:r>
       <w:r>
         <w:rPr>
           <w:noProof/>
@@ -87,11 +325,7 @@
           </mc:Choice>
           <mc:Fallback>
             <w:pict>
-              <v:shapetype w14:anchorId="32344B30" id="_x0000_t202" coordsize="21600,21600" o:spt="202" path="m,l,21600r21600,l21600,xe">
-                <v:stroke joinstyle="miter"/>
-                <v:path gradientshapeok="t" o:connecttype="rect"/>
-              </v:shapetype>
-              <v:shape id="Text Box 2" o:spid="_x0000_s1026" type="#_x0000_t202" style="position:absolute;margin-left:-37.5pt;margin-top:158.55pt;width:199.7pt;height:29.15pt;z-index:251661312;visibility:visible;mso-wrap-style:square;mso-width-percent:0;mso-height-percent:0;mso-wrap-distance-left:9pt;mso-wrap-distance-top:3.6pt;mso-wrap-distance-right:9pt;mso-wrap-distance-bottom:3.6pt;mso-position-horizontal:absolute;mso-position-horizontal-relative:text;mso-position-vertical:absolute;mso-position-vertical-relative:text;mso-width-percent:0;mso-height-percent:0;mso-width-relative:margin;mso-height-relative:margin;v-text-anchor:top" o:gfxdata="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" filled="f" stroked="f">
+              <v:shape w14:anchorId="32344B30" id="_x0000_s1028" type="#_x0000_t202" style="position:absolute;margin-left:-37.5pt;margin-top:158.55pt;width:199.7pt;height:29.15pt;z-index:251661312;visibility:visible;mso-wrap-style:square;mso-width-percent:0;mso-height-percent:0;mso-wrap-distance-left:9pt;mso-wrap-distance-top:3.6pt;mso-wrap-distance-right:9pt;mso-wrap-distance-bottom:3.6pt;mso-position-horizontal:absolute;mso-position-horizontal-relative:text;mso-position-vertical:absolute;mso-position-vertical-relative:text;mso-width-percent:0;mso-height-percent:0;mso-width-relative:margin;mso-height-relative:margin;v-text-anchor:top" o:gfxdata="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" filled="f" stroked="f">
                 <v:textbox>
                   <w:txbxContent>
                     <w:p>
@@ -172,15 +406,15 @@
                               <w:jc w:val="center"/>
                               <w:rPr>
                                 <w:spacing w:val="-4"/>
-                                <w:sz w:val="18"/>
-                                <w:szCs w:val="18"/>
+                                <w:sz w:val="14"/>
+                                <w:szCs w:val="14"/>
                               </w:rPr>
                             </w:pPr>
                             <w:r>
                               <w:rPr>
                                 <w:spacing w:val="-4"/>
-                                <w:sz w:val="18"/>
-                                <w:szCs w:val="18"/>
+                                <w:sz w:val="14"/>
+                                <w:szCs w:val="14"/>
                               </w:rPr>
                               <w:t xml:space="preserve">Contact </w:t>
                             </w:r>
@@ -188,8 +422,8 @@
                             <w:r>
                               <w:rPr>
                                 <w:spacing w:val="-4"/>
-                                <w:sz w:val="18"/>
-                                <w:szCs w:val="18"/>
+                                <w:sz w:val="14"/>
+                                <w:szCs w:val="14"/>
                               </w:rPr>
                               <w:t>No. :</w:t>
                             </w:r>
@@ -197,8 +431,8 @@
                             <w:r>
                               <w:rPr>
                                 <w:spacing w:val="-4"/>
-                                <w:sz w:val="18"/>
-                                <w:szCs w:val="18"/>
+                                <w:sz w:val="14"/>
+                                <w:szCs w:val="14"/>
                               </w:rPr>
                               <w:t xml:space="preserve"> {{CONTACT}}</w:t>
                             </w:r>
@@ -222,7 +456,7 @@
           </mc:Choice>
           <mc:Fallback>
             <w:pict>
-              <v:shape w14:anchorId="5DDDD3EE" id="_x0000_s1027" type="#_x0000_t202" style="position:absolute;margin-left:398.5pt;margin-top:135.65pt;width:320.35pt;height:12pt;z-index:251675648;visibility:visible;mso-wrap-style:square;mso-width-percent:0;mso-height-percent:0;mso-wrap-distance-left:9pt;mso-wrap-distance-top:3.6pt;mso-wrap-distance-right:9pt;mso-wrap-distance-bottom:3.6pt;mso-position-horizontal:absolute;mso-position-horizontal-relative:text;mso-position-vertical:absolute;mso-position-vertical-relative:text;mso-width-percent:0;mso-height-percent:0;mso-width-relative:margin;mso-height-relative:margin;v-text-anchor:top" o:gfxdata="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" filled="f" stroked="f">
+              <v:shape w14:anchorId="5DDDD3EE" id="_x0000_s1029" type="#_x0000_t202" style="position:absolute;margin-left:398.5pt;margin-top:135.65pt;width:320.35pt;height:12pt;z-index:251675648;visibility:visible;mso-wrap-style:square;mso-width-percent:0;mso-height-percent:0;mso-wrap-distance-left:9pt;mso-wrap-distance-top:3.6pt;mso-wrap-distance-right:9pt;mso-wrap-distance-bottom:3.6pt;mso-position-horizontal:absolute;mso-position-horizontal-relative:text;mso-position-vertical:absolute;mso-position-vertical-relative:text;mso-width-percent:0;mso-height-percent:0;mso-width-relative:margin;mso-height-relative:margin;v-text-anchor:top" o:gfxdata="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" filled="f" stroked="f">
                 <v:textbox inset="0,0,0,0">
                   <w:txbxContent>
                     <w:p>
@@ -230,15 +464,15 @@
                         <w:jc w:val="center"/>
                         <w:rPr>
                           <w:spacing w:val="-4"/>
-                          <w:sz w:val="18"/>
-                          <w:szCs w:val="18"/>
+                          <w:sz w:val="14"/>
+                          <w:szCs w:val="14"/>
                         </w:rPr>
                       </w:pPr>
                       <w:r>
                         <w:rPr>
                           <w:spacing w:val="-4"/>
-                          <w:sz w:val="18"/>
-                          <w:szCs w:val="18"/>
+                          <w:sz w:val="14"/>
+                          <w:szCs w:val="14"/>
                         </w:rPr>
                         <w:t xml:space="preserve">Contact </w:t>
                       </w:r>
@@ -246,8 +480,8 @@
                       <w:r>
                         <w:rPr>
                           <w:spacing w:val="-4"/>
-                          <w:sz w:val="18"/>
-                          <w:szCs w:val="18"/>
+                          <w:sz w:val="14"/>
+                          <w:szCs w:val="14"/>
                         </w:rPr>
                         <w:t>No. :</w:t>
                       </w:r>
@@ -255,8 +489,8 @@
                       <w:r>
                         <w:rPr>
                           <w:spacing w:val="-4"/>
-                          <w:sz w:val="18"/>
-                          <w:szCs w:val="18"/>
+                          <w:sz w:val="14"/>
+                          <w:szCs w:val="14"/>
                         </w:rPr>
                         <w:t xml:space="preserve"> {{CONTACT}}</w:t>
                       </w:r>
@@ -352,7 +586,7 @@
           </mc:Choice>
           <mc:Fallback>
             <w:pict>
-              <v:shape w14:anchorId="2647D407" id="_x0000_s1028" type="#_x0000_t202" style="position:absolute;margin-left:400.7pt;margin-top:48.95pt;width:320.35pt;height:9.15pt;z-index:251669504;visibility:visible;mso-wrap-style:square;mso-width-percent:0;mso-height-percent:0;mso-wrap-distance-left:9pt;mso-wrap-distance-top:3.6pt;mso-wrap-distance-right:9pt;mso-wrap-distance-bottom:3.6pt;mso-position-horizontal:absolute;mso-position-horizontal-relative:text;mso-position-vertical:absolute;mso-position-vertical-relative:text;mso-width-percent:0;mso-height-percent:0;mso-width-relative:margin;mso-height-relative:margin;v-text-anchor:top" o:gfxdata="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" filled="f" stroked="f">
+              <v:shape w14:anchorId="2647D407" id="_x0000_s1030" type="#_x0000_t202" style="position:absolute;margin-left:400.7pt;margin-top:48.95pt;width:320.35pt;height:9.15pt;z-index:251669504;visibility:visible;mso-wrap-style:square;mso-width-percent:0;mso-height-percent:0;mso-wrap-distance-left:9pt;mso-wrap-distance-top:3.6pt;mso-wrap-distance-right:9pt;mso-wrap-distance-bottom:3.6pt;mso-position-horizontal:absolute;mso-position-horizontal-relative:text;mso-position-vertical:absolute;mso-position-vertical-relative:text;mso-width-percent:0;mso-height-percent:0;mso-width-relative:margin;mso-height-relative:margin;v-text-anchor:top" o:gfxdata="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" filled="f" stroked="f">
                 <v:textbox inset="0,0,0,0">
                   <w:txbxContent>
                     <w:p>
@@ -528,7 +762,7 @@
           </mc:Choice>
           <mc:Fallback>
             <w:pict>
-              <v:shape w14:anchorId="0C6C78B9" id="_x0000_s1029" type="#_x0000_t202" style="position:absolute;margin-left:401.25pt;margin-top:57.85pt;width:320.35pt;height:9.15pt;z-index:251671552;visibility:visible;mso-wrap-style:square;mso-width-percent:0;mso-height-percent:0;mso-wrap-distance-left:9pt;mso-wrap-distance-top:3.6pt;mso-wrap-distance-right:9pt;mso-wrap-distance-bottom:3.6pt;mso-position-horizontal:absolute;mso-position-horizontal-relative:text;mso-position-vertical:absolute;mso-position-vertical-relative:text;mso-width-percent:0;mso-height-percent:0;mso-width-relative:margin;mso-height-relative:margin;v-text-anchor:top" o:gfxdata="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" filled="f" stroked="f">
+              <v:shape w14:anchorId="0C6C78B9" id="_x0000_s1031" type="#_x0000_t202" style="position:absolute;margin-left:401.25pt;margin-top:57.85pt;width:320.35pt;height:9.15pt;z-index:251671552;visibility:visible;mso-wrap-style:square;mso-width-percent:0;mso-height-percent:0;mso-wrap-distance-left:9pt;mso-wrap-distance-top:3.6pt;mso-wrap-distance-right:9pt;mso-wrap-distance-bottom:3.6pt;mso-position-horizontal:absolute;mso-position-horizontal-relative:text;mso-position-vertical:absolute;mso-position-vertical-relative:text;mso-width-percent:0;mso-height-percent:0;mso-width-relative:margin;mso-height-relative:margin;v-text-anchor:top" o:gfxdata="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" filled="f" stroked="f">
                 <v:textbox inset="0,0,0,0">
                   <w:txbxContent>
                     <w:p>
@@ -712,7 +946,7 @@
           </mc:Choice>
           <mc:Fallback>
             <w:pict>
-              <v:shape w14:anchorId="52D9BCB2" id="_x0000_s1030" type="#_x0000_t202" style="position:absolute;margin-left:400.45pt;margin-top:40.25pt;width:320.35pt;height:9.15pt;z-index:251667456;visibility:visible;mso-wrap-style:square;mso-width-percent:0;mso-height-percent:0;mso-wrap-distance-left:9pt;mso-wrap-distance-top:3.6pt;mso-wrap-distance-right:9pt;mso-wrap-distance-bottom:3.6pt;mso-position-horizontal:absolute;mso-position-horizontal-relative:text;mso-position-vertical:absolute;mso-position-vertical-relative:text;mso-width-percent:0;mso-height-percent:0;mso-width-relative:margin;mso-height-relative:margin;v-text-anchor:top" o:gfxdata="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" filled="f" stroked="f">
+              <v:shape w14:anchorId="52D9BCB2" id="_x0000_s1032" type="#_x0000_t202" style="position:absolute;margin-left:400.45pt;margin-top:40.25pt;width:320.35pt;height:9.15pt;z-index:251667456;visibility:visible;mso-wrap-style:square;mso-width-percent:0;mso-height-percent:0;mso-wrap-distance-left:9pt;mso-wrap-distance-top:3.6pt;mso-wrap-distance-right:9pt;mso-wrap-distance-bottom:3.6pt;mso-position-horizontal:absolute;mso-position-horizontal-relative:text;mso-position-vertical:absolute;mso-position-vertical-relative:text;mso-width-percent:0;mso-height-percent:0;mso-width-relative:margin;mso-height-relative:margin;v-text-anchor:top" o:gfxdata="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" filled="f" stroked="f">
                 <v:textbox inset="0,0,0,0">
                   <w:txbxContent>
                     <w:p>
@@ -876,7 +1110,7 @@
           </mc:Choice>
           <mc:Fallback>
             <w:pict>
-              <v:shape w14:anchorId="110DF417" id="_x0000_s1031" type="#_x0000_t202" style="position:absolute;margin-left:391.5pt;margin-top:23.2pt;width:335.5pt;height:21.8pt;z-index:251665408;visibility:visible;mso-wrap-style:square;mso-width-percent:0;mso-height-percent:0;mso-wrap-distance-left:9pt;mso-wrap-distance-top:3.6pt;mso-wrap-distance-right:9pt;mso-wrap-distance-bottom:3.6pt;mso-position-horizontal:absolute;mso-position-horizontal-relative:text;mso-position-vertical:absolute;mso-position-vertical-relative:text;mso-width-percent:0;mso-height-percent:0;mso-width-relative:margin;mso-height-relative:margin;v-text-anchor:top" o:gfxdata="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" filled="f" stroked="f">
+              <v:shape w14:anchorId="110DF417" id="_x0000_s1033" type="#_x0000_t202" style="position:absolute;margin-left:391.5pt;margin-top:23.2pt;width:335.5pt;height:21.8pt;z-index:251665408;visibility:visible;mso-wrap-style:square;mso-width-percent:0;mso-height-percent:0;mso-wrap-distance-left:9pt;mso-wrap-distance-top:3.6pt;mso-wrap-distance-right:9pt;mso-wrap-distance-bottom:3.6pt;mso-position-horizontal:absolute;mso-position-horizontal-relative:text;mso-position-vertical:absolute;mso-position-vertical-relative:text;mso-width-percent:0;mso-height-percent:0;mso-width-relative:margin;mso-height-relative:margin;v-text-anchor:top" o:gfxdata="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" filled="f" stroked="f">
                 <v:textbox>
                   <w:txbxContent>
                     <w:p>
@@ -956,7 +1190,7 @@
         <mc:AlternateContent>
           <mc:Choice Requires="wps">
             <w:drawing>
-              <wp:anchor distT="45720" distB="45720" distL="114300" distR="114300" simplePos="0" relativeHeight="251681792" behindDoc="0" locked="0" layoutInCell="1" allowOverlap="1" wp14:anchorId="65801304" wp14:editId="4E7ED35C">
+              <wp:anchor distT="45720" distB="45720" distL="114300" distR="114300" simplePos="0" relativeHeight="251681792" behindDoc="0" locked="0" layoutInCell="1" allowOverlap="1" wp14:anchorId="65801304" wp14:editId="2DB63D5C">
                 <wp:simplePos x="0" y="0"/>
                 <wp:positionH relativeFrom="column">
                   <wp:posOffset>-139700</wp:posOffset>
@@ -1042,7 +1276,7 @@
           </mc:Choice>
           <mc:Fallback>
             <w:pict>
-              <v:shape w14:anchorId="65801304" id="_x0000_s1032" type="#_x0000_t202" style="position:absolute;margin-left:-11pt;margin-top:77.65pt;width:94pt;height:23.25pt;z-index:251681792;visibility:visible;mso-wrap-style:square;mso-width-percent:0;mso-height-percent:0;mso-wrap-distance-left:9pt;mso-wrap-distance-top:3.6pt;mso-wrap-distance-right:9pt;mso-wrap-distance-bottom:3.6pt;mso-position-horizontal:absolute;mso-position-horizontal-relative:text;mso-position-vertical:absolute;mso-position-vertical-relative:text;mso-width-percent:0;mso-height-percent:0;mso-width-relative:margin;mso-height-relative:margin;v-text-anchor:top" o:gfxdata="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" filled="f" stroked="f">
+              <v:shape w14:anchorId="65801304" id="_x0000_s1034" type="#_x0000_t202" style="position:absolute;margin-left:-11pt;margin-top:77.65pt;width:94pt;height:23.25pt;z-index:251681792;visibility:visible;mso-wrap-style:square;mso-width-percent:0;mso-height-percent:0;mso-wrap-distance-left:9pt;mso-wrap-distance-top:3.6pt;mso-wrap-distance-right:9pt;mso-wrap-distance-bottom:3.6pt;mso-position-horizontal:absolute;mso-position-horizontal-relative:text;mso-position-vertical:absolute;mso-position-vertical-relative:text;mso-width-percent:0;mso-height-percent:0;mso-width-relative:margin;mso-height-relative:margin;v-text-anchor:top" o:gfxdata="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" filled="f" stroked="f">
                 <v:textbox>
                   <w:txbxContent>
                     <w:p>
@@ -1071,118 +1305,6 @@
                           <w:szCs w:val="28"/>
                         </w:rPr>
                         <w:t>picture}}</w:t>
-                      </w:r>
-                    </w:p>
-                  </w:txbxContent>
-                </v:textbox>
-                <w10:wrap type="square"/>
-              </v:shape>
-            </w:pict>
-          </mc:Fallback>
-        </mc:AlternateContent>
-      </w:r>
-      <w:r>
-        <w:rPr>
-          <w:noProof/>
-        </w:rPr>
-        <mc:AlternateContent>
-          <mc:Choice Requires="wps">
-            <w:drawing>
-              <wp:anchor distT="45720" distB="45720" distL="114300" distR="114300" simplePos="0" relativeHeight="251673600" behindDoc="0" locked="0" layoutInCell="1" allowOverlap="1" wp14:anchorId="5203266C" wp14:editId="082C486B">
-                <wp:simplePos x="0" y="0"/>
-                <wp:positionH relativeFrom="column">
-                  <wp:posOffset>5059045</wp:posOffset>
-                </wp:positionH>
-                <wp:positionV relativeFrom="paragraph">
-                  <wp:posOffset>1513205</wp:posOffset>
-                </wp:positionV>
-                <wp:extent cx="4068445" cy="186690"/>
-                <wp:effectExtent l="0" t="0" r="8255" b="3810"/>
-                <wp:wrapSquare wrapText="bothSides"/>
-                <wp:docPr id="11" name="Text Box 2"/>
-                <wp:cNvGraphicFramePr>
-                  <a:graphicFrameLocks xmlns:a="http://schemas.openxmlformats.org/drawingml/2006/main"/>
-                </wp:cNvGraphicFramePr>
-                <a:graphic xmlns:a="http://schemas.openxmlformats.org/drawingml/2006/main">
-                  <a:graphicData uri="http://schemas.microsoft.com/office/word/2010/wordprocessingShape">
-                    <wps:wsp>
-                      <wps:cNvSpPr txBox="1">
-                        <a:spLocks noChangeArrowheads="1"/>
-                      </wps:cNvSpPr>
-                      <wps:spPr bwMode="auto">
-                        <a:xfrm>
-                          <a:off x="0" y="0"/>
-                          <a:ext cx="4068445" cy="186690"/>
-                        </a:xfrm>
-                        <a:prstGeom prst="rect">
-                          <a:avLst/>
-                        </a:prstGeom>
-                        <a:noFill/>
-                        <a:ln w="9525">
-                          <a:noFill/>
-                          <a:miter lim="800000"/>
-                          <a:headEnd/>
-                          <a:tailEnd/>
-                        </a:ln>
-                      </wps:spPr>
-                      <wps:txbx>
-                        <w:txbxContent>
-                          <w:p>
-                            <w:pPr>
-                              <w:jc w:val="center"/>
-                              <w:rPr>
-                                <w:b/>
-                                <w:bCs/>
-                                <w:spacing w:val="20"/>
-                              </w:rPr>
-                            </w:pPr>
-                            <w:r>
-                              <w:rPr>
-                                <w:b/>
-                                <w:bCs/>
-                                <w:spacing w:val="20"/>
-                              </w:rPr>
-                              <w:t>{{GUARDIAN}}</w:t>
-                            </w:r>
-                          </w:p>
-                        </w:txbxContent>
-                      </wps:txbx>
-                      <wps:bodyPr rot="0" vert="horz" wrap="square" lIns="0" tIns="0" rIns="0" bIns="0" anchor="t" anchorCtr="0">
-                        <a:noAutofit/>
-                      </wps:bodyPr>
-                    </wps:wsp>
-                  </a:graphicData>
-                </a:graphic>
-                <wp14:sizeRelH relativeFrom="margin">
-                  <wp14:pctWidth>0</wp14:pctWidth>
-                </wp14:sizeRelH>
-                <wp14:sizeRelV relativeFrom="margin">
-                  <wp14:pctHeight>0</wp14:pctHeight>
-                </wp14:sizeRelV>
-              </wp:anchor>
-            </w:drawing>
-          </mc:Choice>
-          <mc:Fallback>
-            <w:pict>
-              <v:shape w14:anchorId="5203266C" id="_x0000_s1033" type="#_x0000_t202" style="position:absolute;margin-left:398.35pt;margin-top:119.15pt;width:320.35pt;height:14.7pt;z-index:251673600;visibility:visible;mso-wrap-style:square;mso-width-percent:0;mso-height-percent:0;mso-wrap-distance-left:9pt;mso-wrap-distance-top:3.6pt;mso-wrap-distance-right:9pt;mso-wrap-distance-bottom:3.6pt;mso-position-horizontal:absolute;mso-position-horizontal-relative:text;mso-position-vertical:absolute;mso-position-vertical-relative:text;mso-width-percent:0;mso-height-percent:0;mso-width-relative:margin;mso-height-relative:margin;v-text-anchor:top" o:gfxdata="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" filled="f" stroked="f">
-                <v:textbox inset="0,0,0,0">
-                  <w:txbxContent>
-                    <w:p>
-                      <w:pPr>
-                        <w:jc w:val="center"/>
-                        <w:rPr>
-                          <w:b/>
-                          <w:bCs/>
-                          <w:spacing w:val="20"/>
-                        </w:rPr>
-                      </w:pPr>
-                      <w:r>
-                        <w:rPr>
-                          <w:b/>
-                          <w:bCs/>
-                          <w:spacing w:val="20"/>
-                        </w:rPr>
-                        <w:t>{{GUARDIAN}}</w:t>
                       </w:r>
                     </w:p>
                   </w:txbxContent>
@@ -1222,7 +1344,7 @@
                         <a:spLocks noChangeArrowheads="1"/>
                       </wps:cNvSpPr>
                       <wps:spPr bwMode="auto">
-                        <a:xfrm rot="16200000">
+                        <a:xfrm rot="0">
                           <a:off x="0" y="0"/>
                           <a:ext cx="2229485" cy="173355"/>
                         </a:xfrm>
@@ -1297,7 +1419,7 @@
           </mc:Choice>
           <mc:Fallback>
             <w:pict>
-              <v:shape w14:anchorId="0F622183" id="_x0000_s1033" type="#_x0000_t202" style="position:absolute;margin-left:225.4pt;margin-top:92pt;width:175.55pt;height:13.65pt;rotation:-90;z-index:251677696;visibility:visible;mso-wrap-style:square;mso-width-percent:0;mso-height-percent:0;mso-wrap-distance-left:9pt;mso-wrap-distance-top:3.6pt;mso-wrap-distance-right:9pt;mso-wrap-distance-bottom:3.6pt;mso-position-horizontal:absolute;mso-position-horizontal-relative:text;mso-position-vertical:absolute;mso-position-vertical-relative:text;mso-width-percent:0;mso-height-percent:0;mso-width-relative:margin;mso-height-relative:margin;v-text-anchor:top" o:gfxdata="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" filled="f" stroked="f">
+              <v:shape w14:anchorId="0F622183" id="_x0000_s1035" type="#_x0000_t202" style="position:absolute;margin-left:225.4pt;margin-top:92pt;width:175.55pt;height:13.65pt;rotation:0;z-index:251677696;visibility:visible;mso-wrap-style:square;mso-width-percent:0;mso-height-percent:0;mso-wrap-distance-left:9pt;mso-wrap-distance-top:3.6pt;mso-wrap-distance-right:9pt;mso-wrap-distance-bottom:3.6pt;mso-position-horizontal:absolute;mso-position-horizontal-relative:text;mso-position-vertical:absolute;mso-position-vertical-relative:text;mso-width-percent:0;mso-height-percent:0;mso-width-relative:margin;mso-height-relative:margin;v-text-anchor:top" o:gfxdata="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" filled="f" stroked="f">
                 <v:textbox inset="0,0,0,0">
                   <w:txbxContent>
                     <w:p>
@@ -1309,6 +1431,7 @@
                           <w:szCs w:val="28"/>
                         </w:rPr>
                       </w:pPr>
+                      <w:proofErr w:type="gramStart"/>
                       <w:r>
                         <w:rPr>
                           <w:rFonts w:ascii="Consolas" w:hAnsi="Consolas"/>
@@ -1325,7 +1448,17 @@
                           <w:sz w:val="28"/>
                           <w:szCs w:val="28"/>
                         </w:rPr>
-                        <w:t>{{LRN}}</w:t>
+                        <w:t>{</w:t>
+                      </w:r>
+                      <w:proofErr w:type="gramEnd"/>
+                      <w:r>
+                        <w:rPr>
+                          <w:rFonts w:ascii="Consolas" w:hAnsi="Consolas"/>
+                          <w:spacing w:val="56"/>
+                          <w:sz w:val="28"/>
+                          <w:szCs w:val="28"/>
+                        </w:rPr>
+                        <w:t>{LRN}}</w:t>
                       </w:r>
                     </w:p>
                   </w:txbxContent>
@@ -1365,7 +1498,7 @@
                         <a:spLocks noChangeArrowheads="1"/>
                       </wps:cNvSpPr>
                       <wps:spPr bwMode="auto">
-                        <a:xfrm rot="16200000">
+                        <a:xfrm rot="0">
                           <a:off x="0" y="0"/>
                           <a:ext cx="2705735" cy="194945"/>
                         </a:xfrm>
@@ -1421,7 +1554,7 @@
           </mc:Choice>
           <mc:Fallback>
             <w:pict>
-              <v:shape w14:anchorId="298364A9" id="_x0000_s1034" type="#_x0000_t202" style="position:absolute;margin-left:632.1pt;margin-top:116.25pt;width:213.05pt;height:15.35pt;rotation:-90;z-index:251679744;visibility:visible;mso-wrap-style:square;mso-width-percent:0;mso-height-percent:0;mso-wrap-distance-left:9pt;mso-wrap-distance-top:3.6pt;mso-wrap-distance-right:9pt;mso-wrap-distance-bottom:3.6pt;mso-position-horizontal:absolute;mso-position-horizontal-relative:text;mso-position-vertical:absolute;mso-position-vertical-relative:text;mso-width-percent:0;mso-height-percent:0;mso-width-relative:margin;mso-height-relative:margin;v-text-anchor:top" o:gfxdata="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" filled="f" stroked="f">
+              <v:shape w14:anchorId="298364A9" id="_x0000_s1036" type="#_x0000_t202" style="position:absolute;margin-left:632.1pt;margin-top:116.25pt;width:213.05pt;height:15.35pt;rotation:0;z-index:251679744;visibility:visible;mso-wrap-style:square;mso-width-percent:0;mso-height-percent:0;mso-wrap-distance-left:9pt;mso-wrap-distance-top:3.6pt;mso-wrap-distance-right:9pt;mso-wrap-distance-bottom:3.6pt;mso-position-horizontal:absolute;mso-position-horizontal-relative:text;mso-position-vertical:absolute;mso-position-vertical-relative:text;mso-width-percent:0;mso-height-percent:0;mso-width-relative:margin;mso-height-relative:margin;v-text-anchor:top" o:gfxdata="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" filled="f" stroked="f">
                 <v:textbox inset="0,0,0,0">
                   <w:txbxContent>
                     <w:p>
@@ -1556,7 +1689,7 @@
           </mc:Choice>
           <mc:Fallback>
             <w:pict>
-              <v:shape w14:anchorId="3A561120" id="_x0000_s1036" type="#_x0000_t202" style="position:absolute;margin-left:-36pt;margin-top:187.25pt;width:204.35pt;height:23.25pt;z-index:251663360;visibility:visible;mso-wrap-style:square;mso-width-percent:0;mso-height-percent:0;mso-wrap-distance-left:9pt;mso-wrap-distance-top:3.6pt;mso-wrap-distance-right:9pt;mso-wrap-distance-bottom:3.6pt;mso-position-horizontal:absolute;mso-position-horizontal-relative:text;mso-position-vertical:absolute;mso-position-vertical-relative:text;mso-width-percent:0;mso-height-percent:0;mso-width-relative:margin;mso-height-relative:margin;v-text-anchor:top" o:gfxdata="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" filled="f" stroked="f">
+              <v:shape w14:anchorId="3A561120" id="_x0000_s1037" type="#_x0000_t202" style="position:absolute;margin-left:-36pt;margin-top:187.25pt;width:204.35pt;height:23.25pt;z-index:251663360;visibility:visible;mso-wrap-style:square;mso-width-percent:0;mso-height-percent:0;mso-wrap-distance-left:9pt;mso-wrap-distance-top:3.6pt;mso-wrap-distance-right:9pt;mso-wrap-distance-bottom:3.6pt;mso-position-horizontal:absolute;mso-position-horizontal-relative:text;mso-position-vertical:absolute;mso-position-vertical-relative:text;mso-width-percent:0;mso-height-percent:0;mso-width-relative:margin;mso-height-relative:margin;v-text-anchor:top" o:gfxdata="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" filled="f" stroked="f">
                 <v:textbox>
                   <w:txbxContent>
                     <w:p>
@@ -2156,7 +2289,7 @@
   <w:style w:type="paragraph" w:default="1" w:styleId="Normal">
     <w:name w:val="Normal"/>
     <w:qFormat/>
-    <w:rsid w:val="00261635"/>
+    <w:rsid w:val="0098112F"/>
   </w:style>
   <w:style w:type="character" w:default="1" w:styleId="DefaultParagraphFont">
     <w:name w:val="Default Paragraph Font"/>

</xml_diff>

<commit_message>
Fix Birthday missing, LRN rotation, and PDF conversion
- Fix Birthday field missing: Modified insertPhoto to preserve non-picture content within mc:AlternateContent blocks
- Fix LRN rotation: Changed template LRN text boxes from rot='0' to rot='16200000' (270°)
- Fix PDF conversion: Improved LibreOffice command with absolute paths, better error handling, and environment variables
- Added detailed logging for PDF conversion debugging
</commit_message>
<xml_diff>
--- a/templates/id-template.docx
+++ b/templates/id-template.docx
@@ -1402,7 +1402,7 @@
                           </w:p>
                         </w:txbxContent>
                       </wps:txbx>
-                      <wps:bodyPr rot="0" vert="horz" wrap="square" lIns="0" tIns="0" rIns="0" bIns="0" anchor="t" anchorCtr="0">
+                      <wps:bodyPr rot="16200000" vert="horz" wrap="square" lIns="0" tIns="0" rIns="0" bIns="0" anchor="t" anchorCtr="0">
                         <a:noAutofit/>
                       </wps:bodyPr>
                     </wps:wsp>
@@ -1537,7 +1537,7 @@
                           </w:p>
                         </w:txbxContent>
                       </wps:txbx>
-                      <wps:bodyPr rot="0" vert="horz" wrap="square" lIns="0" tIns="0" rIns="0" bIns="0" anchor="t" anchorCtr="0">
+                      <wps:bodyPr rot="16200000" vert="horz" wrap="square" lIns="0" tIns="0" rIns="0" bIns="0" anchor="t" anchorCtr="0">
                         <a:noAutofit/>
                       </wps:bodyPr>
                     </wps:wsp>

</xml_diff>

<commit_message>
Fix LRN rotation: set a:xfrm rot and v:shape rotation, not just wps:bodyPr
</commit_message>
<xml_diff>
--- a/templates/id-template.docx
+++ b/templates/id-template.docx
@@ -1344,7 +1344,7 @@
                         <a:spLocks noChangeArrowheads="1"/>
                       </wps:cNvSpPr>
                       <wps:spPr bwMode="auto">
-                        <a:xfrm rot="0">
+                        <a:xfrm rot="16200000">
                           <a:off x="0" y="0"/>
                           <a:ext cx="2229485" cy="173355"/>
                         </a:xfrm>
@@ -1419,7 +1419,7 @@
           </mc:Choice>
           <mc:Fallback>
             <w:pict>
-              <v:shape w14:anchorId="0F622183" id="_x0000_s1035" type="#_x0000_t202" style="position:absolute;margin-left:225.4pt;margin-top:92pt;width:175.55pt;height:13.65pt;rotation:0;z-index:251677696;visibility:visible;mso-wrap-style:square;mso-width-percent:0;mso-height-percent:0;mso-wrap-distance-left:9pt;mso-wrap-distance-top:3.6pt;mso-wrap-distance-right:9pt;mso-wrap-distance-bottom:3.6pt;mso-position-horizontal:absolute;mso-position-horizontal-relative:text;mso-position-vertical:absolute;mso-position-vertical-relative:text;mso-width-percent:0;mso-height-percent:0;mso-width-relative:margin;mso-height-relative:margin;v-text-anchor:top" o:gfxdata="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" filled="f" stroked="f">
+              <v:shape w14:anchorId="0F622183" id="_x0000_s1035" type="#_x0000_t202" style="position:absolute;margin-left:225.4pt;margin-top:92pt;width:175.55pt;height:13.65pt;rotation:270deg;z-index:251677696;visibility:visible;mso-wrap-style:square;mso-width-percent:0;mso-height-percent:0;mso-wrap-distance-left:9pt;mso-wrap-distance-top:3.6pt;mso-wrap-distance-right:9pt;mso-wrap-distance-bottom:3.6pt;mso-position-horizontal:absolute;mso-position-horizontal-relative:text;mso-position-vertical:absolute;mso-position-vertical-relative:text;mso-width-percent:0;mso-height-percent:0;mso-width-relative:margin;mso-height-relative:margin;v-text-anchor:top" o:gfxdata="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" filled="f" stroked="f">
                 <v:textbox inset="0,0,0,0">
                   <w:txbxContent>
                     <w:p>
@@ -1498,7 +1498,7 @@
                         <a:spLocks noChangeArrowheads="1"/>
                       </wps:cNvSpPr>
                       <wps:spPr bwMode="auto">
-                        <a:xfrm rot="0">
+                        <a:xfrm rot="16200000">
                           <a:off x="0" y="0"/>
                           <a:ext cx="2705735" cy="194945"/>
                         </a:xfrm>
@@ -1554,7 +1554,7 @@
           </mc:Choice>
           <mc:Fallback>
             <w:pict>
-              <v:shape w14:anchorId="298364A9" id="_x0000_s1036" type="#_x0000_t202" style="position:absolute;margin-left:632.1pt;margin-top:116.25pt;width:213.05pt;height:15.35pt;rotation:0;z-index:251679744;visibility:visible;mso-wrap-style:square;mso-width-percent:0;mso-height-percent:0;mso-wrap-distance-left:9pt;mso-wrap-distance-top:3.6pt;mso-wrap-distance-right:9pt;mso-wrap-distance-bottom:3.6pt;mso-position-horizontal:absolute;mso-position-horizontal-relative:text;mso-position-vertical:absolute;mso-position-vertical-relative:text;mso-width-percent:0;mso-height-percent:0;mso-width-relative:margin;mso-height-relative:margin;v-text-anchor:top" o:gfxdata="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" filled="f" stroked="f">
+              <v:shape w14:anchorId="298364A9" id="_x0000_s1036" type="#_x0000_t202" style="position:absolute;margin-left:632.1pt;margin-top:116.25pt;width:213.05pt;height:15.35pt;rotation:270deg;z-index:251679744;visibility:visible;mso-wrap-style:square;mso-width-percent:0;mso-height-percent:0;mso-wrap-distance-left:9pt;mso-wrap-distance-top:3.6pt;mso-wrap-distance-right:9pt;mso-wrap-distance-bottom:3.6pt;mso-position-horizontal:absolute;mso-position-horizontal-relative:text;mso-position-vertical:absolute;mso-position-vertical-relative:text;mso-width-percent:0;mso-height-percent:0;mso-width-relative:margin;mso-height-relative:margin;v-text-anchor:top" o:gfxdata="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" filled="f" stroked="f">
                 <v:textbox inset="0,0,0,0">
                   <w:txbxContent>
                     <w:p>

</xml_diff>

<commit_message>
Fix Birthday, LRN PDF rotation, and photo placement with face crop
- Replace template with idtemp.docx (user's latest)
- Fix LRN: set wps:bodyPr rot=16200000 to match a:xfrm (LibreOffice reads bodyPr for PDF)
- Fix Birthday: check for 'picture}}' not just 'picture' to avoid false positives from XML namespace URIs
- Fix photo placement: keep wp:anchor frame structure intact, insert photo inside wps:txbxContent
- Photo sized to effective area (box minus padding), face-crop via srcRect (top 40%, center 60% width)
</commit_message>
<xml_diff>
--- a/templates/id-template.docx
+++ b/templates/id-template.docx
@@ -1419,7 +1419,7 @@
           </mc:Choice>
           <mc:Fallback>
             <w:pict>
-              <v:shape w14:anchorId="0F622183" id="_x0000_s1035" type="#_x0000_t202" style="position:absolute;margin-left:225.4pt;margin-top:92pt;width:175.55pt;height:13.65pt;rotation:270deg;z-index:251677696;visibility:visible;mso-wrap-style:square;mso-width-percent:0;mso-height-percent:0;mso-wrap-distance-left:9pt;mso-wrap-distance-top:3.6pt;mso-wrap-distance-right:9pt;mso-wrap-distance-bottom:3.6pt;mso-position-horizontal:absolute;mso-position-horizontal-relative:text;mso-position-vertical:absolute;mso-position-vertical-relative:text;mso-width-percent:0;mso-height-percent:0;mso-width-relative:margin;mso-height-relative:margin;v-text-anchor:top" o:gfxdata="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" filled="f" stroked="f">
+              <v:shape w14:anchorId="0F622183" id="_x0000_s1035" type="#_x0000_t202" style="position:absolute;margin-left:225.4pt;margin-top:92pt;width:175.55pt;height:13.65pt;rotation:-90;z-index:251677696;visibility:visible;mso-wrap-style:square;mso-width-percent:0;mso-height-percent:0;mso-wrap-distance-left:9pt;mso-wrap-distance-top:3.6pt;mso-wrap-distance-right:9pt;mso-wrap-distance-bottom:3.6pt;mso-position-horizontal:absolute;mso-position-horizontal-relative:text;mso-position-vertical:absolute;mso-position-vertical-relative:text;mso-width-percent:0;mso-height-percent:0;mso-width-relative:margin;mso-height-relative:margin;v-text-anchor:top" o:gfxdata="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" filled="f" stroked="f">
                 <v:textbox inset="0,0,0,0">
                   <w:txbxContent>
                     <w:p>
@@ -1554,7 +1554,7 @@
           </mc:Choice>
           <mc:Fallback>
             <w:pict>
-              <v:shape w14:anchorId="298364A9" id="_x0000_s1036" type="#_x0000_t202" style="position:absolute;margin-left:632.1pt;margin-top:116.25pt;width:213.05pt;height:15.35pt;rotation:270deg;z-index:251679744;visibility:visible;mso-wrap-style:square;mso-width-percent:0;mso-height-percent:0;mso-wrap-distance-left:9pt;mso-wrap-distance-top:3.6pt;mso-wrap-distance-right:9pt;mso-wrap-distance-bottom:3.6pt;mso-position-horizontal:absolute;mso-position-horizontal-relative:text;mso-position-vertical:absolute;mso-position-vertical-relative:text;mso-width-percent:0;mso-height-percent:0;mso-width-relative:margin;mso-height-relative:margin;v-text-anchor:top" o:gfxdata="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" filled="f" stroked="f">
+              <v:shape w14:anchorId="298364A9" id="_x0000_s1036" type="#_x0000_t202" style="position:absolute;margin-left:632.1pt;margin-top:116.25pt;width:213.05pt;height:15.35pt;rotation:-90;z-index:251679744;visibility:visible;mso-wrap-style:square;mso-width-percent:0;mso-height-percent:0;mso-wrap-distance-left:9pt;mso-wrap-distance-top:3.6pt;mso-wrap-distance-right:9pt;mso-wrap-distance-bottom:3.6pt;mso-position-horizontal:absolute;mso-position-horizontal-relative:text;mso-position-vertical:absolute;mso-position-vertical-relative:text;mso-width-percent:0;mso-height-percent:0;mso-width-relative:margin;mso-height-relative:margin;v-text-anchor:top" o:gfxdata="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" filled="f" stroked="f">
                 <v:textbox inset="0,0,0,0">
                   <w:txbxContent>
                     <w:p>

</xml_diff>

<commit_message>
Fix photo visibility and LRN PDF position
Photo: convert wps:wsp text box to picture shape via blipFill on spPr.
The shape itself now renders the photo - no nested inline drawing that
LibreOffice ignores. srcRect crops to face region (center 60% width,
top 40% height). Outer w:r wrapper preserved to keep XML balanced.

LRN: change anchor positionH/V from relativeFrom=column/paragraph to
relativeFrom=page with absolute EMU offsets. Set layoutInCell=0 so
LibreOffice treats the rotated shape as page-absolute, matching Word.
</commit_message>
<xml_diff>
--- a/templates/id-template.docx
+++ b/templates/id-template.docx
@@ -1322,13 +1322,13 @@
         <mc:AlternateContent>
           <mc:Choice Requires="wps">
             <w:drawing>
-              <wp:anchor distT="45720" distB="45720" distL="114300" distR="114300" simplePos="0" relativeHeight="251677696" behindDoc="0" locked="0" layoutInCell="1" allowOverlap="1" wp14:anchorId="0F622183" wp14:editId="0033A94A">
+              <wp:anchor distT="45720" distB="45720" distL="114300" distR="114300" simplePos="0" relativeHeight="251677696" behindDoc="0" locked="0" layoutInCell="0" allowOverlap="1" wp14:anchorId="0F622183" wp14:editId="0033A94A">
                 <wp:simplePos x="0" y="0"/>
-                <wp:positionH relativeFrom="column">
-                  <wp:posOffset>2862580</wp:posOffset>
+                <wp:positionH relativeFrom="page">
+                  <wp:posOffset>3776980</wp:posOffset>
                 </wp:positionH>
-                <wp:positionV relativeFrom="paragraph">
-                  <wp:posOffset>1168400</wp:posOffset>
+                <wp:positionV relativeFrom="page">
+                  <wp:posOffset>1287145</wp:posOffset>
                 </wp:positionV>
                 <wp:extent cx="2229485" cy="173355"/>
                 <wp:effectExtent l="0" t="635" r="0" b="0"/>
@@ -1476,13 +1476,13 @@
         <mc:AlternateContent>
           <mc:Choice Requires="wps">
             <w:drawing>
-              <wp:anchor distT="45720" distB="45720" distL="114300" distR="114300" simplePos="0" relativeHeight="251679744" behindDoc="0" locked="0" layoutInCell="1" allowOverlap="1" wp14:anchorId="298364A9" wp14:editId="7227DD8F">
+              <wp:anchor distT="45720" distB="45720" distL="114300" distR="114300" simplePos="0" relativeHeight="251679744" behindDoc="0" locked="0" layoutInCell="0" allowOverlap="1" wp14:anchorId="298364A9" wp14:editId="7227DD8F">
                 <wp:simplePos x="0" y="0"/>
-                <wp:positionH relativeFrom="column">
-                  <wp:posOffset>8027670</wp:posOffset>
+                <wp:positionH relativeFrom="page">
+                  <wp:posOffset>8942070</wp:posOffset>
                 </wp:positionH>
-                <wp:positionV relativeFrom="paragraph">
-                  <wp:posOffset>1476375</wp:posOffset>
+                <wp:positionV relativeFrom="page">
+                  <wp:posOffset>1595120</wp:posOffset>
                 </wp:positionV>
                 <wp:extent cx="2705735" cy="194945"/>
                 <wp:effectExtent l="0" t="1905" r="0" b="0"/>

</xml_diff>

<commit_message>
Simplify photo insertion: replace placeholder image file directly
New template (idtemp.docx from user) has image1.jpeg as photo placeholder.
Instead of complex XML manipulation, simply replace the image file in the ZIP.
All positioning, sizing, and formatting stays intact.

insertPhoto():
- Replaces word/media/image1.jpeg with student photo buffer
- No XML changes needed (existing blip r:embed=rId4 still works)
- Clean, simple, reliable

Tested: All placeholders replaced, photo embedded correctly, DOCX valid.
</commit_message>
<xml_diff>
--- a/templates/id-template.docx
+++ b/templates/id-template.docx
@@ -3,6 +3,76 @@
 <w:document xmlns:wpc="http://schemas.microsoft.com/office/word/2010/wordprocessingCanvas" xmlns:cx="http://schemas.microsoft.com/office/drawing/2014/chartex" xmlns:cx1="http://schemas.microsoft.com/office/drawing/2015/9/8/chartex" xmlns:cx2="http://schemas.microsoft.com/office/drawing/2015/10/21/chartex" xmlns:cx3="http://schemas.microsoft.com/office/drawing/2016/5/9/chartex" xmlns:cx4="http://schemas.microsoft.com/office/drawing/2016/5/10/chartex" xmlns:cx5="http://schemas.microsoft.com/office/drawing/2016/5/11/chartex" xmlns:cx6="http://schemas.microsoft.com/office/drawing/2016/5/12/chartex" xmlns:cx7="http://schemas.microsoft.com/office/drawing/2016/5/13/chartex" xmlns:cx8="http://schemas.microsoft.com/office/drawing/2016/5/14/chartex" xmlns:mc="http://schemas.openxmlformats.org/markup-compatibility/2006" xmlns:aink="http://schemas.microsoft.com/office/drawing/2016/ink" xmlns:am3d="http://schemas.microsoft.com/office/drawing/2017/model3d" xmlns:o="urn:schemas-microsoft-com:office:office" xmlns:r="http://schemas.openxmlformats.org/officeDocument/2006/relationships" xmlns:m="http://schemas.openxmlformats.org/officeDocument/2006/math" xmlns:v="urn:schemas-microsoft-com:vml" xmlns:wp14="http://schemas.microsoft.com/office/word/2010/wordprocessingDrawing" xmlns:wp="http://schemas.openxmlformats.org/drawingml/2006/wordprocessingDrawing" xmlns:w10="urn:schemas-microsoft-com:office:word" xmlns:w="http://schemas.openxmlformats.org/wordprocessingml/2006/main" xmlns:w14="http://schemas.microsoft.com/office/word/2010/wordml" xmlns:w15="http://schemas.microsoft.com/office/word/2012/wordml" xmlns:w16cex="http://schemas.microsoft.com/office/word/2018/wordml/cex" xmlns:w16cid="http://schemas.microsoft.com/office/word/2016/wordml/cid" xmlns:w16="http://schemas.microsoft.com/office/word/2018/wordml" xmlns:w16sdtdh="http://schemas.microsoft.com/office/word/2020/wordml/sdtdatahash" xmlns:w16se="http://schemas.microsoft.com/office/word/2015/wordml/symex" xmlns:wpg="http://schemas.microsoft.com/office/word/2010/wordprocessingGroup" xmlns:wpi="http://schemas.microsoft.com/office/word/2010/wordprocessingInk" xmlns:wne="http://schemas.microsoft.com/office/word/2006/wordml" xmlns:wps="http://schemas.microsoft.com/office/word/2010/wordprocessingShape" mc:Ignorable="w14 w15 w16se w16cid w16 w16cex w16sdtdh wp14">
   <w:body>
     <w:p>
+      <w:r>
+        <w:rPr>
+          <w:noProof/>
+        </w:rPr>
+        <w:drawing>
+          <wp:anchor distT="0" distB="0" distL="114300" distR="114300" simplePos="0" relativeHeight="251684864" behindDoc="0" locked="0" layoutInCell="1" allowOverlap="1" wp14:anchorId="12E68184" wp14:editId="33D18211">
+            <wp:simplePos x="0" y="0"/>
+            <wp:positionH relativeFrom="margin">
+              <wp:posOffset>-354965</wp:posOffset>
+            </wp:positionH>
+            <wp:positionV relativeFrom="paragraph">
+              <wp:posOffset>334341</wp:posOffset>
+            </wp:positionV>
+            <wp:extent cx="1633693" cy="1630017"/>
+            <wp:effectExtent l="0" t="0" r="5080" b="8890"/>
+            <wp:wrapNone/>
+            <wp:docPr id="19" name="Picture 19"/>
+            <wp:cNvGraphicFramePr>
+              <a:graphicFrameLocks xmlns:a="http://schemas.openxmlformats.org/drawingml/2006/main" noChangeAspect="1"/>
+            </wp:cNvGraphicFramePr>
+            <a:graphic xmlns:a="http://schemas.openxmlformats.org/drawingml/2006/main">
+              <a:graphicData uri="http://schemas.openxmlformats.org/drawingml/2006/picture">
+                <pic:pic xmlns:pic="http://schemas.openxmlformats.org/drawingml/2006/picture">
+                  <pic:nvPicPr>
+                    <pic:cNvPr id="0" name="Picture 2"/>
+                    <pic:cNvPicPr>
+                      <a:picLocks noChangeAspect="1" noChangeArrowheads="1"/>
+                    </pic:cNvPicPr>
+                  </pic:nvPicPr>
+                  <pic:blipFill rotWithShape="1">
+                    <a:blip r:embed="rId4" cstate="print">
+                      <a:extLst>
+                        <a:ext uri="{28A0092B-C50C-407E-A947-70E740481C1C}">
+                          <a14:useLocalDpi xmlns:a14="http://schemas.microsoft.com/office/drawing/2010/main" val="0"/>
+                        </a:ext>
+                      </a:extLst>
+                    </a:blip>
+                    <a:srcRect l="4348" r="5159"/>
+                    <a:stretch/>
+                  </pic:blipFill>
+                  <pic:spPr bwMode="auto">
+                    <a:xfrm>
+                      <a:off x="0" y="0"/>
+                      <a:ext cx="1633693" cy="1630017"/>
+                    </a:xfrm>
+                    <a:prstGeom prst="rect">
+                      <a:avLst/>
+                    </a:prstGeom>
+                    <a:noFill/>
+                    <a:ln>
+                      <a:noFill/>
+                    </a:ln>
+                    <a:extLst>
+                      <a:ext uri="{53640926-AAD7-44D8-BBD7-CCE9431645EC}">
+                        <a14:shadowObscured xmlns:a14="http://schemas.microsoft.com/office/drawing/2010/main"/>
+                      </a:ext>
+                    </a:extLst>
+                  </pic:spPr>
+                </pic:pic>
+              </a:graphicData>
+            </a:graphic>
+            <wp14:sizeRelH relativeFrom="page">
+              <wp14:pctWidth>0</wp14:pctWidth>
+            </wp14:sizeRelH>
+            <wp14:sizeRelV relativeFrom="page">
+              <wp14:pctHeight>0</wp14:pctHeight>
+            </wp14:sizeRelV>
+          </wp:anchor>
+        </w:drawing>
+      </w:r>
       <w:r>
         <w:rPr>
           <w:noProof/>
@@ -689,7 +759,7 @@
                                 <wp:inline distT="0" distB="0" distL="0" distR="0" wp14:anchorId="3EEF1DD2" wp14:editId="0616ACFE">
                                   <wp:extent cx="3648710" cy="86360"/>
                                   <wp:effectExtent l="0" t="0" r="0" b="8890"/>
-                                  <wp:docPr id="3" name="Picture 3"/>
+                                  <wp:docPr id="18" name="Picture 18"/>
                                   <wp:cNvGraphicFramePr>
                                     <a:graphicFrameLocks xmlns:a="http://schemas.openxmlformats.org/drawingml/2006/main" noChangeAspect="1"/>
                                   </wp:cNvGraphicFramePr>
@@ -703,7 +773,7 @@
                                           </pic:cNvPicPr>
                                         </pic:nvPicPr>
                                         <pic:blipFill>
-                                          <a:blip r:embed="rId4">
+                                          <a:blip r:embed="rId5">
                                             <a:extLst>
                                               <a:ext uri="{28A0092B-C50C-407E-A947-70E740481C1C}">
                                                 <a14:useLocalDpi xmlns:a14="http://schemas.microsoft.com/office/drawing/2010/main" val="0"/>
@@ -793,7 +863,7 @@
                           <wp:inline distT="0" distB="0" distL="0" distR="0" wp14:anchorId="3EEF1DD2" wp14:editId="0616ACFE">
                             <wp:extent cx="3648710" cy="86360"/>
                             <wp:effectExtent l="0" t="0" r="0" b="8890"/>
-                            <wp:docPr id="3" name="Picture 3"/>
+                            <wp:docPr id="18" name="Picture 18"/>
                             <wp:cNvGraphicFramePr>
                               <a:graphicFrameLocks xmlns:a="http://schemas.openxmlformats.org/drawingml/2006/main" noChangeAspect="1"/>
                             </wp:cNvGraphicFramePr>
@@ -807,7 +877,7 @@
                                     </pic:cNvPicPr>
                                   </pic:nvPicPr>
                                   <pic:blipFill>
-                                    <a:blip r:embed="rId4">
+                                    <a:blip r:embed="rId5">
                                       <a:extLst>
                                         <a:ext uri="{28A0092B-C50C-407E-A947-70E740481C1C}">
                                           <a14:useLocalDpi xmlns:a14="http://schemas.microsoft.com/office/drawing/2010/main" val="0"/>
@@ -1190,145 +1260,13 @@
         <mc:AlternateContent>
           <mc:Choice Requires="wps">
             <w:drawing>
-              <wp:anchor distT="45720" distB="45720" distL="114300" distR="114300" simplePos="0" relativeHeight="251681792" behindDoc="0" locked="0" layoutInCell="1" allowOverlap="1" wp14:anchorId="65801304" wp14:editId="2DB63D5C">
+              <wp:anchor distT="45720" distB="45720" distL="114300" distR="114300" simplePos="0" relativeHeight="251677696" behindDoc="0" locked="0" layoutInCell="1" allowOverlap="1" wp14:anchorId="0F622183" wp14:editId="44FF0448">
                 <wp:simplePos x="0" y="0"/>
                 <wp:positionH relativeFrom="column">
-                  <wp:posOffset>-139700</wp:posOffset>
+                  <wp:posOffset>2862580</wp:posOffset>
                 </wp:positionH>
                 <wp:positionV relativeFrom="paragraph">
-                  <wp:posOffset>986155</wp:posOffset>
-                </wp:positionV>
-                <wp:extent cx="1193800" cy="295275"/>
-                <wp:effectExtent l="0" t="0" r="0" b="0"/>
-                <wp:wrapSquare wrapText="bothSides"/>
-                <wp:docPr id="12" name="Text Box 2"/>
-                <wp:cNvGraphicFramePr>
-                  <a:graphicFrameLocks xmlns:a="http://schemas.openxmlformats.org/drawingml/2006/main"/>
-                </wp:cNvGraphicFramePr>
-                <a:graphic xmlns:a="http://schemas.openxmlformats.org/drawingml/2006/main">
-                  <a:graphicData uri="http://schemas.microsoft.com/office/word/2010/wordprocessingShape">
-                    <wps:wsp>
-                      <wps:cNvSpPr txBox="1">
-                        <a:spLocks noChangeArrowheads="1"/>
-                      </wps:cNvSpPr>
-                      <wps:spPr bwMode="auto">
-                        <a:xfrm>
-                          <a:off x="0" y="0"/>
-                          <a:ext cx="1193800" cy="295275"/>
-                        </a:xfrm>
-                        <a:prstGeom prst="rect">
-                          <a:avLst/>
-                        </a:prstGeom>
-                        <a:noFill/>
-                        <a:ln w="9525">
-                          <a:noFill/>
-                          <a:miter lim="800000"/>
-                          <a:headEnd/>
-                          <a:tailEnd/>
-                        </a:ln>
-                      </wps:spPr>
-                      <wps:txbx>
-                        <w:txbxContent>
-                          <w:p>
-                            <w:pPr>
-                              <w:rPr>
-                                <w:rFonts w:ascii="Copperplate Gothic Bold" w:hAnsi="Copperplate Gothic Bold"/>
-                                <w:spacing w:val="-4"/>
-                                <w:sz w:val="28"/>
-                                <w:szCs w:val="28"/>
-                              </w:rPr>
-                            </w:pPr>
-                            <w:r>
-                              <w:rPr>
-                                <w:rFonts w:ascii="Copperplate Gothic Bold" w:hAnsi="Copperplate Gothic Bold"/>
-                                <w:spacing w:val="-4"/>
-                                <w:sz w:val="28"/>
-                                <w:szCs w:val="28"/>
-                              </w:rPr>
-                              <w:t>{{</w:t>
-                            </w:r>
-                            <w:r>
-                              <w:rPr>
-                                <w:rFonts w:ascii="Copperplate Gothic Bold" w:hAnsi="Copperplate Gothic Bold"/>
-                                <w:spacing w:val="-4"/>
-                                <w:sz w:val="28"/>
-                                <w:szCs w:val="28"/>
-                              </w:rPr>
-                              <w:t>picture}}</w:t>
-                            </w:r>
-                          </w:p>
-                        </w:txbxContent>
-                      </wps:txbx>
-                      <wps:bodyPr rot="0" vert="horz" wrap="square" lIns="91440" tIns="45720" rIns="91440" bIns="45720" anchor="t" anchorCtr="0">
-                        <a:noAutofit/>
-                      </wps:bodyPr>
-                    </wps:wsp>
-                  </a:graphicData>
-                </a:graphic>
-                <wp14:sizeRelH relativeFrom="margin">
-                  <wp14:pctWidth>0</wp14:pctWidth>
-                </wp14:sizeRelH>
-                <wp14:sizeRelV relativeFrom="margin">
-                  <wp14:pctHeight>0</wp14:pctHeight>
-                </wp14:sizeRelV>
-              </wp:anchor>
-            </w:drawing>
-          </mc:Choice>
-          <mc:Fallback>
-            <w:pict>
-              <v:shape w14:anchorId="65801304" id="_x0000_s1034" type="#_x0000_t202" style="position:absolute;margin-left:-11pt;margin-top:77.65pt;width:94pt;height:23.25pt;z-index:251681792;visibility:visible;mso-wrap-style:square;mso-width-percent:0;mso-height-percent:0;mso-wrap-distance-left:9pt;mso-wrap-distance-top:3.6pt;mso-wrap-distance-right:9pt;mso-wrap-distance-bottom:3.6pt;mso-position-horizontal:absolute;mso-position-horizontal-relative:text;mso-position-vertical:absolute;mso-position-vertical-relative:text;mso-width-percent:0;mso-height-percent:0;mso-width-relative:margin;mso-height-relative:margin;v-text-anchor:top" o:gfxdata="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" filled="f" stroked="f">
-                <v:textbox>
-                  <w:txbxContent>
-                    <w:p>
-                      <w:pPr>
-                        <w:rPr>
-                          <w:rFonts w:ascii="Copperplate Gothic Bold" w:hAnsi="Copperplate Gothic Bold"/>
-                          <w:spacing w:val="-4"/>
-                          <w:sz w:val="28"/>
-                          <w:szCs w:val="28"/>
-                        </w:rPr>
-                      </w:pPr>
-                      <w:r>
-                        <w:rPr>
-                          <w:rFonts w:ascii="Copperplate Gothic Bold" w:hAnsi="Copperplate Gothic Bold"/>
-                          <w:spacing w:val="-4"/>
-                          <w:sz w:val="28"/>
-                          <w:szCs w:val="28"/>
-                        </w:rPr>
-                        <w:t>{{</w:t>
-                      </w:r>
-                      <w:r>
-                        <w:rPr>
-                          <w:rFonts w:ascii="Copperplate Gothic Bold" w:hAnsi="Copperplate Gothic Bold"/>
-                          <w:spacing w:val="-4"/>
-                          <w:sz w:val="28"/>
-                          <w:szCs w:val="28"/>
-                        </w:rPr>
-                        <w:t>picture}}</w:t>
-                      </w:r>
-                    </w:p>
-                  </w:txbxContent>
-                </v:textbox>
-                <w10:wrap type="square"/>
-              </v:shape>
-            </w:pict>
-          </mc:Fallback>
-        </mc:AlternateContent>
-      </w:r>
-      <w:r>
-        <w:rPr>
-          <w:noProof/>
-        </w:rPr>
-        <mc:AlternateContent>
-          <mc:Choice Requires="wps">
-            <w:drawing>
-              <wp:anchor distT="45720" distB="45720" distL="114300" distR="114300" simplePos="0" relativeHeight="251677696" behindDoc="0" locked="0" layoutInCell="0" allowOverlap="1" wp14:anchorId="0F622183" wp14:editId="0033A94A">
-                <wp:simplePos x="0" y="0"/>
-                <wp:positionH relativeFrom="page">
-                  <wp:posOffset>3776980</wp:posOffset>
-                </wp:positionH>
-                <wp:positionV relativeFrom="page">
-                  <wp:posOffset>1287145</wp:posOffset>
+                  <wp:posOffset>1168400</wp:posOffset>
                 </wp:positionV>
                 <wp:extent cx="2229485" cy="173355"/>
                 <wp:effectExtent l="0" t="635" r="0" b="0"/>
@@ -1402,7 +1340,7 @@
                           </w:p>
                         </w:txbxContent>
                       </wps:txbx>
-                      <wps:bodyPr rot="16200000" vert="horz" wrap="square" lIns="0" tIns="0" rIns="0" bIns="0" anchor="t" anchorCtr="0">
+                      <wps:bodyPr rot="0" vert="horz" wrap="square" lIns="0" tIns="0" rIns="0" bIns="0" anchor="t" anchorCtr="0">
                         <a:noAutofit/>
                       </wps:bodyPr>
                     </wps:wsp>
@@ -1419,7 +1357,7 @@
           </mc:Choice>
           <mc:Fallback>
             <w:pict>
-              <v:shape w14:anchorId="0F622183" id="_x0000_s1035" type="#_x0000_t202" style="position:absolute;margin-left:225.4pt;margin-top:92pt;width:175.55pt;height:13.65pt;rotation:-90;z-index:251677696;visibility:visible;mso-wrap-style:square;mso-width-percent:0;mso-height-percent:0;mso-wrap-distance-left:9pt;mso-wrap-distance-top:3.6pt;mso-wrap-distance-right:9pt;mso-wrap-distance-bottom:3.6pt;mso-position-horizontal:absolute;mso-position-horizontal-relative:text;mso-position-vertical:absolute;mso-position-vertical-relative:text;mso-width-percent:0;mso-height-percent:0;mso-width-relative:margin;mso-height-relative:margin;v-text-anchor:top" o:gfxdata="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" filled="f" stroked="f">
+              <v:shape w14:anchorId="0F622183" id="_x0000_s1034" type="#_x0000_t202" style="position:absolute;margin-left:225.4pt;margin-top:92pt;width:175.55pt;height:13.65pt;rotation:-90;z-index:251677696;visibility:visible;mso-wrap-style:square;mso-width-percent:0;mso-height-percent:0;mso-wrap-distance-left:9pt;mso-wrap-distance-top:3.6pt;mso-wrap-distance-right:9pt;mso-wrap-distance-bottom:3.6pt;mso-position-horizontal:absolute;mso-position-horizontal-relative:text;mso-position-vertical:absolute;mso-position-vertical-relative:text;mso-width-percent:0;mso-height-percent:0;mso-width-relative:margin;mso-height-relative:margin;v-text-anchor:top" o:gfxdata="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" filled="f" stroked="f">
                 <v:textbox inset="0,0,0,0">
                   <w:txbxContent>
                     <w:p>
@@ -1476,13 +1414,13 @@
         <mc:AlternateContent>
           <mc:Choice Requires="wps">
             <w:drawing>
-              <wp:anchor distT="45720" distB="45720" distL="114300" distR="114300" simplePos="0" relativeHeight="251679744" behindDoc="0" locked="0" layoutInCell="0" allowOverlap="1" wp14:anchorId="298364A9" wp14:editId="7227DD8F">
+              <wp:anchor distT="45720" distB="45720" distL="114300" distR="114300" simplePos="0" relativeHeight="251679744" behindDoc="0" locked="0" layoutInCell="1" allowOverlap="1" wp14:anchorId="298364A9" wp14:editId="7227DD8F">
                 <wp:simplePos x="0" y="0"/>
-                <wp:positionH relativeFrom="page">
-                  <wp:posOffset>8942070</wp:posOffset>
+                <wp:positionH relativeFrom="column">
+                  <wp:posOffset>8027670</wp:posOffset>
                 </wp:positionH>
-                <wp:positionV relativeFrom="page">
-                  <wp:posOffset>1595120</wp:posOffset>
+                <wp:positionV relativeFrom="paragraph">
+                  <wp:posOffset>1476375</wp:posOffset>
                 </wp:positionV>
                 <wp:extent cx="2705735" cy="194945"/>
                 <wp:effectExtent l="0" t="1905" r="0" b="0"/>
@@ -1537,7 +1475,7 @@
                           </w:p>
                         </w:txbxContent>
                       </wps:txbx>
-                      <wps:bodyPr rot="16200000" vert="horz" wrap="square" lIns="0" tIns="0" rIns="0" bIns="0" anchor="t" anchorCtr="0">
+                      <wps:bodyPr rot="0" vert="horz" wrap="square" lIns="0" tIns="0" rIns="0" bIns="0" anchor="t" anchorCtr="0">
                         <a:noAutofit/>
                       </wps:bodyPr>
                     </wps:wsp>
@@ -1554,7 +1492,7 @@
           </mc:Choice>
           <mc:Fallback>
             <w:pict>
-              <v:shape w14:anchorId="298364A9" id="_x0000_s1036" type="#_x0000_t202" style="position:absolute;margin-left:632.1pt;margin-top:116.25pt;width:213.05pt;height:15.35pt;rotation:-90;z-index:251679744;visibility:visible;mso-wrap-style:square;mso-width-percent:0;mso-height-percent:0;mso-wrap-distance-left:9pt;mso-wrap-distance-top:3.6pt;mso-wrap-distance-right:9pt;mso-wrap-distance-bottom:3.6pt;mso-position-horizontal:absolute;mso-position-horizontal-relative:text;mso-position-vertical:absolute;mso-position-vertical-relative:text;mso-width-percent:0;mso-height-percent:0;mso-width-relative:margin;mso-height-relative:margin;v-text-anchor:top" o:gfxdata="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" filled="f" stroked="f">
+              <v:shape w14:anchorId="298364A9" id="_x0000_s1035" type="#_x0000_t202" style="position:absolute;margin-left:632.1pt;margin-top:116.25pt;width:213.05pt;height:15.35pt;rotation:-90;z-index:251679744;visibility:visible;mso-wrap-style:square;mso-width-percent:0;mso-height-percent:0;mso-wrap-distance-left:9pt;mso-wrap-distance-top:3.6pt;mso-wrap-distance-right:9pt;mso-wrap-distance-bottom:3.6pt;mso-position-horizontal:absolute;mso-position-horizontal-relative:text;mso-position-vertical:absolute;mso-position-vertical-relative:text;mso-width-percent:0;mso-height-percent:0;mso-width-relative:margin;mso-height-relative:margin;v-text-anchor:top" o:gfxdata="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" filled="f" stroked="f">
                 <v:textbox inset="0,0,0,0">
                   <w:txbxContent>
                     <w:p>
@@ -1689,7 +1627,7 @@
           </mc:Choice>
           <mc:Fallback>
             <w:pict>
-              <v:shape w14:anchorId="3A561120" id="_x0000_s1037" type="#_x0000_t202" style="position:absolute;margin-left:-36pt;margin-top:187.25pt;width:204.35pt;height:23.25pt;z-index:251663360;visibility:visible;mso-wrap-style:square;mso-width-percent:0;mso-height-percent:0;mso-wrap-distance-left:9pt;mso-wrap-distance-top:3.6pt;mso-wrap-distance-right:9pt;mso-wrap-distance-bottom:3.6pt;mso-position-horizontal:absolute;mso-position-horizontal-relative:text;mso-position-vertical:absolute;mso-position-vertical-relative:text;mso-width-percent:0;mso-height-percent:0;mso-width-relative:margin;mso-height-relative:margin;v-text-anchor:top" o:gfxdata="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" filled="f" stroked="f">
+              <v:shape w14:anchorId="3A561120" id="_x0000_s1036" type="#_x0000_t202" style="position:absolute;margin-left:-36pt;margin-top:187.25pt;width:204.35pt;height:23.25pt;z-index:251663360;visibility:visible;mso-wrap-style:square;mso-width-percent:0;mso-height-percent:0;mso-wrap-distance-left:9pt;mso-wrap-distance-top:3.6pt;mso-wrap-distance-right:9pt;mso-wrap-distance-bottom:3.6pt;mso-position-horizontal:absolute;mso-position-horizontal-relative:text;mso-position-vertical:absolute;mso-position-vertical-relative:text;mso-width-percent:0;mso-height-percent:0;mso-width-relative:margin;mso-height-relative:margin;v-text-anchor:top" o:gfxdata="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" filled="f" stroked="f">
                 <v:textbox>
                   <w:txbxContent>
                     <w:p>
@@ -1767,7 +1705,7 @@
                     <pic:cNvPicPr/>
                   </pic:nvPicPr>
                   <pic:blipFill>
-                    <a:blip r:embed="rId5" cstate="print">
+                    <a:blip r:embed="rId6" cstate="print">
                       <a:extLst>
                         <a:ext uri="{28A0092B-C50C-407E-A947-70E740481C1C}">
                           <a14:useLocalDpi xmlns:a14="http://schemas.microsoft.com/office/drawing/2010/main" val="0"/>

</xml_diff>

<commit_message>
Update ID card template
</commit_message>
<xml_diff>
--- a/templates/id-template.docx
+++ b/templates/id-template.docx
@@ -7,17 +7,96 @@
         <w:rPr>
           <w:noProof/>
         </w:rPr>
+        <mc:AlternateContent>
+          <mc:Choice Requires="wps">
+            <w:drawing>
+              <wp:anchor distT="0" distB="0" distL="114300" distR="114300" simplePos="0" relativeHeight="251685888" behindDoc="0" locked="0" layoutInCell="1" allowOverlap="1" wp14:anchorId="36D5CB65" wp14:editId="192D7CC4">
+                <wp:simplePos x="0" y="0"/>
+                <wp:positionH relativeFrom="column">
+                  <wp:posOffset>-406400</wp:posOffset>
+                </wp:positionH>
+                <wp:positionV relativeFrom="paragraph">
+                  <wp:posOffset>294005</wp:posOffset>
+                </wp:positionV>
+                <wp:extent cx="1714500" cy="1720850"/>
+                <wp:effectExtent l="19050" t="19050" r="19050" b="12700"/>
+                <wp:wrapNone/>
+                <wp:docPr id="3" name="Rectangle 3"/>
+                <wp:cNvGraphicFramePr/>
+                <a:graphic xmlns:a="http://schemas.openxmlformats.org/drawingml/2006/main">
+                  <a:graphicData uri="http://schemas.microsoft.com/office/word/2010/wordprocessingShape">
+                    <wps:wsp>
+                      <wps:cNvSpPr/>
+                      <wps:spPr>
+                        <a:xfrm>
+                          <a:off x="0" y="0"/>
+                          <a:ext cx="1714500" cy="1720850"/>
+                        </a:xfrm>
+                        <a:prstGeom prst="rect">
+                          <a:avLst/>
+                        </a:prstGeom>
+                        <a:noFill/>
+                        <a:ln w="28575">
+                          <a:solidFill>
+                            <a:schemeClr val="accent6">
+                              <a:lumMod val="50000"/>
+                            </a:schemeClr>
+                          </a:solidFill>
+                        </a:ln>
+                      </wps:spPr>
+                      <wps:style>
+                        <a:lnRef idx="2">
+                          <a:schemeClr val="accent1">
+                            <a:shade val="50000"/>
+                          </a:schemeClr>
+                        </a:lnRef>
+                        <a:fillRef idx="1">
+                          <a:schemeClr val="accent1"/>
+                        </a:fillRef>
+                        <a:effectRef idx="0">
+                          <a:schemeClr val="accent1"/>
+                        </a:effectRef>
+                        <a:fontRef idx="minor">
+                          <a:schemeClr val="lt1"/>
+                        </a:fontRef>
+                      </wps:style>
+                      <wps:bodyPr rot="0" spcFirstLastPara="0" vertOverflow="overflow" horzOverflow="overflow" vert="horz" wrap="square" lIns="91440" tIns="45720" rIns="91440" bIns="45720" numCol="1" spcCol="0" rtlCol="0" fromWordArt="0" anchor="ctr" anchorCtr="0" forceAA="0" compatLnSpc="1">
+                        <a:prstTxWarp prst="textNoShape">
+                          <a:avLst/>
+                        </a:prstTxWarp>
+                        <a:noAutofit/>
+                      </wps:bodyPr>
+                    </wps:wsp>
+                  </a:graphicData>
+                </a:graphic>
+                <wp14:sizeRelH relativeFrom="margin">
+                  <wp14:pctWidth>0</wp14:pctWidth>
+                </wp14:sizeRelH>
+              </wp:anchor>
+            </w:drawing>
+          </mc:Choice>
+          <mc:Fallback>
+            <w:pict>
+              <v:rect w14:anchorId="6A006A08" id="Rectangle 3" o:spid="_x0000_s1026" style="position:absolute;margin-left:-32pt;margin-top:23.15pt;width:135pt;height:135.5pt;z-index:251685888;visibility:visible;mso-wrap-style:square;mso-width-percent:0;mso-wrap-distance-left:9pt;mso-wrap-distance-top:0;mso-wrap-distance-right:9pt;mso-wrap-distance-bottom:0;mso-position-horizontal:absolute;mso-position-horizontal-relative:text;mso-position-vertical:absolute;mso-position-vertical-relative:text;mso-width-percent:0;mso-width-relative:margin;v-text-anchor:middle" o:gfxdata="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" filled="f" strokecolor="#375623 [1609]" strokeweight="2.25pt"/>
+            </w:pict>
+          </mc:Fallback>
+        </mc:AlternateContent>
+      </w:r>
+      <w:r>
+        <w:rPr>
+          <w:noProof/>
+        </w:rPr>
         <w:drawing>
-          <wp:anchor distT="0" distB="0" distL="114300" distR="114300" simplePos="0" relativeHeight="251684864" behindDoc="0" locked="0" layoutInCell="1" allowOverlap="1" wp14:anchorId="12E68184" wp14:editId="33D18211">
+          <wp:anchor distT="0" distB="0" distL="114300" distR="114300" simplePos="0" relativeHeight="251684864" behindDoc="0" locked="0" layoutInCell="1" allowOverlap="1" wp14:anchorId="12E68184" wp14:editId="6E18FD20">
             <wp:simplePos x="0" y="0"/>
             <wp:positionH relativeFrom="margin">
-              <wp:posOffset>-354965</wp:posOffset>
+              <wp:posOffset>-355600</wp:posOffset>
             </wp:positionH>
             <wp:positionV relativeFrom="paragraph">
-              <wp:posOffset>334341</wp:posOffset>
+              <wp:posOffset>338455</wp:posOffset>
             </wp:positionV>
-            <wp:extent cx="1633693" cy="1630017"/>
-            <wp:effectExtent l="0" t="0" r="5080" b="8890"/>
+            <wp:extent cx="1619250" cy="1623045"/>
+            <wp:effectExtent l="0" t="0" r="0" b="0"/>
             <wp:wrapNone/>
             <wp:docPr id="19" name="Picture 19"/>
             <wp:cNvGraphicFramePr>
@@ -46,7 +125,7 @@
                   <pic:spPr bwMode="auto">
                     <a:xfrm>
                       <a:off x="0" y="0"/>
-                      <a:ext cx="1633693" cy="1630017"/>
+                      <a:ext cx="1619250" cy="1623045"/>
                     </a:xfrm>
                     <a:prstGeom prst="rect">
                       <a:avLst/>

</xml_diff>

<commit_message>
Support new template: image1.png placeholder, fix insertPhoto for both jpeg and png
</commit_message>
<xml_diff>
--- a/templates/id-template.docx
+++ b/templates/id-template.docx
@@ -7,170 +7,18 @@
         <w:rPr>
           <w:noProof/>
         </w:rPr>
-        <w:drawing>
-          <wp:anchor distT="0" distB="0" distL="114300" distR="114300" simplePos="0" relativeHeight="251684864" behindDoc="0" locked="0" layoutInCell="1" allowOverlap="1" wp14:anchorId="12E68184" wp14:editId="7D722079">
-            <wp:simplePos x="0" y="0"/>
-            <wp:positionH relativeFrom="margin">
-              <wp:posOffset>-406400</wp:posOffset>
-            </wp:positionH>
-            <wp:positionV relativeFrom="paragraph">
-              <wp:posOffset>217805</wp:posOffset>
-            </wp:positionV>
-            <wp:extent cx="1695147" cy="1816100"/>
-            <wp:effectExtent l="0" t="0" r="635" b="0"/>
-            <wp:wrapNone/>
-            <wp:docPr id="19" name="Picture 19"/>
-            <wp:cNvGraphicFramePr>
-              <a:graphicFrameLocks xmlns:a="http://schemas.openxmlformats.org/drawingml/2006/main" noChangeAspect="1"/>
-            </wp:cNvGraphicFramePr>
-            <a:graphic xmlns:a="http://schemas.openxmlformats.org/drawingml/2006/main">
-              <a:graphicData uri="http://schemas.openxmlformats.org/drawingml/2006/picture">
-                <pic:pic xmlns:pic="http://schemas.openxmlformats.org/drawingml/2006/picture">
-                  <pic:nvPicPr>
-                    <pic:cNvPr id="0" name="Picture 2"/>
-                    <pic:cNvPicPr>
-                      <a:picLocks noChangeAspect="1" noChangeArrowheads="1"/>
-                    </pic:cNvPicPr>
-                  </pic:nvPicPr>
-                  <pic:blipFill rotWithShape="1">
-                    <a:blip r:embed="rId4" cstate="print">
-                      <a:extLst>
-                        <a:ext uri="{28A0092B-C50C-407E-A947-70E740481C1C}">
-                          <a14:useLocalDpi xmlns:a14="http://schemas.microsoft.com/office/drawing/2010/main" val="0"/>
-                        </a:ext>
-                      </a:extLst>
-                    </a:blip>
-                    <a:srcRect l="4348" r="5159"/>
-                    <a:stretch/>
-                  </pic:blipFill>
-                  <pic:spPr bwMode="auto">
-                    <a:xfrm>
-                      <a:off x="0" y="0"/>
-                      <a:ext cx="1696475" cy="1817523"/>
-                    </a:xfrm>
-                    <a:prstGeom prst="rect">
-                      <a:avLst/>
-                    </a:prstGeom>
-                    <a:noFill/>
-                    <a:ln>
-                      <a:noFill/>
-                    </a:ln>
-                    <a:extLst>
-                      <a:ext uri="{53640926-AAD7-44D8-BBD7-CCE9431645EC}">
-                        <a14:shadowObscured xmlns:a14="http://schemas.microsoft.com/office/drawing/2010/main"/>
-                      </a:ext>
-                    </a:extLst>
-                  </pic:spPr>
-                </pic:pic>
-              </a:graphicData>
-            </a:graphic>
-            <wp14:sizeRelH relativeFrom="page">
-              <wp14:pctWidth>0</wp14:pctWidth>
-            </wp14:sizeRelH>
-            <wp14:sizeRelV relativeFrom="page">
-              <wp14:pctHeight>0</wp14:pctHeight>
-            </wp14:sizeRelV>
-          </wp:anchor>
-        </w:drawing>
-      </w:r>
-      <w:r>
-        <w:rPr>
-          <w:noProof/>
-        </w:rPr>
         <mc:AlternateContent>
           <mc:Choice Requires="wps">
             <w:drawing>
-              <wp:anchor distT="0" distB="0" distL="114300" distR="114300" simplePos="0" relativeHeight="251685888" behindDoc="0" locked="0" layoutInCell="1" allowOverlap="1" wp14:anchorId="36D5CB65" wp14:editId="1EADDA77">
-                <wp:simplePos x="0" y="0"/>
-                <wp:positionH relativeFrom="column">
-                  <wp:posOffset>-406400</wp:posOffset>
-                </wp:positionH>
-                <wp:positionV relativeFrom="paragraph">
-                  <wp:posOffset>186055</wp:posOffset>
-                </wp:positionV>
-                <wp:extent cx="1714500" cy="1873250"/>
-                <wp:effectExtent l="19050" t="19050" r="19050" b="12700"/>
-                <wp:wrapNone/>
-                <wp:docPr id="3" name="Rectangle 3"/>
-                <wp:cNvGraphicFramePr/>
-                <a:graphic xmlns:a="http://schemas.openxmlformats.org/drawingml/2006/main">
-                  <a:graphicData uri="http://schemas.microsoft.com/office/word/2010/wordprocessingShape">
-                    <wps:wsp>
-                      <wps:cNvSpPr/>
-                      <wps:spPr>
-                        <a:xfrm>
-                          <a:off x="0" y="0"/>
-                          <a:ext cx="1714500" cy="1873250"/>
-                        </a:xfrm>
-                        <a:prstGeom prst="rect">
-                          <a:avLst/>
-                        </a:prstGeom>
-                        <a:noFill/>
-                        <a:ln w="28575">
-                          <a:solidFill>
-                            <a:schemeClr val="accent6">
-                              <a:lumMod val="50000"/>
-                            </a:schemeClr>
-                          </a:solidFill>
-                        </a:ln>
-                      </wps:spPr>
-                      <wps:style>
-                        <a:lnRef idx="2">
-                          <a:schemeClr val="accent1">
-                            <a:shade val="50000"/>
-                          </a:schemeClr>
-                        </a:lnRef>
-                        <a:fillRef idx="1">
-                          <a:schemeClr val="accent1"/>
-                        </a:fillRef>
-                        <a:effectRef idx="0">
-                          <a:schemeClr val="accent1"/>
-                        </a:effectRef>
-                        <a:fontRef idx="minor">
-                          <a:schemeClr val="lt1"/>
-                        </a:fontRef>
-                      </wps:style>
-                      <wps:bodyPr rot="0" spcFirstLastPara="0" vertOverflow="overflow" horzOverflow="overflow" vert="horz" wrap="square" lIns="91440" tIns="45720" rIns="91440" bIns="45720" numCol="1" spcCol="0" rtlCol="0" fromWordArt="0" anchor="ctr" anchorCtr="0" forceAA="0" compatLnSpc="1">
-                        <a:prstTxWarp prst="textNoShape">
-                          <a:avLst/>
-                        </a:prstTxWarp>
-                        <a:noAutofit/>
-                      </wps:bodyPr>
-                    </wps:wsp>
-                  </a:graphicData>
-                </a:graphic>
-                <wp14:sizeRelH relativeFrom="margin">
-                  <wp14:pctWidth>0</wp14:pctWidth>
-                </wp14:sizeRelH>
-                <wp14:sizeRelV relativeFrom="margin">
-                  <wp14:pctHeight>0</wp14:pctHeight>
-                </wp14:sizeRelV>
-              </wp:anchor>
-            </w:drawing>
-          </mc:Choice>
-          <mc:Fallback>
-            <w:pict>
-              <v:rect w14:anchorId="1C42FDFE" id="Rectangle 3" o:spid="_x0000_s1026" style="position:absolute;margin-left:-32pt;margin-top:14.65pt;width:135pt;height:147.5pt;z-index:251685888;visibility:visible;mso-wrap-style:square;mso-width-percent:0;mso-height-percent:0;mso-wrap-distance-left:9pt;mso-wrap-distance-top:0;mso-wrap-distance-right:9pt;mso-wrap-distance-bottom:0;mso-position-horizontal:absolute;mso-position-horizontal-relative:text;mso-position-vertical:absolute;mso-position-vertical-relative:text;mso-width-percent:0;mso-height-percent:0;mso-width-relative:margin;mso-height-relative:margin;v-text-anchor:middle" o:gfxdata="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" filled="f" strokecolor="#375623 [1609]" strokeweight="2.25pt"/>
-            </w:pict>
-          </mc:Fallback>
-        </mc:AlternateContent>
-      </w:r>
-      <w:r>
-        <w:rPr>
-          <w:noProof/>
-        </w:rPr>
-        <mc:AlternateContent>
-          <mc:Choice Requires="wps">
-            <w:drawing>
-              <wp:anchor distT="45720" distB="45720" distL="114300" distR="114300" simplePos="0" relativeHeight="251661312" behindDoc="0" locked="0" layoutInCell="1" allowOverlap="1" wp14:anchorId="32344B30" wp14:editId="09E49387">
+              <wp:anchor distT="45720" distB="45720" distL="114300" distR="114300" simplePos="0" relativeHeight="251661312" behindDoc="0" locked="0" layoutInCell="1" allowOverlap="1" wp14:anchorId="32344B30" wp14:editId="55807C31">
                 <wp:simplePos x="0" y="0"/>
                 <wp:positionH relativeFrom="column">
                   <wp:posOffset>-476250</wp:posOffset>
                 </wp:positionH>
                 <wp:positionV relativeFrom="paragraph">
-                  <wp:posOffset>2064385</wp:posOffset>
+                  <wp:posOffset>2014855</wp:posOffset>
                 </wp:positionV>
-                <wp:extent cx="2536190" cy="370205"/>
+                <wp:extent cx="2536190" cy="381000"/>
                 <wp:effectExtent l="0" t="0" r="0" b="0"/>
                 <wp:wrapSquare wrapText="bothSides"/>
                 <wp:docPr id="217" name="Text Box 2"/>
@@ -186,7 +34,7 @@
                       <wps:spPr bwMode="auto">
                         <a:xfrm>
                           <a:off x="0" y="0"/>
-                          <a:ext cx="2536190" cy="370205"/>
+                          <a:ext cx="2536190" cy="381000"/>
                         </a:xfrm>
                         <a:prstGeom prst="rect">
                           <a:avLst/>
@@ -206,16 +54,16 @@
                               <w:rPr>
                                 <w:rFonts w:ascii="Copperplate Gothic Bold" w:hAnsi="Copperplate Gothic Bold"/>
                                 <w:spacing w:val="4"/>
-                                <w:sz w:val="40"/>
-                                <w:szCs w:val="40"/>
+                                <w:sz w:val="44"/>
+                                <w:szCs w:val="44"/>
                               </w:rPr>
                             </w:pPr>
                             <w:r>
                               <w:rPr>
                                 <w:rFonts w:ascii="Copperplate Gothic Bold" w:hAnsi="Copperplate Gothic Bold"/>
                                 <w:spacing w:val="4"/>
-                                <w:sz w:val="40"/>
-                                <w:szCs w:val="40"/>
+                                <w:sz w:val="44"/>
+                                <w:szCs w:val="44"/>
                               </w:rPr>
                               <w:t>{{LASTNAME}}</w:t>
                             </w:r>
@@ -243,7 +91,7 @@
                 <v:stroke joinstyle="miter"/>
                 <v:path gradientshapeok="t" o:connecttype="rect"/>
               </v:shapetype>
-              <v:shape id="Text Box 2" o:spid="_x0000_s1026" type="#_x0000_t202" style="position:absolute;margin-left:-37.5pt;margin-top:162.55pt;width:199.7pt;height:29.15pt;z-index:251661312;visibility:visible;mso-wrap-style:square;mso-width-percent:0;mso-height-percent:0;mso-wrap-distance-left:9pt;mso-wrap-distance-top:3.6pt;mso-wrap-distance-right:9pt;mso-wrap-distance-bottom:3.6pt;mso-position-horizontal:absolute;mso-position-horizontal-relative:text;mso-position-vertical:absolute;mso-position-vertical-relative:text;mso-width-percent:0;mso-height-percent:0;mso-width-relative:margin;mso-height-relative:margin;v-text-anchor:top" o:gfxdata="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" filled="f" stroked="f">
+              <v:shape id="Text Box 2" o:spid="_x0000_s1026" type="#_x0000_t202" style="position:absolute;margin-left:-37.5pt;margin-top:158.65pt;width:199.7pt;height:30pt;z-index:251661312;visibility:visible;mso-wrap-style:square;mso-width-percent:0;mso-height-percent:0;mso-wrap-distance-left:9pt;mso-wrap-distance-top:3.6pt;mso-wrap-distance-right:9pt;mso-wrap-distance-bottom:3.6pt;mso-position-horizontal:absolute;mso-position-horizontal-relative:text;mso-position-vertical:absolute;mso-position-vertical-relative:text;mso-width-percent:0;mso-height-percent:0;mso-width-relative:margin;mso-height-relative:margin;v-text-anchor:top" o:gfxdata="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" filled="f" stroked="f">
                 <v:textbox>
                   <w:txbxContent>
                     <w:p>
@@ -251,16 +99,16 @@
                         <w:rPr>
                           <w:rFonts w:ascii="Copperplate Gothic Bold" w:hAnsi="Copperplate Gothic Bold"/>
                           <w:spacing w:val="4"/>
-                          <w:sz w:val="40"/>
-                          <w:szCs w:val="40"/>
+                          <w:sz w:val="44"/>
+                          <w:szCs w:val="44"/>
                         </w:rPr>
                       </w:pPr>
                       <w:r>
                         <w:rPr>
                           <w:rFonts w:ascii="Copperplate Gothic Bold" w:hAnsi="Copperplate Gothic Bold"/>
                           <w:spacing w:val="4"/>
-                          <w:sz w:val="40"/>
-                          <w:szCs w:val="40"/>
+                          <w:sz w:val="44"/>
+                          <w:szCs w:val="44"/>
                         </w:rPr>
                         <w:t>{{LASTNAME}}</w:t>
                       </w:r>
@@ -277,155 +125,65 @@
         <w:rPr>
           <w:noProof/>
         </w:rPr>
-        <mc:AlternateContent>
-          <mc:Choice Requires="wps">
-            <w:drawing>
-              <wp:anchor distT="45720" distB="45720" distL="114300" distR="114300" simplePos="0" relativeHeight="251663360" behindDoc="0" locked="0" layoutInCell="1" allowOverlap="1" wp14:anchorId="3A561120" wp14:editId="02759E9C">
-                <wp:simplePos x="0" y="0"/>
-                <wp:positionH relativeFrom="column">
-                  <wp:posOffset>-457200</wp:posOffset>
-                </wp:positionH>
-                <wp:positionV relativeFrom="paragraph">
-                  <wp:posOffset>2390775</wp:posOffset>
-                </wp:positionV>
-                <wp:extent cx="2595245" cy="295275"/>
-                <wp:effectExtent l="0" t="0" r="0" b="0"/>
-                <wp:wrapSquare wrapText="bothSides"/>
-                <wp:docPr id="5" name="Text Box 2"/>
-                <wp:cNvGraphicFramePr>
-                  <a:graphicFrameLocks xmlns:a="http://schemas.openxmlformats.org/drawingml/2006/main"/>
-                </wp:cNvGraphicFramePr>
-                <a:graphic xmlns:a="http://schemas.openxmlformats.org/drawingml/2006/main">
-                  <a:graphicData uri="http://schemas.microsoft.com/office/word/2010/wordprocessingShape">
-                    <wps:wsp>
-                      <wps:cNvSpPr txBox="1">
-                        <a:spLocks noChangeArrowheads="1"/>
-                      </wps:cNvSpPr>
-                      <wps:spPr bwMode="auto">
-                        <a:xfrm>
-                          <a:off x="0" y="0"/>
-                          <a:ext cx="2595245" cy="295275"/>
-                        </a:xfrm>
-                        <a:prstGeom prst="rect">
-                          <a:avLst/>
-                        </a:prstGeom>
-                        <a:noFill/>
-                        <a:ln w="9525">
-                          <a:noFill/>
-                          <a:miter lim="800000"/>
-                          <a:headEnd/>
-                          <a:tailEnd/>
-                        </a:ln>
-                      </wps:spPr>
-                      <wps:txbx>
-                        <w:txbxContent>
-                          <w:p>
-                            <w:pPr>
-                              <w:rPr>
-                                <w:rFonts w:ascii="Copperplate Gothic Bold" w:hAnsi="Copperplate Gothic Bold"/>
-                                <w:spacing w:val="4"/>
-                                <w:sz w:val="28"/>
-                                <w:szCs w:val="28"/>
-                              </w:rPr>
-                            </w:pPr>
-                            <w:r>
-                              <w:rPr>
-                                <w:rFonts w:ascii="Copperplate Gothic Bold" w:hAnsi="Copperplate Gothic Bold"/>
-                                <w:spacing w:val="4"/>
-                                <w:sz w:val="28"/>
-                                <w:szCs w:val="28"/>
-                              </w:rPr>
-                              <w:t>{{FIRSTNAME</w:t>
-                            </w:r>
-                            <w:proofErr w:type="gramStart"/>
-                            <w:r>
-                              <w:rPr>
-                                <w:rFonts w:ascii="Copperplate Gothic Bold" w:hAnsi="Copperplate Gothic Bold"/>
-                                <w:spacing w:val="4"/>
-                                <w:sz w:val="28"/>
-                                <w:szCs w:val="28"/>
-                              </w:rPr>
-                              <w:t>}}  {</w:t>
-                            </w:r>
-                            <w:proofErr w:type="gramEnd"/>
-                            <w:r>
-                              <w:rPr>
-                                <w:rFonts w:ascii="Copperplate Gothic Bold" w:hAnsi="Copperplate Gothic Bold"/>
-                                <w:spacing w:val="4"/>
-                                <w:sz w:val="28"/>
-                                <w:szCs w:val="28"/>
-                              </w:rPr>
-                              <w:t>{M.I.}}</w:t>
-                            </w:r>
-                          </w:p>
-                        </w:txbxContent>
-                      </wps:txbx>
-                      <wps:bodyPr rot="0" vert="horz" wrap="square" lIns="91440" tIns="45720" rIns="91440" bIns="45720" anchor="t" anchorCtr="0">
-                        <a:noAutofit/>
-                      </wps:bodyPr>
-                    </wps:wsp>
-                  </a:graphicData>
-                </a:graphic>
-                <wp14:sizeRelH relativeFrom="margin">
-                  <wp14:pctWidth>0</wp14:pctWidth>
-                </wp14:sizeRelH>
-                <wp14:sizeRelV relativeFrom="margin">
-                  <wp14:pctHeight>0</wp14:pctHeight>
-                </wp14:sizeRelV>
-              </wp:anchor>
-            </w:drawing>
-          </mc:Choice>
-          <mc:Fallback>
-            <w:pict>
-              <v:shape w14:anchorId="3A561120" id="_x0000_s1027" type="#_x0000_t202" style="position:absolute;margin-left:-36pt;margin-top:188.25pt;width:204.35pt;height:23.25pt;z-index:251663360;visibility:visible;mso-wrap-style:square;mso-width-percent:0;mso-height-percent:0;mso-wrap-distance-left:9pt;mso-wrap-distance-top:3.6pt;mso-wrap-distance-right:9pt;mso-wrap-distance-bottom:3.6pt;mso-position-horizontal:absolute;mso-position-horizontal-relative:text;mso-position-vertical:absolute;mso-position-vertical-relative:text;mso-width-percent:0;mso-height-percent:0;mso-width-relative:margin;mso-height-relative:margin;v-text-anchor:top" o:gfxdata="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" filled="f" stroked="f">
-                <v:textbox>
-                  <w:txbxContent>
-                    <w:p>
-                      <w:pPr>
-                        <w:rPr>
-                          <w:rFonts w:ascii="Copperplate Gothic Bold" w:hAnsi="Copperplate Gothic Bold"/>
-                          <w:spacing w:val="4"/>
-                          <w:sz w:val="28"/>
-                          <w:szCs w:val="28"/>
-                        </w:rPr>
-                      </w:pPr>
-                      <w:r>
-                        <w:rPr>
-                          <w:rFonts w:ascii="Copperplate Gothic Bold" w:hAnsi="Copperplate Gothic Bold"/>
-                          <w:spacing w:val="4"/>
-                          <w:sz w:val="28"/>
-                          <w:szCs w:val="28"/>
-                        </w:rPr>
-                        <w:t>{{FIRSTNAME</w:t>
-                      </w:r>
-                      <w:proofErr w:type="gramStart"/>
-                      <w:r>
-                        <w:rPr>
-                          <w:rFonts w:ascii="Copperplate Gothic Bold" w:hAnsi="Copperplate Gothic Bold"/>
-                          <w:spacing w:val="4"/>
-                          <w:sz w:val="28"/>
-                          <w:szCs w:val="28"/>
-                        </w:rPr>
-                        <w:t>}}  {</w:t>
-                      </w:r>
-                      <w:proofErr w:type="gramEnd"/>
-                      <w:r>
-                        <w:rPr>
-                          <w:rFonts w:ascii="Copperplate Gothic Bold" w:hAnsi="Copperplate Gothic Bold"/>
-                          <w:spacing w:val="4"/>
-                          <w:sz w:val="28"/>
-                          <w:szCs w:val="28"/>
-                        </w:rPr>
-                        <w:t>{M.I.}}</w:t>
-                      </w:r>
-                    </w:p>
-                  </w:txbxContent>
-                </v:textbox>
-                <w10:wrap type="square"/>
-              </v:shape>
-            </w:pict>
-          </mc:Fallback>
-        </mc:AlternateContent>
+        <w:drawing>
+          <wp:anchor distT="0" distB="0" distL="114300" distR="114300" simplePos="0" relativeHeight="251685888" behindDoc="0" locked="0" layoutInCell="1" allowOverlap="1" wp14:anchorId="6CAD19C1" wp14:editId="227AD7C9">
+            <wp:simplePos x="0" y="0"/>
+            <wp:positionH relativeFrom="column">
+              <wp:posOffset>-355600</wp:posOffset>
+            </wp:positionH>
+            <wp:positionV relativeFrom="paragraph">
+              <wp:posOffset>340995</wp:posOffset>
+            </wp:positionV>
+            <wp:extent cx="1627505" cy="1627505"/>
+            <wp:effectExtent l="0" t="0" r="0" b="0"/>
+            <wp:wrapTopAndBottom/>
+            <wp:docPr id="3" name="Picture 3"/>
+            <wp:cNvGraphicFramePr>
+              <a:graphicFrameLocks xmlns:a="http://schemas.openxmlformats.org/drawingml/2006/main" noChangeAspect="1"/>
+            </wp:cNvGraphicFramePr>
+            <a:graphic xmlns:a="http://schemas.openxmlformats.org/drawingml/2006/main">
+              <a:graphicData uri="http://schemas.openxmlformats.org/drawingml/2006/picture">
+                <pic:pic xmlns:pic="http://schemas.openxmlformats.org/drawingml/2006/picture">
+                  <pic:nvPicPr>
+                    <pic:cNvPr id="0" name="Picture 2"/>
+                    <pic:cNvPicPr>
+                      <a:picLocks noChangeAspect="1" noChangeArrowheads="1"/>
+                    </pic:cNvPicPr>
+                  </pic:nvPicPr>
+                  <pic:blipFill>
+                    <a:blip r:embed="rId4">
+                      <a:extLst>
+                        <a:ext uri="{28A0092B-C50C-407E-A947-70E740481C1C}">
+                          <a14:useLocalDpi xmlns:a14="http://schemas.microsoft.com/office/drawing/2010/main" val="0"/>
+                        </a:ext>
+                      </a:extLst>
+                    </a:blip>
+                    <a:srcRect/>
+                    <a:stretch>
+                      <a:fillRect/>
+                    </a:stretch>
+                  </pic:blipFill>
+                  <pic:spPr bwMode="auto">
+                    <a:xfrm>
+                      <a:off x="0" y="0"/>
+                      <a:ext cx="1627505" cy="1627505"/>
+                    </a:xfrm>
+                    <a:prstGeom prst="rect">
+                      <a:avLst/>
+                    </a:prstGeom>
+                    <a:noFill/>
+                  </pic:spPr>
+                </pic:pic>
+              </a:graphicData>
+            </a:graphic>
+            <wp14:sizeRelH relativeFrom="page">
+              <wp14:pctWidth>0</wp14:pctWidth>
+            </wp14:sizeRelH>
+            <wp14:sizeRelV relativeFrom="page">
+              <wp14:pctHeight>0</wp14:pctHeight>
+            </wp14:sizeRelV>
+          </wp:anchor>
+        </w:drawing>
       </w:r>
       <w:r>
         <w:rPr>
@@ -434,7 +192,7 @@
         <mc:AlternateContent>
           <mc:Choice Requires="wps">
             <w:drawing>
-              <wp:anchor distT="45720" distB="45720" distL="114300" distR="114300" simplePos="0" relativeHeight="251673600" behindDoc="0" locked="0" layoutInCell="1" allowOverlap="1" wp14:anchorId="5203266C" wp14:editId="21D0DFF7">
+              <wp:anchor distT="45720" distB="45720" distL="114300" distR="114300" simplePos="0" relativeHeight="251673600" behindDoc="0" locked="0" layoutInCell="1" allowOverlap="1" wp14:anchorId="5203266C" wp14:editId="7B7C3D28">
                 <wp:simplePos x="0" y="0"/>
                 <wp:positionH relativeFrom="column">
                   <wp:posOffset>5059045</wp:posOffset>
@@ -515,11 +273,7 @@
           </mc:Choice>
           <mc:Fallback>
             <w:pict>
-              <v:shapetype w14:anchorId="5203266C" id="_x0000_t202" coordsize="21600,21600" o:spt="202" path="m,l,21600r21600,l21600,xe">
-                <v:stroke joinstyle="miter"/>
-                <v:path gradientshapeok="t" o:connecttype="rect"/>
-              </v:shapetype>
-              <v:shape id="Text Box 2" o:spid="_x0000_s1026" type="#_x0000_t202" style="position:absolute;margin-left:398.35pt;margin-top:123.5pt;width:320.35pt;height:14.7pt;z-index:251673600;visibility:visible;mso-wrap-style:square;mso-width-percent:0;mso-height-percent:0;mso-wrap-distance-left:9pt;mso-wrap-distance-top:3.6pt;mso-wrap-distance-right:9pt;mso-wrap-distance-bottom:3.6pt;mso-position-horizontal:absolute;mso-position-horizontal-relative:text;mso-position-vertical:absolute;mso-position-vertical-relative:text;mso-width-percent:0;mso-height-percent:0;mso-width-relative:margin;mso-height-relative:margin;v-text-anchor:top" o:gfxdata="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" filled="f" stroked="f">
+              <v:shape w14:anchorId="5203266C" id="_x0000_s1027" type="#_x0000_t202" style="position:absolute;margin-left:398.35pt;margin-top:123.5pt;width:320.35pt;height:14.7pt;z-index:251673600;visibility:visible;mso-wrap-style:square;mso-width-percent:0;mso-height-percent:0;mso-wrap-distance-left:9pt;mso-wrap-distance-top:3.6pt;mso-wrap-distance-right:9pt;mso-wrap-distance-bottom:3.6pt;mso-position-horizontal:absolute;mso-position-horizontal-relative:text;mso-position-vertical:absolute;mso-position-vertical-relative:text;mso-width-percent:0;mso-height-percent:0;mso-width-relative:margin;mso-height-relative:margin;v-text-anchor:top" o:gfxdata="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" filled="f" stroked="f">
                 <v:textbox inset="0,0,0,0">
                   <w:txbxContent>
                     <w:p>
@@ -560,7 +314,7 @@
         <mc:AlternateContent>
           <mc:Choice Requires="wps">
             <w:drawing>
-              <wp:anchor distT="45720" distB="45720" distL="114300" distR="114300" simplePos="0" relativeHeight="251683840" behindDoc="0" locked="0" layoutInCell="1" allowOverlap="1" wp14:anchorId="69B45CCF" wp14:editId="3D8BE17D">
+              <wp:anchor distT="45720" distB="45720" distL="114300" distR="114300" simplePos="0" relativeHeight="251683840" behindDoc="0" locked="0" layoutInCell="1" allowOverlap="1" wp14:anchorId="69B45CCF" wp14:editId="480DABEB">
                 <wp:simplePos x="0" y="0"/>
                 <wp:positionH relativeFrom="column">
                   <wp:posOffset>6403340</wp:posOffset>
@@ -636,7 +390,7 @@
           </mc:Choice>
           <mc:Fallback>
             <w:pict>
-              <v:shape w14:anchorId="69B45CCF" id="_x0000_s1029" type="#_x0000_t202" style="position:absolute;margin-left:504.2pt;margin-top:116.1pt;width:107.4pt;height:8.05pt;z-index:251683840;visibility:visible;mso-wrap-style:square;mso-width-percent:0;mso-height-percent:0;mso-wrap-distance-left:9pt;mso-wrap-distance-top:3.6pt;mso-wrap-distance-right:9pt;mso-wrap-distance-bottom:3.6pt;mso-position-horizontal:absolute;mso-position-horizontal-relative:text;mso-position-vertical:absolute;mso-position-vertical-relative:text;mso-width-percent:0;mso-height-percent:0;mso-width-relative:margin;mso-height-relative:margin;v-text-anchor:top" o:gfxdata="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" filled="f" stroked="f">
+              <v:shape w14:anchorId="69B45CCF" id="_x0000_s1028" type="#_x0000_t202" style="position:absolute;margin-left:504.2pt;margin-top:116.1pt;width:107.4pt;height:8.05pt;z-index:251683840;visibility:visible;mso-wrap-style:square;mso-width-percent:0;mso-height-percent:0;mso-wrap-distance-left:9pt;mso-wrap-distance-top:3.6pt;mso-wrap-distance-right:9pt;mso-wrap-distance-bottom:3.6pt;mso-position-horizontal:absolute;mso-position-horizontal-relative:text;mso-position-vertical:absolute;mso-position-vertical-relative:text;mso-width-percent:0;mso-height-percent:0;mso-width-relative:margin;mso-height-relative:margin;v-text-anchor:top" o:gfxdata="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" filled="f" stroked="f">
                 <v:textbox inset="0,0,0,0">
                   <w:txbxContent>
                     <w:p>
@@ -1654,7 +1408,7 @@
         <mc:AlternateContent>
           <mc:Choice Requires="wps">
             <w:drawing>
-              <wp:anchor distT="45720" distB="45720" distL="114300" distR="114300" simplePos="0" relativeHeight="251679744" behindDoc="0" locked="0" layoutInCell="1" allowOverlap="1" wp14:anchorId="298364A9" wp14:editId="58B91617">
+              <wp:anchor distT="45720" distB="45720" distL="114300" distR="114300" simplePos="0" relativeHeight="251679744" behindDoc="0" locked="0" layoutInCell="1" allowOverlap="1" wp14:anchorId="298364A9" wp14:editId="7227DD8F">
                 <wp:simplePos x="0" y="0"/>
                 <wp:positionH relativeFrom="column">
                   <wp:posOffset>8027670</wp:posOffset>
@@ -1732,7 +1486,7 @@
           </mc:Choice>
           <mc:Fallback>
             <w:pict>
-              <v:shape w14:anchorId="298364A9" id="_x0000_s1036" type="#_x0000_t202" style="position:absolute;margin-left:632.1pt;margin-top:116.25pt;width:213.05pt;height:15.35pt;rotation:-90;z-index:251679744;visibility:visible;mso-wrap-style:square;mso-width-percent:0;mso-height-percent:0;mso-wrap-distance-left:9pt;mso-wrap-distance-top:3.6pt;mso-wrap-distance-right:9pt;mso-wrap-distance-bottom:3.6pt;mso-position-horizontal:absolute;mso-position-horizontal-relative:text;mso-position-vertical:absolute;mso-position-vertical-relative:text;mso-width-percent:0;mso-height-percent:0;mso-width-relative:margin;mso-height-relative:margin;v-text-anchor:top" o:gfxdata="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" filled="f" stroked="f">
+              <v:shape w14:anchorId="298364A9" id="_x0000_s1035" type="#_x0000_t202" style="position:absolute;margin-left:632.1pt;margin-top:116.25pt;width:213.05pt;height:15.35pt;rotation:-90;z-index:251679744;visibility:visible;mso-wrap-style:square;mso-width-percent:0;mso-height-percent:0;mso-wrap-distance-left:9pt;mso-wrap-distance-top:3.6pt;mso-wrap-distance-right:9pt;mso-wrap-distance-bottom:3.6pt;mso-position-horizontal:absolute;mso-position-horizontal-relative:text;mso-position-vertical:absolute;mso-position-vertical-relative:text;mso-width-percent:0;mso-height-percent:0;mso-width-relative:margin;mso-height-relative:margin;v-text-anchor:top" o:gfxdata="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" filled="f" stroked="f">
                 <v:textbox inset="0,0,0,0">
                   <w:txbxContent>
                     <w:p>
@@ -1753,6 +1507,160 @@
                           <w:szCs w:val="28"/>
                         </w:rPr>
                         <w:t>{{LRN}}</w:t>
+                      </w:r>
+                    </w:p>
+                  </w:txbxContent>
+                </v:textbox>
+                <w10:wrap type="square"/>
+              </v:shape>
+            </w:pict>
+          </mc:Fallback>
+        </mc:AlternateContent>
+      </w:r>
+      <w:r>
+        <w:rPr>
+          <w:noProof/>
+        </w:rPr>
+        <mc:AlternateContent>
+          <mc:Choice Requires="wps">
+            <w:drawing>
+              <wp:anchor distT="45720" distB="45720" distL="114300" distR="114300" simplePos="0" relativeHeight="251663360" behindDoc="0" locked="0" layoutInCell="1" allowOverlap="1" wp14:anchorId="3A561120" wp14:editId="09B30A0F">
+                <wp:simplePos x="0" y="0"/>
+                <wp:positionH relativeFrom="column">
+                  <wp:posOffset>-457200</wp:posOffset>
+                </wp:positionH>
+                <wp:positionV relativeFrom="paragraph">
+                  <wp:posOffset>2378075</wp:posOffset>
+                </wp:positionV>
+                <wp:extent cx="2595245" cy="295275"/>
+                <wp:effectExtent l="0" t="0" r="0" b="0"/>
+                <wp:wrapSquare wrapText="bothSides"/>
+                <wp:docPr id="5" name="Text Box 2"/>
+                <wp:cNvGraphicFramePr>
+                  <a:graphicFrameLocks xmlns:a="http://schemas.openxmlformats.org/drawingml/2006/main"/>
+                </wp:cNvGraphicFramePr>
+                <a:graphic xmlns:a="http://schemas.openxmlformats.org/drawingml/2006/main">
+                  <a:graphicData uri="http://schemas.microsoft.com/office/word/2010/wordprocessingShape">
+                    <wps:wsp>
+                      <wps:cNvSpPr txBox="1">
+                        <a:spLocks noChangeArrowheads="1"/>
+                      </wps:cNvSpPr>
+                      <wps:spPr bwMode="auto">
+                        <a:xfrm>
+                          <a:off x="0" y="0"/>
+                          <a:ext cx="2595245" cy="295275"/>
+                        </a:xfrm>
+                        <a:prstGeom prst="rect">
+                          <a:avLst/>
+                        </a:prstGeom>
+                        <a:noFill/>
+                        <a:ln w="9525">
+                          <a:noFill/>
+                          <a:miter lim="800000"/>
+                          <a:headEnd/>
+                          <a:tailEnd/>
+                        </a:ln>
+                      </wps:spPr>
+                      <wps:txbx>
+                        <w:txbxContent>
+                          <w:p>
+                            <w:pPr>
+                              <w:rPr>
+                                <w:rFonts w:ascii="Copperplate Gothic Bold" w:hAnsi="Copperplate Gothic Bold"/>
+                                <w:spacing w:val="4"/>
+                                <w:sz w:val="28"/>
+                                <w:szCs w:val="28"/>
+                              </w:rPr>
+                            </w:pPr>
+                            <w:r>
+                              <w:rPr>
+                                <w:rFonts w:ascii="Copperplate Gothic Bold" w:hAnsi="Copperplate Gothic Bold"/>
+                                <w:spacing w:val="4"/>
+                                <w:sz w:val="28"/>
+                                <w:szCs w:val="28"/>
+                              </w:rPr>
+                              <w:t>{{FIRSTNAME</w:t>
+                            </w:r>
+                            <w:proofErr w:type="gramStart"/>
+                            <w:r>
+                              <w:rPr>
+                                <w:rFonts w:ascii="Copperplate Gothic Bold" w:hAnsi="Copperplate Gothic Bold"/>
+                                <w:spacing w:val="4"/>
+                                <w:sz w:val="28"/>
+                                <w:szCs w:val="28"/>
+                              </w:rPr>
+                              <w:t>}}  {</w:t>
+                            </w:r>
+                            <w:proofErr w:type="gramEnd"/>
+                            <w:r>
+                              <w:rPr>
+                                <w:rFonts w:ascii="Copperplate Gothic Bold" w:hAnsi="Copperplate Gothic Bold"/>
+                                <w:spacing w:val="4"/>
+                                <w:sz w:val="28"/>
+                                <w:szCs w:val="28"/>
+                              </w:rPr>
+                              <w:t>{M.I.}}</w:t>
+                            </w:r>
+                          </w:p>
+                        </w:txbxContent>
+                      </wps:txbx>
+                      <wps:bodyPr rot="0" vert="horz" wrap="square" lIns="91440" tIns="45720" rIns="91440" bIns="45720" anchor="t" anchorCtr="0">
+                        <a:noAutofit/>
+                      </wps:bodyPr>
+                    </wps:wsp>
+                  </a:graphicData>
+                </a:graphic>
+                <wp14:sizeRelH relativeFrom="margin">
+                  <wp14:pctWidth>0</wp14:pctWidth>
+                </wp14:sizeRelH>
+                <wp14:sizeRelV relativeFrom="margin">
+                  <wp14:pctHeight>0</wp14:pctHeight>
+                </wp14:sizeRelV>
+              </wp:anchor>
+            </w:drawing>
+          </mc:Choice>
+          <mc:Fallback>
+            <w:pict>
+              <v:shape w14:anchorId="3A561120" id="_x0000_s1036" type="#_x0000_t202" style="position:absolute;margin-left:-36pt;margin-top:187.25pt;width:204.35pt;height:23.25pt;z-index:251663360;visibility:visible;mso-wrap-style:square;mso-width-percent:0;mso-height-percent:0;mso-wrap-distance-left:9pt;mso-wrap-distance-top:3.6pt;mso-wrap-distance-right:9pt;mso-wrap-distance-bottom:3.6pt;mso-position-horizontal:absolute;mso-position-horizontal-relative:text;mso-position-vertical:absolute;mso-position-vertical-relative:text;mso-width-percent:0;mso-height-percent:0;mso-width-relative:margin;mso-height-relative:margin;v-text-anchor:top" o:gfxdata="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" filled="f" stroked="f">
+                <v:textbox>
+                  <w:txbxContent>
+                    <w:p>
+                      <w:pPr>
+                        <w:rPr>
+                          <w:rFonts w:ascii="Copperplate Gothic Bold" w:hAnsi="Copperplate Gothic Bold"/>
+                          <w:spacing w:val="4"/>
+                          <w:sz w:val="28"/>
+                          <w:szCs w:val="28"/>
+                        </w:rPr>
+                      </w:pPr>
+                      <w:r>
+                        <w:rPr>
+                          <w:rFonts w:ascii="Copperplate Gothic Bold" w:hAnsi="Copperplate Gothic Bold"/>
+                          <w:spacing w:val="4"/>
+                          <w:sz w:val="28"/>
+                          <w:szCs w:val="28"/>
+                        </w:rPr>
+                        <w:t>{{FIRSTNAME</w:t>
+                      </w:r>
+                      <w:proofErr w:type="gramStart"/>
+                      <w:r>
+                        <w:rPr>
+                          <w:rFonts w:ascii="Copperplate Gothic Bold" w:hAnsi="Copperplate Gothic Bold"/>
+                          <w:spacing w:val="4"/>
+                          <w:sz w:val="28"/>
+                          <w:szCs w:val="28"/>
+                        </w:rPr>
+                        <w:t>}}  {</w:t>
+                      </w:r>
+                      <w:proofErr w:type="gramEnd"/>
+                      <w:r>
+                        <w:rPr>
+                          <w:rFonts w:ascii="Copperplate Gothic Bold" w:hAnsi="Copperplate Gothic Bold"/>
+                          <w:spacing w:val="4"/>
+                          <w:sz w:val="28"/>
+                          <w:szCs w:val="28"/>
+                        </w:rPr>
+                        <w:t>{M.I.}}</w:t>
                       </w:r>
                     </w:p>
                   </w:txbxContent>

</xml_diff>

<commit_message>
Keep template photo frame size unchanged, only replace image file
</commit_message>
<xml_diff>
--- a/templates/id-template.docx
+++ b/templates/id-template.docx
@@ -3,6 +3,60 @@
 <w:document xmlns:wpc="http://schemas.microsoft.com/office/word/2010/wordprocessingCanvas" xmlns:cx="http://schemas.microsoft.com/office/drawing/2014/chartex" xmlns:cx1="http://schemas.microsoft.com/office/drawing/2015/9/8/chartex" xmlns:cx2="http://schemas.microsoft.com/office/drawing/2015/10/21/chartex" xmlns:cx3="http://schemas.microsoft.com/office/drawing/2016/5/9/chartex" xmlns:cx4="http://schemas.microsoft.com/office/drawing/2016/5/10/chartex" xmlns:cx5="http://schemas.microsoft.com/office/drawing/2016/5/11/chartex" xmlns:cx6="http://schemas.microsoft.com/office/drawing/2016/5/12/chartex" xmlns:cx7="http://schemas.microsoft.com/office/drawing/2016/5/13/chartex" xmlns:cx8="http://schemas.microsoft.com/office/drawing/2016/5/14/chartex" xmlns:mc="http://schemas.openxmlformats.org/markup-compatibility/2006" xmlns:aink="http://schemas.microsoft.com/office/drawing/2016/ink" xmlns:am3d="http://schemas.microsoft.com/office/drawing/2017/model3d" xmlns:o="urn:schemas-microsoft-com:office:office" xmlns:r="http://schemas.openxmlformats.org/officeDocument/2006/relationships" xmlns:m="http://schemas.openxmlformats.org/officeDocument/2006/math" xmlns:v="urn:schemas-microsoft-com:vml" xmlns:wp14="http://schemas.microsoft.com/office/word/2010/wordprocessingDrawing" xmlns:wp="http://schemas.openxmlformats.org/drawingml/2006/wordprocessingDrawing" xmlns:w10="urn:schemas-microsoft-com:office:word" xmlns:w="http://schemas.openxmlformats.org/wordprocessingml/2006/main" xmlns:w14="http://schemas.microsoft.com/office/word/2010/wordml" xmlns:w15="http://schemas.microsoft.com/office/word/2012/wordml" xmlns:w16cex="http://schemas.microsoft.com/office/word/2018/wordml/cex" xmlns:w16cid="http://schemas.microsoft.com/office/word/2016/wordml/cid" xmlns:w16="http://schemas.microsoft.com/office/word/2018/wordml" xmlns:w16sdtdh="http://schemas.microsoft.com/office/word/2020/wordml/sdtdatahash" xmlns:w16se="http://schemas.microsoft.com/office/word/2015/wordml/symex" xmlns:wpg="http://schemas.microsoft.com/office/word/2010/wordprocessingGroup" xmlns:wpi="http://schemas.microsoft.com/office/word/2010/wordprocessingInk" xmlns:wne="http://schemas.microsoft.com/office/word/2006/wordml" xmlns:wps="http://schemas.microsoft.com/office/word/2010/wordprocessingShape" mc:Ignorable="w14 w15 w16se w16cid w16 w16cex w16sdtdh wp14">
   <w:body>
     <w:p>
+      <w:r>
+        <w:rPr>
+          <w:noProof/>
+        </w:rPr>
+        <w:drawing>
+          <wp:anchor distT="0" distB="0" distL="114300" distR="114300" simplePos="0" relativeHeight="251685888" behindDoc="0" locked="0" layoutInCell="1" allowOverlap="1" wp14:anchorId="0E78DF1C" wp14:editId="70BEEBFD">
+            <wp:simplePos x="0" y="0"/>
+            <wp:positionH relativeFrom="column">
+              <wp:posOffset>-355600</wp:posOffset>
+            </wp:positionH>
+            <wp:positionV relativeFrom="paragraph">
+              <wp:posOffset>342900</wp:posOffset>
+            </wp:positionV>
+            <wp:extent cx="1619250" cy="1612900"/>
+            <wp:effectExtent l="0" t="0" r="0" b="6350"/>
+            <wp:wrapTopAndBottom/>
+            <wp:docPr id="3" name="Picture 3"/>
+            <wp:cNvGraphicFramePr/>
+            <a:graphic xmlns:a="http://schemas.openxmlformats.org/drawingml/2006/main">
+              <a:graphicData uri="http://schemas.openxmlformats.org/drawingml/2006/picture">
+                <pic:pic xmlns:pic="http://schemas.openxmlformats.org/drawingml/2006/picture">
+                  <pic:nvPicPr>
+                    <pic:cNvPr id="3" name="Picture 3"/>
+                    <pic:cNvPicPr/>
+                  </pic:nvPicPr>
+                  <pic:blipFill>
+                    <a:blip r:embed="rId4" cstate="print">
+                      <a:extLst>
+                        <a:ext uri="{28A0092B-C50C-407E-A947-70E740481C1C}">
+                          <a14:useLocalDpi xmlns:a14="http://schemas.microsoft.com/office/drawing/2010/main" val="0"/>
+                        </a:ext>
+                      </a:extLst>
+                    </a:blip>
+                    <a:srcRect/>
+                    <a:stretch>
+                      <a:fillRect/>
+                    </a:stretch>
+                  </pic:blipFill>
+                  <pic:spPr bwMode="auto">
+                    <a:xfrm>
+                      <a:off x="0" y="0"/>
+                      <a:ext cx="1619250" cy="1612900"/>
+                    </a:xfrm>
+                    <a:prstGeom prst="rect">
+                      <a:avLst/>
+                    </a:prstGeom>
+                    <a:noFill/>
+                  </pic:spPr>
+                </pic:pic>
+              </a:graphicData>
+            </a:graphic>
+          </wp:anchor>
+        </w:drawing>
+      </w:r>
       <w:r>
         <w:rPr>
           <w:noProof/>
@@ -125,74 +179,10 @@
         <w:rPr>
           <w:noProof/>
         </w:rPr>
-        <w:drawing>
-          <wp:anchor distT="0" distB="0" distL="114300" distR="114300" simplePos="0" relativeHeight="251685888" behindDoc="0" locked="0" layoutInCell="1" allowOverlap="1" wp14:anchorId="6CAD19C1" wp14:editId="227AD7C9">
-            <wp:simplePos x="0" y="0"/>
-            <wp:positionH relativeFrom="column">
-              <wp:posOffset>-355600</wp:posOffset>
-            </wp:positionH>
-            <wp:positionV relativeFrom="paragraph">
-              <wp:posOffset>340995</wp:posOffset>
-            </wp:positionV>
-            <wp:extent cx="1627505" cy="1627505"/>
-            <wp:effectExtent l="0" t="0" r="0" b="0"/>
-            <wp:wrapTopAndBottom/>
-            <wp:docPr id="3" name="Picture 3"/>
-            <wp:cNvGraphicFramePr>
-              <a:graphicFrameLocks xmlns:a="http://schemas.openxmlformats.org/drawingml/2006/main" noChangeAspect="1"/>
-            </wp:cNvGraphicFramePr>
-            <a:graphic xmlns:a="http://schemas.openxmlformats.org/drawingml/2006/main">
-              <a:graphicData uri="http://schemas.openxmlformats.org/drawingml/2006/picture">
-                <pic:pic xmlns:pic="http://schemas.openxmlformats.org/drawingml/2006/picture">
-                  <pic:nvPicPr>
-                    <pic:cNvPr id="0" name="Picture 2"/>
-                    <pic:cNvPicPr>
-                      <a:picLocks noChangeAspect="1" noChangeArrowheads="1"/>
-                    </pic:cNvPicPr>
-                  </pic:nvPicPr>
-                  <pic:blipFill>
-                    <a:blip r:embed="rId4">
-                      <a:extLst>
-                        <a:ext uri="{28A0092B-C50C-407E-A947-70E740481C1C}">
-                          <a14:useLocalDpi xmlns:a14="http://schemas.microsoft.com/office/drawing/2010/main" val="0"/>
-                        </a:ext>
-                      </a:extLst>
-                    </a:blip>
-                    <a:srcRect/>
-                    <a:stretch>
-                      <a:fillRect/>
-                    </a:stretch>
-                  </pic:blipFill>
-                  <pic:spPr bwMode="auto">
-                    <a:xfrm>
-                      <a:off x="0" y="0"/>
-                      <a:ext cx="1627505" cy="1627505"/>
-                    </a:xfrm>
-                    <a:prstGeom prst="rect">
-                      <a:avLst/>
-                    </a:prstGeom>
-                    <a:noFill/>
-                  </pic:spPr>
-                </pic:pic>
-              </a:graphicData>
-            </a:graphic>
-            <wp14:sizeRelH relativeFrom="page">
-              <wp14:pctWidth>0</wp14:pctWidth>
-            </wp14:sizeRelH>
-            <wp14:sizeRelV relativeFrom="page">
-              <wp14:pctHeight>0</wp14:pctHeight>
-            </wp14:sizeRelV>
-          </wp:anchor>
-        </w:drawing>
-      </w:r>
-      <w:r>
-        <w:rPr>
-          <w:noProof/>
-        </w:rPr>
         <mc:AlternateContent>
           <mc:Choice Requires="wps">
             <w:drawing>
-              <wp:anchor distT="45720" distB="45720" distL="114300" distR="114300" simplePos="0" relativeHeight="251673600" behindDoc="0" locked="0" layoutInCell="1" allowOverlap="1" wp14:anchorId="5203266C" wp14:editId="7B7C3D28">
+              <wp:anchor distT="45720" distB="45720" distL="114300" distR="114300" simplePos="0" relativeHeight="251673600" behindDoc="0" locked="0" layoutInCell="1" allowOverlap="1" wp14:anchorId="5203266C" wp14:editId="3D68D250">
                 <wp:simplePos x="0" y="0"/>
                 <wp:positionH relativeFrom="column">
                   <wp:posOffset>5059045</wp:posOffset>
@@ -871,7 +861,7 @@
                                     </pic:cNvPicPr>
                                   </pic:nvPicPr>
                                   <pic:blipFill>
-                                    <a:blip r:embed="rId6">
+                                    <a:blip r:embed="rId5">
                                       <a:extLst>
                                         <a:ext uri="{28A0092B-C50C-407E-A947-70E740481C1C}">
                                           <a14:useLocalDpi xmlns:a14="http://schemas.microsoft.com/office/drawing/2010/main" val="0"/>
@@ -1699,7 +1689,7 @@
                     <pic:cNvPicPr/>
                   </pic:nvPicPr>
                   <pic:blipFill>
-                    <a:blip r:embed="rId7" cstate="print">
+                    <a:blip r:embed="rId6" cstate="print">
                       <a:extLst>
                         <a:ext uri="{28A0092B-C50C-407E-A947-70E740481C1C}">
                           <a14:useLocalDpi xmlns:a14="http://schemas.microsoft.com/office/drawing/2010/main" val="0"/>

</xml_diff>